<commit_message>
Edit article for clarity: define terms, fix factual slips, remove duplication
Define event kinds, guard and parent automaton before use; fix captions
and conclusion that contradicted the model (A4 "as before", "one per
parent", "no new automata"); correct sender/receiver mix-up in the order
note; state the jackpot-event reasoning once instead of three times;
generalize the first-reaction note now that addressed events are used.

Co-Authored-By: Claude Opus 5.5 <noreply@anthropic.com>
Claude-Session: https://claude.ai/code/session_01Dbk9FbN51LJL1bcmGw4FBj
</commit_message>
<xml_diff>
--- a/articles/multiply_many_nested/article.docx
+++ b/articles/multiply_many_nested/article.docx
@@ -28,7 +28,7 @@
         <w:t xml:space="preserve">спецификаций</w:t>
       </w:r>
       <w:r>
-        <w:t xml:space="preserve"> </w:t>
+        <w:br/>
       </w:r>
       <w:r>
         <w:t xml:space="preserve">на</w:t>
@@ -40,7 +40,7 @@
         <w:t xml:space="preserve">основе</w:t>
       </w:r>
       <w:r>
-        <w:br/>
+        <w:t xml:space="preserve"> </w:t>
       </w:r>
       <w:r>
         <w:t xml:space="preserve">перемножения</w:t>
@@ -71,13 +71,13 @@
         <w:pStyle w:val="FirstParagraph"/>
       </w:pPr>
       <w:r>
-        <w:t xml:space="preserve">В предыдущей работе решался вопрос о валидации автоматных спецификаций на</w:t>
-      </w:r>
-      <w:r>
-        <w:t xml:space="preserve"> </w:t>
-      </w:r>
-      <w:r>
-        <w:t xml:space="preserve">основе перемножения автоматов. Новизна метода состояла в перемножении</w:t>
+        <w:t xml:space="preserve">В предыдущей работе был предложен метод валидации автоматных спецификаций,</w:t>
+      </w:r>
+      <w:r>
+        <w:t xml:space="preserve"> </w:t>
+      </w:r>
+      <w:r>
+        <w:t xml:space="preserve">основанный на перемножении автоматов. Его новизна состояла в перемножении</w:t>
       </w:r>
       <w:r>
         <w:t xml:space="preserve"> </w:t>
@@ -93,19 +93,19 @@
         <w:t xml:space="preserve"> </w:t>
       </w:r>
       <w:r>
-        <w:t xml:space="preserve">автоматов – автоматов, помещённых внутрь отдельных</w:t>
-      </w:r>
-      <w:r>
-        <w:t xml:space="preserve"> </w:t>
-      </w:r>
-      <w:r>
-        <w:t xml:space="preserve">состояний других автоматов, на примере системы «игровой автомат», состоящей</w:t>
-      </w:r>
-      <w:r>
-        <w:t xml:space="preserve"> </w:t>
-      </w:r>
-      <w:r>
-        <w:t xml:space="preserve">из трёх автоматов: «Игровая машина» (</w:t>
+        <w:t xml:space="preserve">автоматов, то есть автоматов, помещённых в отдельные</w:t>
+      </w:r>
+      <w:r>
+        <w:t xml:space="preserve"> </w:t>
+      </w:r>
+      <w:r>
+        <w:t xml:space="preserve">состояния других автоматов. Метод был продемонстрирован на системе</w:t>
+      </w:r>
+      <w:r>
+        <w:t xml:space="preserve"> </w:t>
+      </w:r>
+      <w:r>
+        <w:t xml:space="preserve">«игровой автомат» из трёх автоматов: «Игровая машина» (</w:t>
       </w:r>
       <m:oMath>
         <m:sSub>
@@ -122,7 +122,13 @@
         </m:sSub>
       </m:oMath>
       <w:r>
-        <w:t xml:space="preserve">), «Монетоприемник» (</w:t>
+        <w:t xml:space="preserve">),</w:t>
+      </w:r>
+      <w:r>
+        <w:t xml:space="preserve"> </w:t>
+      </w:r>
+      <w:r>
+        <w:t xml:space="preserve">«Монетоприемник» (</w:t>
       </w:r>
       <m:oMath>
         <m:sSub>
@@ -139,13 +145,7 @@
         </m:sSub>
       </m:oMath>
       <w:r>
-        <w:t xml:space="preserve">) и</w:t>
-      </w:r>
-      <w:r>
-        <w:t xml:space="preserve"> </w:t>
-      </w:r>
-      <w:r>
-        <w:t xml:space="preserve">«Игровые барабаны» (</w:t>
+        <w:t xml:space="preserve">) и «Игровые барабаны» (</w:t>
       </w:r>
       <m:oMath>
         <m:sSub>
@@ -162,7 +162,7 @@
         </m:sSub>
       </m:oMath>
       <w:r>
-        <w:t xml:space="preserve">), вложенного в состояние «Игра» автомата</w:t>
+        <w:t xml:space="preserve">); автомат</w:t>
       </w:r>
       <w:r>
         <w:t xml:space="preserve"> </w:t>
@@ -176,25 +176,48 @@
           </m:e>
           <m:sub>
             <m:r>
-              <m:t>0</m:t>
+              <m:t>2</m:t>
             </m:r>
           </m:sub>
         </m:sSub>
       </m:oMath>
       <w:r>
-        <w:t xml:space="preserve">.</w:t>
-      </w:r>
-      <w:r>
-        <w:t xml:space="preserve"> </w:t>
-      </w:r>
-      <w:r>
-        <w:t xml:space="preserve">Как отмечено в предыдущей работе, задача решалась для частного случая,</w:t>
-      </w:r>
-      <w:r>
-        <w:t xml:space="preserve"> </w:t>
-      </w:r>
-      <w:r>
-        <w:t xml:space="preserve">который ограничивался тремя условиями:</w:t>
+        <w:t xml:space="preserve"> </w:t>
+      </w:r>
+      <w:r>
+        <w:t xml:space="preserve">вложен</w:t>
+      </w:r>
+      <w:r>
+        <w:t xml:space="preserve"> </w:t>
+      </w:r>
+      <w:r>
+        <w:t xml:space="preserve">в состояние «Игра» автомата</w:t>
+      </w:r>
+      <w:r>
+        <w:t xml:space="preserve"> </w:t>
+      </w:r>
+      <m:oMath>
+        <m:sSub>
+          <m:e>
+            <m:r>
+              <m:t>A</m:t>
+            </m:r>
+          </m:e>
+          <m:sub>
+            <m:r>
+              <m:t>0</m:t>
+            </m:r>
+          </m:sub>
+        </m:sSub>
+      </m:oMath>
+      <w:r>
+        <w:t xml:space="preserve">. Метод был применим при трёх</w:t>
+      </w:r>
+      <w:r>
+        <w:t xml:space="preserve"> </w:t>
+      </w:r>
+      <w:r>
+        <w:t xml:space="preserve">ограничениях:</w:t>
       </w:r>
     </w:p>
     <w:p>
@@ -205,7 +228,7 @@
         </w:numPr>
       </w:pPr>
       <w:r>
-        <w:t xml:space="preserve">в состояние мог быть вложен только один автомат;</w:t>
+        <w:t xml:space="preserve">в состояние может быть вложен только один автомат;</w:t>
       </w:r>
     </w:p>
     <w:p>
@@ -216,13 +239,7 @@
         </w:numPr>
       </w:pPr>
       <w:r>
-        <w:t xml:space="preserve">вложенный автомат мог быть вложен только в одно состояние</w:t>
-      </w:r>
-      <w:r>
-        <w:t xml:space="preserve"> </w:t>
-      </w:r>
-      <w:r>
-        <w:t xml:space="preserve">автомата, в который он вложен;</w:t>
+        <w:t xml:space="preserve">автомат может быть вложен только в одно состояние;</w:t>
       </w:r>
     </w:p>
     <w:p>
@@ -233,7 +250,7 @@
         </w:numPr>
       </w:pPr>
       <w:r>
-        <w:t xml:space="preserve">вложенные автоматы мог содержать только один из пары</w:t>
+        <w:t xml:space="preserve">вложенные автоматы может содержать только один из двух</w:t>
       </w:r>
       <w:r>
         <w:t xml:space="preserve"> </w:t>
@@ -247,22 +264,16 @@
         <w:pStyle w:val="FirstParagraph"/>
       </w:pPr>
       <w:r>
-        <w:t xml:space="preserve">В настоящей работе предложенный ранее метод перемножения автоматов</w:t>
-      </w:r>
-      <w:r>
-        <w:t xml:space="preserve"> </w:t>
-      </w:r>
-      <w:r>
-        <w:t xml:space="preserve">дорабатывается с целью снятия указанных выше ограничений.</w:t>
+        <w:t xml:space="preserve">В настоящей работе метод дорабатывается так, чтобы снять эти ограничения.</w:t>
       </w:r>
     </w:p>
-    <w:bookmarkStart w:id="20" w:name="этапы-алгоритма-умножения"/>
+    <w:bookmarkStart w:id="20" w:name="основные-понятия-и-алгоритм-умножения"/>
     <w:p>
       <w:pPr>
         <w:pStyle w:val="Heading1"/>
       </w:pPr>
       <w:r>
-        <w:t xml:space="preserve">Этапы алгоритма умножения</w:t>
+        <w:t xml:space="preserve">Основные понятия и алгоритм умножения</w:t>
       </w:r>
     </w:p>
     <w:p>
@@ -270,43 +281,112 @@
         <w:pStyle w:val="FirstParagraph"/>
       </w:pPr>
       <w:r>
-        <w:t xml:space="preserve">Гвардом (guard) называется условие на переходе автомата, разрешающее его</w:t>
-      </w:r>
-      <w:r>
-        <w:t xml:space="preserve"> </w:t>
-      </w:r>
-      <w:r>
-        <w:t xml:space="preserve">срабатывание только при выполнении этого условия, например, только если</w:t>
-      </w:r>
-      <w:r>
-        <w:t xml:space="preserve"> </w:t>
-      </w:r>
-      <w:r>
-        <w:t xml:space="preserve">некоторый другой автомат в данный момент находится в определённом</w:t>
-      </w:r>
-      <w:r>
-        <w:t xml:space="preserve"> </w:t>
-      </w:r>
-      <w:r>
-        <w:t xml:space="preserve">состоянии (так, автомат «Джекпот-счётчик», вводимый ниже, проверяет</w:t>
-      </w:r>
-      <w:r>
-        <w:t xml:space="preserve"> </w:t>
-      </w:r>
-      <w:r>
-        <w:t xml:space="preserve">внутреннее состояние автомата «Игровые барабаны», чтобы убедиться, что</w:t>
-      </w:r>
-      <w:r>
-        <w:t xml:space="preserve"> </w:t>
-      </w:r>
-      <w:r>
-        <w:t xml:space="preserve">барабаны остановились в нужной комбинации, прежде чем объявить джекпот –</w:t>
-      </w:r>
-      <w:r>
-        <w:t xml:space="preserve"> </w:t>
-      </w:r>
-      <w:r>
-        <w:t xml:space="preserve">это и есть опора одного автомата на внутреннее состояние другого).</w:t>
+        <w:t xml:space="preserve">Входами автомата служат события и гварды.</w:t>
+      </w:r>
+      <w:r>
+        <w:t xml:space="preserve"> </w:t>
+      </w:r>
+      <w:r>
+        <w:rPr>
+          <w:iCs/>
+          <w:i/>
+        </w:rPr>
+        <w:t xml:space="preserve">Событие среды</w:t>
+      </w:r>
+      <w:r>
+        <w:t xml:space="preserve"> </w:t>
+      </w:r>
+      <w:r>
+        <w:t xml:space="preserve">поступает в</w:t>
+      </w:r>
+      <w:r>
+        <w:t xml:space="preserve"> </w:t>
+      </w:r>
+      <w:r>
+        <w:t xml:space="preserve">систему извне, например нажатие кнопки. Событие может быть также</w:t>
+      </w:r>
+      <w:r>
+        <w:t xml:space="preserve"> </w:t>
+      </w:r>
+      <w:r>
+        <w:rPr>
+          <w:iCs/>
+          <w:i/>
+        </w:rPr>
+        <w:t xml:space="preserve">адресовано</w:t>
+      </w:r>
+      <w:r>
+        <w:t xml:space="preserve"> </w:t>
+      </w:r>
+      <w:r>
+        <w:t xml:space="preserve">одним автоматом другому: автомат-отправитель указывает</w:t>
+      </w:r>
+      <w:r>
+        <w:t xml:space="preserve"> </w:t>
+      </w:r>
+      <w:r>
+        <w:t xml:space="preserve">его среди выходов своего перехода, и автомат-получатель получает его только</w:t>
+      </w:r>
+      <w:r>
+        <w:t xml:space="preserve"> </w:t>
+      </w:r>
+      <w:r>
+        <w:t xml:space="preserve">в момент этого перехода.</w:t>
+      </w:r>
+      <w:r>
+        <w:t xml:space="preserve"> </w:t>
+      </w:r>
+      <w:r>
+        <w:rPr>
+          <w:iCs/>
+          <w:i/>
+        </w:rPr>
+        <w:t xml:space="preserve">Гвардом</w:t>
+      </w:r>
+      <w:r>
+        <w:t xml:space="preserve"> </w:t>
+      </w:r>
+      <w:r>
+        <w:t xml:space="preserve">называется условие на переходе, без</w:t>
+      </w:r>
+      <w:r>
+        <w:t xml:space="preserve"> </w:t>
+      </w:r>
+      <w:r>
+        <w:t xml:space="preserve">выполнения которого переход не срабатывает; гвард может проверять сигнал</w:t>
+      </w:r>
+      <w:r>
+        <w:t xml:space="preserve"> </w:t>
+      </w:r>
+      <w:r>
+        <w:t xml:space="preserve">среды или текущее состояние другого автомата.</w:t>
+      </w:r>
+    </w:p>
+    <w:p>
+      <w:pPr>
+        <w:pStyle w:val="BodyText"/>
+      </w:pPr>
+      <w:r>
+        <w:t xml:space="preserve">Автомат, в состояние которого вложен другой автомат, называется</w:t>
+      </w:r>
+      <w:r>
+        <w:t xml:space="preserve"> </w:t>
+      </w:r>
+      <w:r>
+        <w:rPr>
+          <w:iCs/>
+          <w:i/>
+        </w:rPr>
+        <w:t xml:space="preserve">родительским</w:t>
+      </w:r>
+      <w:r>
+        <w:t xml:space="preserve">. Вложенный автомат реагирует на события только тогда,</w:t>
+      </w:r>
+      <w:r>
+        <w:t xml:space="preserve"> </w:t>
+      </w:r>
+      <w:r>
+        <w:t xml:space="preserve">когда родительский автомат находится в состоянии, в которое он вложен.</w:t>
       </w:r>
     </w:p>
     <w:p>
@@ -331,7 +411,7 @@
         </w:numPr>
       </w:pPr>
       <w:r>
-        <w:t xml:space="preserve">Выбор пары автоматов для перемножения.</w:t>
+        <w:t xml:space="preserve">Выбор пары автоматов.</w:t>
       </w:r>
     </w:p>
     <w:p>
@@ -342,13 +422,13 @@
         </w:numPr>
       </w:pPr>
       <w:r>
-        <w:t xml:space="preserve">Инициализация обхода: начальные состояния пары образуют начальное</w:t>
-      </w:r>
-      <w:r>
-        <w:t xml:space="preserve"> </w:t>
-      </w:r>
-      <w:r>
-        <w:t xml:space="preserve">состояние произведения.</w:t>
+        <w:t xml:space="preserve">Построение начального состояния произведения из начальных</w:t>
+      </w:r>
+      <w:r>
+        <w:t xml:space="preserve"> </w:t>
+      </w:r>
+      <w:r>
+        <w:t xml:space="preserve">состояний пары.</w:t>
       </w:r>
     </w:p>
     <w:p>
@@ -359,25 +439,31 @@
         </w:numPr>
       </w:pPr>
       <w:r>
-        <w:t xml:space="preserve">Итеративное построение множества вершин: для текущей пары</w:t>
-      </w:r>
-      <w:r>
-        <w:t xml:space="preserve"> </w:t>
-      </w:r>
-      <w:r>
-        <w:t xml:space="preserve">состояний перебираются все исходящие переходы обоих автоматов,</w:t>
-      </w:r>
-      <w:r>
-        <w:t xml:space="preserve"> </w:t>
-      </w:r>
-      <w:r>
-        <w:t xml:space="preserve">проверяются гварды, и по совпадающим либо относящимся друг к другу</w:t>
-      </w:r>
-      <w:r>
-        <w:t xml:space="preserve"> </w:t>
-      </w:r>
-      <w:r>
-        <w:t xml:space="preserve">событиям строятся новые состояния-произведения.</w:t>
+        <w:t xml:space="preserve">Построение множества вершин и рёбер произведения: для очередного</w:t>
+      </w:r>
+      <w:r>
+        <w:t xml:space="preserve"> </w:t>
+      </w:r>
+      <w:r>
+        <w:t xml:space="preserve">состояния определяются события, на которые может отреагировать хотя</w:t>
+      </w:r>
+      <w:r>
+        <w:t xml:space="preserve"> </w:t>
+      </w:r>
+      <w:r>
+        <w:t xml:space="preserve">бы один из автоматов с учётом вложенности и адресованных событий;</w:t>
+      </w:r>
+      <w:r>
+        <w:t xml:space="preserve"> </w:t>
+      </w:r>
+      <w:r>
+        <w:t xml:space="preserve">для каждого такого события проверяются гварды и строится переход в</w:t>
+      </w:r>
+      <w:r>
+        <w:t xml:space="preserve"> </w:t>
+      </w:r>
+      <w:r>
+        <w:t xml:space="preserve">новое состояние произведения.</w:t>
       </w:r>
     </w:p>
     <w:p>
@@ -405,19 +491,19 @@
         </w:numPr>
       </w:pPr>
       <w:r>
-        <w:t xml:space="preserve">Валидация результата: автомат-произведение прогоняется рядом с</w:t>
-      </w:r>
-      <w:r>
-        <w:t xml:space="preserve"> </w:t>
-      </w:r>
-      <w:r>
-        <w:t xml:space="preserve">исходной парой на одних и тех же событиях, и на каждом шаге</w:t>
-      </w:r>
-      <w:r>
-        <w:t xml:space="preserve"> </w:t>
-      </w:r>
-      <w:r>
-        <w:t xml:space="preserve">сравниваются их выходы; любое расхождение означает ошибку</w:t>
+        <w:t xml:space="preserve">Валидация: автомат-произведение и исходная пара выполняются</w:t>
+      </w:r>
+      <w:r>
+        <w:t xml:space="preserve"> </w:t>
+      </w:r>
+      <w:r>
+        <w:t xml:space="preserve">параллельно на одних и тех же последовательностях событий, и на</w:t>
+      </w:r>
+      <w:r>
+        <w:t xml:space="preserve"> </w:t>
+      </w:r>
+      <w:r>
+        <w:t xml:space="preserve">каждом шаге их выходы сравниваются; расхождение означает ошибку</w:t>
       </w:r>
       <w:r>
         <w:t xml:space="preserve"> </w:t>
@@ -434,19 +520,13 @@
         </w:numPr>
       </w:pPr>
       <w:r>
-        <w:t xml:space="preserve">Последовательное перемножение системы автоматов: для цепочки из</w:t>
-      </w:r>
-      <w:r>
-        <w:t xml:space="preserve"> </w:t>
-      </w:r>
-      <w:r>
-        <w:t xml:space="preserve">более чем двух автоматов указанная последовательность этапов</w:t>
-      </w:r>
-      <w:r>
-        <w:t xml:space="preserve"> </w:t>
-      </w:r>
-      <w:r>
-        <w:t xml:space="preserve">повторяется для каждой очередной пары.</w:t>
+        <w:t xml:space="preserve">Для системы из более чем двух автоматов этапы 1–5 повторяются:</w:t>
+      </w:r>
+      <w:r>
+        <w:t xml:space="preserve"> </w:t>
+      </w:r>
+      <w:r>
+        <w:t xml:space="preserve">произведение очередной пары умножается на следующий автомат.</w:t>
       </w:r>
     </w:p>
     <w:p>
@@ -454,37 +534,25 @@
         <w:pStyle w:val="FirstParagraph"/>
       </w:pPr>
       <w:r>
-        <w:t xml:space="preserve">Состав этапов не меняется. Ограничения, указанные во введении, связаны с</w:t>
-      </w:r>
-      <w:r>
-        <w:t xml:space="preserve"> </w:t>
-      </w:r>
-      <w:r>
-        <w:t xml:space="preserve">тем, как именно выполняются этапы 3 и 4 – построение множества вершин</w:t>
-      </w:r>
-      <w:r>
-        <w:t xml:space="preserve"> </w:t>
-      </w:r>
-      <w:r>
-        <w:t xml:space="preserve">произведения и его формирование: на этих двух этапах проверяются гварды,</w:t>
-      </w:r>
-      <w:r>
-        <w:t xml:space="preserve"> </w:t>
-      </w:r>
-      <w:r>
-        <w:t xml:space="preserve">ссылающиеся на вложенные автоматы, и определяется, какие автоматы вложены в</w:t>
-      </w:r>
-      <w:r>
-        <w:t xml:space="preserve"> </w:t>
-      </w:r>
-      <w:r>
-        <w:t xml:space="preserve">каждую вершину произведения. Доработки, снимающие эти ограничения, описаны</w:t>
-      </w:r>
-      <w:r>
-        <w:t xml:space="preserve"> </w:t>
-      </w:r>
-      <w:r>
-        <w:t xml:space="preserve">в разделе </w:t>
+        <w:t xml:space="preserve">Состав этапов в настоящей работе не меняется. Ограничения 1–3 связаны с</w:t>
+      </w:r>
+      <w:r>
+        <w:t xml:space="preserve"> </w:t>
+      </w:r>
+      <w:r>
+        <w:t xml:space="preserve">этапами 3 и 4: с тем, как проверяются гварды, ссылающиеся на состояния</w:t>
+      </w:r>
+      <w:r>
+        <w:t xml:space="preserve"> </w:t>
+      </w:r>
+      <w:r>
+        <w:t xml:space="preserve">других автоматов, и как определяются автоматы, вложенные в состояние</w:t>
+      </w:r>
+      <w:r>
+        <w:t xml:space="preserve"> </w:t>
+      </w:r>
+      <w:r>
+        <w:t xml:space="preserve">произведения. Доработки описаны в разделе </w:t>
       </w:r>
       <w:hyperlink w:anchor="sec:fixes">
         <w:r>
@@ -498,13 +566,24 @@
         <w:t xml:space="preserve"> </w:t>
       </w:r>
       <w:r>
-        <w:t xml:space="preserve">после введения дополненной системы автоматов, на</w:t>
-      </w:r>
-      <w:r>
-        <w:t xml:space="preserve"> </w:t>
-      </w:r>
-      <w:r>
-        <w:t xml:space="preserve">примерах которой удобнее их проиллюстрировать.</w:t>
+        <w:t xml:space="preserve">на примере</w:t>
+      </w:r>
+      <w:r>
+        <w:t xml:space="preserve"> </w:t>
+      </w:r>
+      <w:r>
+        <w:t xml:space="preserve">системы, введённой в разделе </w:t>
+      </w:r>
+      <w:hyperlink w:anchor="sec:system">
+        <w:r>
+          <w:rPr>
+            <w:rStyle w:val="Hyperlink"/>
+          </w:rPr>
+          <w:t xml:space="preserve">2</w:t>
+        </w:r>
+      </w:hyperlink>
+      <w:r>
+        <w:t xml:space="preserve">.</w:t>
       </w:r>
     </w:p>
     <w:bookmarkEnd w:id="20"/>
@@ -522,7 +601,13 @@
         <w:pStyle w:val="FirstParagraph"/>
       </w:pPr>
       <w:r>
-        <w:t xml:space="preserve">К системе из трёх автоматов предыдущей работы (</w:t>
+        <w:t xml:space="preserve">К трём автоматам предыдущей работы добавлены два новых: «Джекпот-счётчик»</w:t>
+      </w:r>
+      <w:r>
+        <w:t xml:space="preserve"> </w:t>
+      </w:r>
+      <w:r>
+        <w:t xml:space="preserve">(</w:t>
       </w:r>
       <m:oMath>
         <m:sSub>
@@ -533,16 +618,13 @@
           </m:e>
           <m:sub>
             <m:r>
-              <m:t>0</m:t>
+              <m:t>3</m:t>
             </m:r>
           </m:sub>
         </m:sSub>
       </m:oMath>
       <w:r>
-        <w:t xml:space="preserve">,</w:t>
-      </w:r>
-      <w:r>
-        <w:t xml:space="preserve"> </w:t>
+        <w:t xml:space="preserve">) и «Звуки» (</w:t>
       </w:r>
       <m:oMath>
         <m:sSub>
@@ -553,79 +635,13 @@
           </m:e>
           <m:sub>
             <m:r>
-              <m:t>1</m:t>
+              <m:t>4</m:t>
             </m:r>
           </m:sub>
         </m:sSub>
       </m:oMath>
       <w:r>
-        <w:t xml:space="preserve">,</w:t>
-      </w:r>
-      <w:r>
-        <w:t xml:space="preserve"> </w:t>
-      </w:r>
-      <m:oMath>
-        <m:sSub>
-          <m:e>
-            <m:r>
-              <m:t>A</m:t>
-            </m:r>
-          </m:e>
-          <m:sub>
-            <m:r>
-              <m:t>2</m:t>
-            </m:r>
-          </m:sub>
-        </m:sSub>
-      </m:oMath>
-      <w:r>
-        <w:t xml:space="preserve">)</w:t>
-      </w:r>
-      <w:r>
-        <w:t xml:space="preserve"> </w:t>
-      </w:r>
-      <w:r>
-        <w:t xml:space="preserve">добавлены два новых автомата: «Джекпот-счётчик» (</w:t>
-      </w:r>
-      <m:oMath>
-        <m:sSub>
-          <m:e>
-            <m:r>
-              <m:t>A</m:t>
-            </m:r>
-          </m:e>
-          <m:sub>
-            <m:r>
-              <m:t>3</m:t>
-            </m:r>
-          </m:sub>
-        </m:sSub>
-      </m:oMath>
-      <w:r>
-        <w:t xml:space="preserve">) и «Звуки» (</w:t>
-      </w:r>
-      <m:oMath>
-        <m:sSub>
-          <m:e>
-            <m:r>
-              <m:t>A</m:t>
-            </m:r>
-          </m:e>
-          <m:sub>
-            <m:r>
-              <m:t>4</m:t>
-            </m:r>
-          </m:sub>
-        </m:sSub>
-      </m:oMath>
-      <w:r>
-        <w:t xml:space="preserve">).</w:t>
-      </w:r>
-      <w:r>
-        <w:t xml:space="preserve"> </w:t>
-      </w:r>
-      <w:r>
-        <w:t xml:space="preserve">Таблица </w:t>
+        <w:t xml:space="preserve">). Таблица </w:t>
       </w:r>
       <w:hyperlink w:anchor="tab:cases">
         <w:r>
@@ -639,13 +655,19 @@
         <w:t xml:space="preserve"> </w:t>
       </w:r>
       <w:r>
-        <w:t xml:space="preserve">сопоставляет каждому из трёх ограничений случай</w:t>
-      </w:r>
-      <w:r>
-        <w:t xml:space="preserve"> </w:t>
-      </w:r>
-      <w:r>
-        <w:t xml:space="preserve">вложенности, демонстрирующий его снятие на этой системе.</w:t>
+        <w:t xml:space="preserve">перечисляет случаи</w:t>
+      </w:r>
+      <w:r>
+        <w:t xml:space="preserve"> </w:t>
+      </w:r>
+      <w:r>
+        <w:t xml:space="preserve">вложенности в полученной системе и указывает ограничение, снятие которого</w:t>
+      </w:r>
+      <w:r>
+        <w:t xml:space="preserve"> </w:t>
+      </w:r>
+      <w:r>
+        <w:t xml:space="preserve">демонстрирует каждый случай.</w:t>
       </w:r>
     </w:p>
     <w:bookmarkStart w:id="21" w:name="tab:cases"/>
@@ -694,7 +716,7 @@
               <w:jc w:val="left"/>
             </w:pPr>
             <w:r>
-              <w:t xml:space="preserve">Снимает</w:t>
+              <w:t xml:space="preserve">Ограничение</w:t>
             </w:r>
           </w:p>
         </w:tc>
@@ -732,7 +754,7 @@
               <w:jc w:val="left"/>
             </w:pPr>
             <w:r>
-              <w:t xml:space="preserve">– (ограничений не было)</w:t>
+              <w:t xml:space="preserve">–</w:t>
             </w:r>
           </w:p>
         </w:tc>
@@ -780,6 +802,12 @@
                 </m:sub>
               </m:sSub>
             </m:oMath>
+            <w:r>
+              <w:t xml:space="preserve"> </w:t>
+            </w:r>
+            <w:r>
+              <w:t xml:space="preserve">(случай предыдущей работы)</w:t>
+            </w:r>
           </w:p>
         </w:tc>
       </w:tr>
@@ -804,17 +832,23 @@
               <w:jc w:val="left"/>
             </w:pPr>
             <w:r>
-              <w:t xml:space="preserve">ограничение 1</w:t>
-            </w:r>
-          </w:p>
-        </w:tc>
-        <w:tc>
-          <w:tcPr/>
-          <w:p>
-            <w:pPr>
-              <w:pStyle w:val="Compact"/>
-              <w:jc w:val="left"/>
-            </w:pPr>
+              <w:t xml:space="preserve">1</w:t>
+            </w:r>
+          </w:p>
+        </w:tc>
+        <w:tc>
+          <w:tcPr/>
+          <w:p>
+            <w:pPr>
+              <w:pStyle w:val="Compact"/>
+              <w:jc w:val="left"/>
+            </w:pPr>
+            <w:r>
+              <w:t xml:space="preserve">В состояние «Игра» вложены</w:t>
+            </w:r>
+            <w:r>
+              <w:t xml:space="preserve"> </w:t>
+            </w:r>
             <m:oMath>
               <m:sSub>
                 <m:e>
@@ -830,10 +864,7 @@
               </m:sSub>
             </m:oMath>
             <w:r>
-              <w:t xml:space="preserve"> </w:t>
-            </w:r>
-            <w:r>
-              <w:t xml:space="preserve">и</w:t>
+              <w:t xml:space="preserve">,</w:t>
             </w:r>
             <w:r>
               <w:t xml:space="preserve"> </w:t>
@@ -856,43 +887,11 @@
               <w:t xml:space="preserve"> </w:t>
             </w:r>
             <w:r>
-              <w:t xml:space="preserve">одновременно вложены в состояние «Игра»</w:t>
-            </w:r>
-          </w:p>
-        </w:tc>
-      </w:tr>
-      <w:tr>
-        <w:tc>
-          <w:tcPr/>
-          <w:p>
-            <w:pPr>
-              <w:pStyle w:val="Compact"/>
-              <w:jc w:val="left"/>
-            </w:pPr>
-            <w:r>
-              <w:t xml:space="preserve">3</w:t>
-            </w:r>
-          </w:p>
-        </w:tc>
-        <w:tc>
-          <w:tcPr/>
-          <w:p>
-            <w:pPr>
-              <w:pStyle w:val="Compact"/>
-              <w:jc w:val="left"/>
-            </w:pPr>
-            <w:r>
-              <w:t xml:space="preserve">ограничение 2</w:t>
-            </w:r>
-          </w:p>
-        </w:tc>
-        <w:tc>
-          <w:tcPr/>
-          <w:p>
-            <w:pPr>
-              <w:pStyle w:val="Compact"/>
-              <w:jc w:val="left"/>
-            </w:pPr>
+              <w:t xml:space="preserve">и</w:t>
+            </w:r>
+            <w:r>
+              <w:t xml:space="preserve"> </w:t>
+            </w:r>
             <m:oMath>
               <m:sSub>
                 <m:e>
@@ -907,11 +906,60 @@
                 </m:sub>
               </m:sSub>
             </m:oMath>
+          </w:p>
+        </w:tc>
+      </w:tr>
+      <w:tr>
+        <w:tc>
+          <w:tcPr/>
+          <w:p>
+            <w:pPr>
+              <w:pStyle w:val="Compact"/>
+              <w:jc w:val="left"/>
+            </w:pPr>
+            <w:r>
+              <w:t xml:space="preserve">3</w:t>
+            </w:r>
+          </w:p>
+        </w:tc>
+        <w:tc>
+          <w:tcPr/>
+          <w:p>
+            <w:pPr>
+              <w:pStyle w:val="Compact"/>
+              <w:jc w:val="left"/>
+            </w:pPr>
+            <w:r>
+              <w:t xml:space="preserve">2</w:t>
+            </w:r>
+          </w:p>
+        </w:tc>
+        <w:tc>
+          <w:tcPr/>
+          <w:p>
+            <w:pPr>
+              <w:pStyle w:val="Compact"/>
+              <w:jc w:val="left"/>
+            </w:pPr>
+            <m:oMath>
+              <m:sSub>
+                <m:e>
+                  <m:r>
+                    <m:t>A</m:t>
+                  </m:r>
+                </m:e>
+                <m:sub>
+                  <m:r>
+                    <m:t>4</m:t>
+                  </m:r>
+                </m:sub>
+              </m:sSub>
+            </m:oMath>
             <w:r>
               <w:t xml:space="preserve"> </w:t>
             </w:r>
             <w:r>
-              <w:t xml:space="preserve">вложен в состояния «Игра» и «Выдача жетона» автомата</w:t>
+              <w:t xml:space="preserve">вложен в три состояния: «Игра» и «Выдача жетона» автомата</w:t>
             </w:r>
             <w:r>
               <w:t xml:space="preserve"> </w:t>
@@ -931,7 +979,7 @@
               </m:sSub>
             </m:oMath>
             <w:r>
-              <w:t xml:space="preserve">, а также в состояние «Выплата джекпота» автомата</w:t>
+              <w:t xml:space="preserve">, «Выплата джекпота» автомата</w:t>
             </w:r>
             <w:r>
               <w:t xml:space="preserve"> </w:t>
@@ -974,7 +1022,7 @@
               <w:jc w:val="left"/>
             </w:pPr>
             <w:r>
-              <w:t xml:space="preserve">ограничение 3</w:t>
+              <w:t xml:space="preserve">3</w:t>
             </w:r>
           </w:p>
         </w:tc>
@@ -1145,7 +1193,7 @@
         </m:sSub>
       </m:oMath>
       <w:r>
-        <w:t xml:space="preserve">.</w:t>
+        <w:t xml:space="preserve">. В состояние «Игра» вложены</w:t>
       </w:r>
       <w:r>
         <w:t xml:space="preserve"> </w:t>
@@ -1159,22 +1207,13 @@
           </m:e>
           <m:sub>
             <m:r>
-              <m:t>4</m:t>
+              <m:t>2</m:t>
             </m:r>
           </m:sub>
         </m:sSub>
       </m:oMath>
       <w:r>
-        <w:t xml:space="preserve"> </w:t>
-      </w:r>
-      <w:r>
-        <w:t xml:space="preserve">вложен в «Игра» (случай</w:t>
-      </w:r>
-      <w:r>
-        <w:t xml:space="preserve"> </w:t>
-      </w:r>
-      <w:r>
-        <w:t xml:space="preserve">3, наравне с</w:t>
+        <w:t xml:space="preserve">,</w:t>
       </w:r>
       <w:r>
         <w:t xml:space="preserve"> </w:t>
@@ -1188,7 +1227,7 @@
           </m:e>
           <m:sub>
             <m:r>
-              <m:t>2</m:t>
+              <m:t>3</m:t>
             </m:r>
           </m:sub>
         </m:sSub>
@@ -1211,13 +1250,33 @@
           </m:e>
           <m:sub>
             <m:r>
-              <m:t>3</m:t>
+              <m:t>4</m:t>
             </m:r>
           </m:sub>
         </m:sSub>
       </m:oMath>
       <w:r>
-        <w:t xml:space="preserve">) и в «Выдача жетона», как и раньше.</w:t>
+        <w:t xml:space="preserve">, в состояние «Выдача жетона» –</w:t>
+      </w:r>
+      <w:r>
+        <w:t xml:space="preserve"> </w:t>
+      </w:r>
+      <m:oMath>
+        <m:sSub>
+          <m:e>
+            <m:r>
+              <m:t>A</m:t>
+            </m:r>
+          </m:e>
+          <m:sub>
+            <m:r>
+              <m:t>4</m:t>
+            </m:r>
+          </m:sub>
+        </m:sSub>
+      </m:oMath>
+      <w:r>
+        <w:t xml:space="preserve">.</w:t>
       </w:r>
     </w:p>
     <w:p>
@@ -4653,7 +4712,7 @@
       </w:tr>
     </w:tbl>
     <w:bookmarkEnd w:id="33"/>
-    <w:bookmarkStart w:id="37" w:name="автомат-4.-джекпот-счётчик-a_3-случай-4"/>
+    <w:bookmarkStart w:id="37" w:name="автомат-4.-джекпот-счётчик-a_3"/>
     <w:p>
       <w:pPr>
         <w:pStyle w:val="Heading2"/>
@@ -4676,7 +4735,7 @@
         </m:sSub>
       </m:oMath>
       <w:r>
-        <w:t xml:space="preserve">) – случай 4</w:t>
+        <w:t xml:space="preserve">)</w:t>
       </w:r>
     </w:p>
     <w:p>
@@ -4751,7 +4810,13 @@
         </m:sSub>
       </m:oMath>
       <w:r>
-        <w:t xml:space="preserve">.</w:t>
+        <w:t xml:space="preserve">. В состояние «Выплата</w:t>
+      </w:r>
+      <w:r>
+        <w:t xml:space="preserve"> </w:t>
+      </w:r>
+      <w:r>
+        <w:t xml:space="preserve">джекпота» вложен</w:t>
       </w:r>
       <w:r>
         <w:t xml:space="preserve"> </w:t>
@@ -4771,16 +4836,7 @@
         </m:sSub>
       </m:oMath>
       <w:r>
-        <w:t xml:space="preserve"> </w:t>
-      </w:r>
-      <w:r>
-        <w:t xml:space="preserve">вложен в состояние</w:t>
-      </w:r>
-      <w:r>
-        <w:t xml:space="preserve"> </w:t>
-      </w:r>
-      <w:r>
-        <w:t xml:space="preserve">«Выплата джекпота» –</w:t>
+        <w:t xml:space="preserve">; сам</w:t>
       </w:r>
       <w:r>
         <w:t xml:space="preserve"> </w:t>
@@ -4803,7 +4859,7 @@
         <w:t xml:space="preserve"> </w:t>
       </w:r>
       <w:r>
-        <w:t xml:space="preserve">сам вложен в «Игра» автомата</w:t>
+        <w:t xml:space="preserve">вложен в состояние «Игра» автомата</w:t>
       </w:r>
       <w:r>
         <w:t xml:space="preserve"> </w:t>
@@ -4818,32 +4874,6 @@
           <m:sub>
             <m:r>
               <m:t>0</m:t>
-            </m:r>
-          </m:sub>
-        </m:sSub>
-      </m:oMath>
-      <w:r>
-        <w:t xml:space="preserve">, а теперь</w:t>
-      </w:r>
-      <w:r>
-        <w:t xml:space="preserve"> </w:t>
-      </w:r>
-      <w:r>
-        <w:t xml:space="preserve">ещё и сам вкладывает</w:t>
-      </w:r>
-      <w:r>
-        <w:t xml:space="preserve"> </w:t>
-      </w:r>
-      <m:oMath>
-        <m:sSub>
-          <m:e>
-            <m:r>
-              <m:t>A</m:t>
-            </m:r>
-          </m:e>
-          <m:sub>
-            <m:r>
-              <m:t>4</m:t>
             </m:r>
           </m:sub>
         </m:sSub>
@@ -5447,7 +5477,7 @@
         <w:pStyle w:val="BodyText"/>
       </w:pPr>
       <w:r>
-        <w:t xml:space="preserve">Входы</w:t>
+        <w:t xml:space="preserve">Автомат</w:t>
       </w:r>
       <w:r>
         <w:t xml:space="preserve"> </w:t>
@@ -5470,7 +5500,7 @@
         <w:t xml:space="preserve"> </w:t>
       </w:r>
       <w:r>
-        <w:t xml:space="preserve">включают опрос состояния соседа – второго барабана автомата</w:t>
+        <w:t xml:space="preserve">вложен в состояние «Игра» вместе с</w:t>
       </w:r>
       <w:r>
         <w:t xml:space="preserve"> </w:t>
@@ -5493,7 +5523,49 @@
         <w:t xml:space="preserve"> </w:t>
       </w:r>
       <w:r>
-        <w:t xml:space="preserve">(случай 2). Переход, которым</w:t>
+        <w:t xml:space="preserve">и реагирует на то же</w:t>
+      </w:r>
+      <w:r>
+        <w:t xml:space="preserve"> </w:t>
+      </w:r>
+      <w:r>
+        <w:t xml:space="preserve">событие среды</w:t>
+      </w:r>
+      <w:r>
+        <w:t xml:space="preserve"> </w:t>
+      </w:r>
+      <w:r>
+        <w:rPr>
+          <w:rStyle w:val="VerbatimChar"/>
+        </w:rPr>
+        <w:t xml:space="preserve">e05</w:t>
+      </w:r>
+      <w:r>
+        <w:t xml:space="preserve"> </w:t>
+      </w:r>
+      <w:r>
+        <w:t xml:space="preserve">(«Сработал таймер третьего барабана»). Переход в</w:t>
+      </w:r>
+      <w:r>
+        <w:t xml:space="preserve"> </w:t>
+      </w:r>
+      <w:r>
+        <w:t xml:space="preserve">состояние «Выплата джекпота» проверяет гвард</w:t>
+      </w:r>
+      <w:r>
+        <w:t xml:space="preserve"> </w:t>
+      </w:r>
+      <w:r>
+        <w:rPr>
+          <w:rStyle w:val="VerbatimChar"/>
+        </w:rPr>
+        <w:t xml:space="preserve">y2=3</w:t>
+      </w:r>
+      <w:r>
+        <w:t xml:space="preserve"> </w:t>
+      </w:r>
+      <w:r>
+        <w:t xml:space="preserve">на состояние</w:t>
       </w:r>
       <w:r>
         <w:t xml:space="preserve"> </w:t>
@@ -5507,7 +5579,7 @@
           </m:e>
           <m:sub>
             <m:r>
-              <m:t>3</m:t>
+              <m:t>2</m:t>
             </m:r>
           </m:sub>
         </m:sSub>
@@ -5516,13 +5588,19 @@
         <w:t xml:space="preserve"> </w:t>
       </w:r>
       <w:r>
-        <w:t xml:space="preserve">покидает состояние «Выплата</w:t>
-      </w:r>
-      <w:r>
-        <w:t xml:space="preserve"> </w:t>
-      </w:r>
-      <w:r>
-        <w:t xml:space="preserve">джекпота», дополнительно адресует вложенному автомату</w:t>
+        <w:t xml:space="preserve">и случайный признак</w:t>
+      </w:r>
+      <w:r>
+        <w:t xml:space="preserve"> </w:t>
+      </w:r>
+      <w:r>
+        <w:rPr>
+          <w:rStyle w:val="VerbatimChar"/>
+        </w:rPr>
+        <w:t xml:space="preserve">x30</w:t>
+      </w:r>
+      <w:r>
+        <w:t xml:space="preserve">; так</w:t>
       </w:r>
       <w:r>
         <w:t xml:space="preserve"> </w:t>
@@ -5536,7 +5614,7 @@
           </m:e>
           <m:sub>
             <m:r>
-              <m:t>4</m:t>
+              <m:t>3</m:t>
             </m:r>
           </m:sub>
         </m:sSub>
@@ -5545,19 +5623,19 @@
         <w:t xml:space="preserve"> </w:t>
       </w:r>
       <w:r>
-        <w:t xml:space="preserve">отдельное</w:t>
-      </w:r>
-      <w:r>
-        <w:t xml:space="preserve"> </w:t>
-      </w:r>
-      <w:r>
-        <w:t xml:space="preserve">событие завершения выплаты джекпота – не то же событие, которым</w:t>
-      </w:r>
-      <w:r>
-        <w:t xml:space="preserve"> </w:t>
-      </w:r>
-      <w:r>
-        <w:t xml:space="preserve">пользуется</w:t>
+        <w:t xml:space="preserve">использует состояние</w:t>
+      </w:r>
+      <w:r>
+        <w:t xml:space="preserve"> </w:t>
+      </w:r>
+      <w:r>
+        <w:t xml:space="preserve">автомата, вложенного в то же состояние (случай 2). Из состояния «Выплата</w:t>
+      </w:r>
+      <w:r>
+        <w:t xml:space="preserve"> </w:t>
+      </w:r>
+      <w:r>
+        <w:t xml:space="preserve">джекпота»</w:t>
       </w:r>
       <w:r>
         <w:t xml:space="preserve"> </w:t>
@@ -5580,19 +5658,19 @@
         <w:t xml:space="preserve"> </w:t>
       </w:r>
       <w:r>
-        <w:t xml:space="preserve">для этого перехода, а отдельное, объявленное</w:t>
-      </w:r>
-      <w:r>
-        <w:t xml:space="preserve"> </w:t>
-      </w:r>
-      <w:r>
-        <w:t xml:space="preserve">исключительно для доставки этого уведомления. Такое событие никогда не</w:t>
-      </w:r>
-      <w:r>
-        <w:t xml:space="preserve"> </w:t>
-      </w:r>
-      <w:r>
-        <w:t xml:space="preserve">возникает независимо: оно существует только как часть перехода</w:t>
+        <w:t xml:space="preserve">выходит по событию</w:t>
+      </w:r>
+      <w:r>
+        <w:t xml:space="preserve"> </w:t>
+      </w:r>
+      <w:r>
+        <w:rPr>
+          <w:rStyle w:val="VerbatimChar"/>
+        </w:rPr>
+        <w:t xml:space="preserve">e33</w:t>
+      </w:r>
+      <w:r>
+        <w:t xml:space="preserve">, которое ему адресует</w:t>
       </w:r>
       <w:r>
         <w:t xml:space="preserve"> </w:t>
@@ -5606,7 +5684,7 @@
           </m:e>
           <m:sub>
             <m:r>
-              <m:t>3</m:t>
+              <m:t>0</m:t>
             </m:r>
           </m:sub>
         </m:sSub>
@@ -5615,19 +5693,7 @@
         <w:t xml:space="preserve"> </w:t>
       </w:r>
       <w:r>
-        <w:t xml:space="preserve">и</w:t>
-      </w:r>
-      <w:r>
-        <w:t xml:space="preserve"> </w:t>
-      </w:r>
-      <w:r>
-        <w:t xml:space="preserve">поэтому не может быть общим событием, которое автоматы разделяют</w:t>
-      </w:r>
-      <w:r>
-        <w:t xml:space="preserve"> </w:t>
-      </w:r>
-      <w:r>
-        <w:t xml:space="preserve">напрямую, как это делают</w:t>
+        <w:t xml:space="preserve">по окончании выдачи жетонов. На этом переходе</w:t>
       </w:r>
       <w:r>
         <w:t xml:space="preserve"> </w:t>
@@ -5641,7 +5707,7 @@
           </m:e>
           <m:sub>
             <m:r>
-              <m:t>2</m:t>
+              <m:t>3</m:t>
             </m:r>
           </m:sub>
         </m:sSub>
@@ -5650,7 +5716,13 @@
         <w:t xml:space="preserve"> </w:t>
       </w:r>
       <w:r>
-        <w:t xml:space="preserve">и</w:t>
+        <w:t xml:space="preserve">обнуляет джекпот и</w:t>
+      </w:r>
+      <w:r>
+        <w:t xml:space="preserve"> </w:t>
+      </w:r>
+      <w:r>
+        <w:t xml:space="preserve">адресует автомату</w:t>
       </w:r>
       <w:r>
         <w:t xml:space="preserve"> </w:t>
@@ -5664,7 +5736,7 @@
           </m:e>
           <m:sub>
             <m:r>
-              <m:t>3</m:t>
+              <m:t>4</m:t>
             </m:r>
           </m:sub>
         </m:sSub>
@@ -5673,34 +5745,32 @@
         <w:t xml:space="preserve"> </w:t>
       </w:r>
       <w:r>
-        <w:t xml:space="preserve">с независимо возникающим событием</w:t>
-      </w:r>
-      <w:r>
-        <w:t xml:space="preserve"> </w:t>
-      </w:r>
-      <w:r>
-        <w:t xml:space="preserve">остановки третьего барабана в состоянии «Игра». Причина объяснена в</w:t>
-      </w:r>
-      <w:r>
-        <w:t xml:space="preserve"> </w:t>
-      </w:r>
-      <w:r>
-        <w:t xml:space="preserve">доработке 3 (раздел </w:t>
-      </w:r>
-      <w:hyperlink w:anchor="sec:fixes">
-        <w:r>
-          <w:rPr>
-            <w:rStyle w:val="Hyperlink"/>
-          </w:rPr>
-          <w:t xml:space="preserve">3</w:t>
-        </w:r>
-      </w:hyperlink>
-      <w:r>
-        <w:t xml:space="preserve">).</w:t>
+        <w:t xml:space="preserve">событие</w:t>
+      </w:r>
+      <w:r>
+        <w:t xml:space="preserve"> </w:t>
+      </w:r>
+      <w:r>
+        <w:rPr>
+          <w:rStyle w:val="VerbatimChar"/>
+        </w:rPr>
+        <w:t xml:space="preserve">e40</w:t>
+      </w:r>
+      <w:r>
+        <w:t xml:space="preserve"> </w:t>
+      </w:r>
+      <w:r>
+        <w:t xml:space="preserve">(«Выплата джекпота</w:t>
+      </w:r>
+      <w:r>
+        <w:t xml:space="preserve"> </w:t>
+      </w:r>
+      <w:r>
+        <w:t xml:space="preserve">завершена»).</w:t>
       </w:r>
     </w:p>
     <w:bookmarkEnd w:id="37"/>
-    <w:bookmarkStart w:id="41" w:name="автомат-5.-звуки-a_4-случай-3"/>
+    <w:bookmarkStart w:id="41" w:name="автомат-5.-звуки-a_4"/>
     <w:p>
       <w:pPr>
         <w:pStyle w:val="Heading2"/>
@@ -5723,7 +5793,7 @@
         </m:sSub>
       </m:oMath>
       <w:r>
-        <w:t xml:space="preserve">) – случай 3</w:t>
+        <w:t xml:space="preserve">)</w:t>
       </w:r>
     </w:p>
     <w:p>
@@ -5798,19 +5868,13 @@
         </m:sSub>
       </m:oMath>
       <w:r>
-        <w:t xml:space="preserve">. Единственное состояние, три</w:t>
-      </w:r>
-      <w:r>
-        <w:t xml:space="preserve"> </w:t>
-      </w:r>
-      <w:r>
-        <w:t xml:space="preserve">самоперехода – по одному на каждого родителя, в состояние которого он</w:t>
-      </w:r>
-      <w:r>
-        <w:t xml:space="preserve"> </w:t>
-      </w:r>
-      <w:r>
-        <w:t xml:space="preserve">вложен.</w:t>
+        <w:t xml:space="preserve">: одно состояние и три</w:t>
+      </w:r>
+      <w:r>
+        <w:t xml:space="preserve"> </w:t>
+      </w:r>
+      <w:r>
+        <w:t xml:space="preserve">самоперехода, по одному на каждое место вложения.</w:t>
       </w:r>
     </w:p>
     <w:p>
@@ -6305,6 +6369,12 @@
       <w:pPr>
         <w:pStyle w:val="BodyText"/>
       </w:pPr>
+      <w:r>
+        <w:t xml:space="preserve">Автомат</w:t>
+      </w:r>
+      <w:r>
+        <w:t xml:space="preserve"> </w:t>
+      </w:r>
       <m:oMath>
         <m:sSub>
           <m:e>
@@ -6323,27 +6393,13 @@
         <w:t xml:space="preserve"> </w:t>
       </w:r>
       <w:r>
-        <w:t xml:space="preserve">демонстрирует оба новых случая из таблицы </w:t>
-      </w:r>
-      <w:hyperlink w:anchor="tab:cases">
-        <w:r>
-          <w:rPr>
-            <w:rStyle w:val="Hyperlink"/>
-          </w:rPr>
-          <w:t xml:space="preserve">1</w:t>
-        </w:r>
-      </w:hyperlink>
-      <w:r>
-        <w:t xml:space="preserve"> </w:t>
-      </w:r>
-      <w:r>
-        <w:t xml:space="preserve">одним и тем</w:t>
-      </w:r>
-      <w:r>
-        <w:t xml:space="preserve"> </w:t>
-      </w:r>
-      <w:r>
-        <w:t xml:space="preserve">же автоматом. Случай 3:</w:t>
+        <w:t xml:space="preserve">демонстрирует случаи 3 и 4: он вложен в три состояния, одно</w:t>
+      </w:r>
+      <w:r>
+        <w:t xml:space="preserve"> </w:t>
+      </w:r>
+      <w:r>
+        <w:t xml:space="preserve">из которых принадлежит автомату</w:t>
       </w:r>
       <w:r>
         <w:t xml:space="preserve"> </w:t>
@@ -6357,22 +6413,13 @@
           </m:e>
           <m:sub>
             <m:r>
-              <m:t>4</m:t>
+              <m:t>3</m:t>
             </m:r>
           </m:sub>
         </m:sSub>
       </m:oMath>
       <w:r>
-        <w:t xml:space="preserve"> </w:t>
-      </w:r>
-      <w:r>
-        <w:t xml:space="preserve">вложен сразу в три состояния – «Игра» и</w:t>
-      </w:r>
-      <w:r>
-        <w:t xml:space="preserve"> </w:t>
-      </w:r>
-      <w:r>
-        <w:t xml:space="preserve">«Выдача жетона» автомата</w:t>
+        <w:t xml:space="preserve">, самому вложенному в</w:t>
       </w:r>
       <w:r>
         <w:t xml:space="preserve"> </w:t>
@@ -6387,82 +6434,6 @@
           <m:sub>
             <m:r>
               <m:t>0</m:t>
-            </m:r>
-          </m:sub>
-        </m:sSub>
-      </m:oMath>
-      <w:r>
-        <w:t xml:space="preserve">, а также «Выплата джекпота» автомата</w:t>
-      </w:r>
-      <w:r>
-        <w:t xml:space="preserve"> </w:t>
-      </w:r>
-      <m:oMath>
-        <m:sSub>
-          <m:e>
-            <m:r>
-              <m:t>A</m:t>
-            </m:r>
-          </m:e>
-          <m:sub>
-            <m:r>
-              <m:t>3</m:t>
-            </m:r>
-          </m:sub>
-        </m:sSub>
-      </m:oMath>
-      <w:r>
-        <w:t xml:space="preserve">.</w:t>
-      </w:r>
-      <w:r>
-        <w:t xml:space="preserve"> </w:t>
-      </w:r>
-      <w:r>
-        <w:t xml:space="preserve">Случай 4: третье место вложения – не непосредственно в</w:t>
-      </w:r>
-      <w:r>
-        <w:t xml:space="preserve"> </w:t>
-      </w:r>
-      <m:oMath>
-        <m:sSub>
-          <m:e>
-            <m:r>
-              <m:t>A</m:t>
-            </m:r>
-          </m:e>
-          <m:sub>
-            <m:r>
-              <m:t>0</m:t>
-            </m:r>
-          </m:sub>
-        </m:sSub>
-      </m:oMath>
-      <w:r>
-        <w:t xml:space="preserve">, а во</w:t>
-      </w:r>
-      <w:r>
-        <w:t xml:space="preserve"> </w:t>
-      </w:r>
-      <w:r>
-        <w:rPr>
-          <w:iCs/>
-          <w:i/>
-        </w:rPr>
-        <w:t xml:space="preserve">вложенный</w:t>
-      </w:r>
-      <w:r>
-        <w:t xml:space="preserve"> </w:t>
-      </w:r>
-      <m:oMath>
-        <m:sSub>
-          <m:e>
-            <m:r>
-              <m:t>A</m:t>
-            </m:r>
-          </m:e>
-          <m:sub>
-            <m:r>
-              <m:t>3</m:t>
             </m:r>
           </m:sub>
         </m:sSub>
@@ -6476,13 +6447,43 @@
         <w:pStyle w:val="BodyText"/>
       </w:pPr>
       <w:r>
-        <w:t xml:space="preserve">Первые два самоперехода реагируют на независимо возникающие события среды,</w:t>
-      </w:r>
-      <w:r>
-        <w:t xml:space="preserve"> </w:t>
-      </w:r>
-      <w:r>
-        <w:t xml:space="preserve">объявленные</w:t>
+        <w:t xml:space="preserve">Самопереходы по событиям</w:t>
+      </w:r>
+      <w:r>
+        <w:t xml:space="preserve"> </w:t>
+      </w:r>
+      <w:r>
+        <w:rPr>
+          <w:rStyle w:val="VerbatimChar"/>
+        </w:rPr>
+        <w:t xml:space="preserve">e01</w:t>
+      </w:r>
+      <w:r>
+        <w:t xml:space="preserve"> </w:t>
+      </w:r>
+      <w:r>
+        <w:t xml:space="preserve">(нажатие кнопки «Игра») и</w:t>
+      </w:r>
+      <w:r>
+        <w:t xml:space="preserve"> </w:t>
+      </w:r>
+      <w:r>
+        <w:rPr>
+          <w:rStyle w:val="VerbatimChar"/>
+        </w:rPr>
+        <w:t xml:space="preserve">e06</w:t>
+      </w:r>
+      <w:r>
+        <w:t xml:space="preserve"> </w:t>
+      </w:r>
+      <w:r>
+        <w:t xml:space="preserve">(выдача жетона) реагируют на события среды, на которые</w:t>
+      </w:r>
+      <w:r>
+        <w:t xml:space="preserve"> </w:t>
+      </w:r>
+      <w:r>
+        <w:t xml:space="preserve">реагирует и</w:t>
       </w:r>
       <w:r>
         <w:t xml:space="preserve"> </w:t>
@@ -6502,13 +6503,7 @@
         </m:sSub>
       </m:oMath>
       <w:r>
-        <w:t xml:space="preserve">, и поэтому разделяются вложенным автоматом напрямую, тем</w:t>
-      </w:r>
-      <w:r>
-        <w:t xml:space="preserve"> </w:t>
-      </w:r>
-      <w:r>
-        <w:t xml:space="preserve">же событием. Каждый из них дополнительно проверяет гвард на состояние</w:t>
+        <w:t xml:space="preserve">. Алгоритм определяет лишь, вложен ли</w:t>
       </w:r>
       <w:r>
         <w:t xml:space="preserve"> </w:t>
@@ -6522,25 +6517,22 @@
           </m:e>
           <m:sub>
             <m:r>
-              <m:t>0</m:t>
+              <m:t>4</m:t>
             </m:r>
           </m:sub>
         </m:sSub>
       </m:oMath>
       <w:r>
-        <w:t xml:space="preserve">: вложенность в алгоритме отмечает только факт вложения в состояние,</w:t>
-      </w:r>
-      <w:r>
-        <w:t xml:space="preserve"> </w:t>
-      </w:r>
-      <w:r>
-        <w:t xml:space="preserve">но не место вложения, поэтому без гварда реакция, предназначенная для</w:t>
-      </w:r>
-      <w:r>
-        <w:t xml:space="preserve"> </w:t>
-      </w:r>
-      <w:r>
-        <w:t xml:space="preserve">«Выдача жетона», была бы достижима и в «Игра», поскольку</w:t>
+        <w:t xml:space="preserve"> </w:t>
+      </w:r>
+      <w:r>
+        <w:t xml:space="preserve">в текущее</w:t>
+      </w:r>
+      <w:r>
+        <w:t xml:space="preserve"> </w:t>
+      </w:r>
+      <w:r>
+        <w:t xml:space="preserve">состояние произведения, но не связывает отдельные реакции</w:t>
       </w:r>
       <w:r>
         <w:t xml:space="preserve"> </w:t>
@@ -6563,19 +6555,28 @@
         <w:t xml:space="preserve"> </w:t>
       </w:r>
       <w:r>
-        <w:t xml:space="preserve">вложен и</w:t>
-      </w:r>
-      <w:r>
-        <w:t xml:space="preserve"> </w:t>
-      </w:r>
-      <w:r>
-        <w:t xml:space="preserve">туда тоже, хотя там это событие не возникает. Гвард ограничивает</w:t>
-      </w:r>
-      <w:r>
-        <w:t xml:space="preserve"> </w:t>
-      </w:r>
-      <w:r>
-        <w:t xml:space="preserve">срабатывание тем состоянием</w:t>
+        <w:t xml:space="preserve">с</w:t>
+      </w:r>
+      <w:r>
+        <w:t xml:space="preserve"> </w:t>
+      </w:r>
+      <w:r>
+        <w:t xml:space="preserve">конкретным местом вложения. Поэтому без гвардов реакция на</w:t>
+      </w:r>
+      <w:r>
+        <w:t xml:space="preserve"> </w:t>
+      </w:r>
+      <w:r>
+        <w:rPr>
+          <w:rStyle w:val="VerbatimChar"/>
+        </w:rPr>
+        <w:t xml:space="preserve">e06</w:t>
+      </w:r>
+      <w:r>
+        <w:t xml:space="preserve"> </w:t>
+      </w:r>
+      <w:r>
+        <w:t xml:space="preserve">была бы допустима и в состоянии «Игра», где</w:t>
       </w:r>
       <w:r>
         <w:t xml:space="preserve"> </w:t>
@@ -6595,13 +6596,78 @@
         </m:sSub>
       </m:oMath>
       <w:r>
-        <w:t xml:space="preserve">, ради которого введено соответствующее</w:t>
-      </w:r>
-      <w:r>
-        <w:t xml:space="preserve"> </w:t>
-      </w:r>
-      <w:r>
-        <w:t xml:space="preserve">место вложения.</w:t>
+        <w:t xml:space="preserve"> </w:t>
+      </w:r>
+      <w:r>
+        <w:t xml:space="preserve">на это событие не</w:t>
+      </w:r>
+      <w:r>
+        <w:t xml:space="preserve"> </w:t>
+      </w:r>
+      <w:r>
+        <w:t xml:space="preserve">реагирует. Гварды</w:t>
+      </w:r>
+      <w:r>
+        <w:t xml:space="preserve"> </w:t>
+      </w:r>
+      <w:r>
+        <w:rPr>
+          <w:rStyle w:val="VerbatimChar"/>
+        </w:rPr>
+        <w:t xml:space="preserve">y0=2</w:t>
+      </w:r>
+      <w:r>
+        <w:t xml:space="preserve"> </w:t>
+      </w:r>
+      <w:r>
+        <w:t xml:space="preserve">и</w:t>
+      </w:r>
+      <w:r>
+        <w:t xml:space="preserve"> </w:t>
+      </w:r>
+      <w:r>
+        <w:rPr>
+          <w:rStyle w:val="VerbatimChar"/>
+        </w:rPr>
+        <w:t xml:space="preserve">y0=4</w:t>
+      </w:r>
+      <w:r>
+        <w:t xml:space="preserve"> </w:t>
+      </w:r>
+      <w:r>
+        <w:t xml:space="preserve">ограничивают каждую</w:t>
+      </w:r>
+      <w:r>
+        <w:t xml:space="preserve"> </w:t>
+      </w:r>
+      <w:r>
+        <w:t xml:space="preserve">реакцию тем состоянием</w:t>
+      </w:r>
+      <w:r>
+        <w:t xml:space="preserve"> </w:t>
+      </w:r>
+      <m:oMath>
+        <m:sSub>
+          <m:e>
+            <m:r>
+              <m:t>A</m:t>
+            </m:r>
+          </m:e>
+          <m:sub>
+            <m:r>
+              <m:t>0</m:t>
+            </m:r>
+          </m:sub>
+        </m:sSub>
+      </m:oMath>
+      <w:r>
+        <w:t xml:space="preserve">, ради которого введено соответствующее место</w:t>
+      </w:r>
+      <w:r>
+        <w:t xml:space="preserve"> </w:t>
+      </w:r>
+      <w:r>
+        <w:t xml:space="preserve">вложения.</w:t>
       </w:r>
     </w:p>
     <w:p>
@@ -6609,13 +6675,28 @@
         <w:pStyle w:val="BodyText"/>
       </w:pPr>
       <w:r>
-        <w:t xml:space="preserve">Третий самопереход устроен иначе и гварда не проверяет: он реагирует на</w:t>
-      </w:r>
-      <w:r>
-        <w:t xml:space="preserve"> </w:t>
-      </w:r>
-      <w:r>
-        <w:t xml:space="preserve">отдельное событие, которое</w:t>
+        <w:t xml:space="preserve">Самопереход по событию</w:t>
+      </w:r>
+      <w:r>
+        <w:t xml:space="preserve"> </w:t>
+      </w:r>
+      <w:r>
+        <w:rPr>
+          <w:rStyle w:val="VerbatimChar"/>
+        </w:rPr>
+        <w:t xml:space="preserve">e40</w:t>
+      </w:r>
+      <w:r>
+        <w:t xml:space="preserve"> </w:t>
+      </w:r>
+      <w:r>
+        <w:t xml:space="preserve">гварда не требует: это событие</w:t>
+      </w:r>
+      <w:r>
+        <w:t xml:space="preserve"> </w:t>
+      </w:r>
+      <w:r>
+        <w:t xml:space="preserve">адресовано</w:t>
       </w:r>
       <w:r>
         <w:t xml:space="preserve"> </w:t>
@@ -6629,7 +6710,7 @@
           </m:e>
           <m:sub>
             <m:r>
-              <m:t>3</m:t>
+              <m:t>4</m:t>
             </m:r>
           </m:sub>
         </m:sSub>
@@ -6638,7 +6719,7 @@
         <w:t xml:space="preserve"> </w:t>
       </w:r>
       <w:r>
-        <w:t xml:space="preserve">адресует</w:t>
+        <w:t xml:space="preserve">автоматом</w:t>
       </w:r>
       <w:r>
         <w:t xml:space="preserve"> </w:t>
@@ -6652,7 +6733,7 @@
           </m:e>
           <m:sub>
             <m:r>
-              <m:t>4</m:t>
+              <m:t>3</m:t>
             </m:r>
           </m:sub>
         </m:sSub>
@@ -6661,31 +6742,7 @@
         <w:t xml:space="preserve"> </w:t>
       </w:r>
       <w:r>
-        <w:t xml:space="preserve">среди результатов перехода</w:t>
-      </w:r>
-      <w:r>
-        <w:t xml:space="preserve"> </w:t>
-      </w:r>
-      <w:r>
-        <w:t xml:space="preserve">(раздел «Автомат 4»), а не на событие перехода. Причина – в том,</w:t>
-      </w:r>
-      <w:r>
-        <w:t xml:space="preserve"> </w:t>
-      </w:r>
-      <w:r>
-        <w:t xml:space="preserve">что завершение выплаты джекпота, в отличие от нажатия кнопки или выдачи</w:t>
-      </w:r>
-      <w:r>
-        <w:t xml:space="preserve"> </w:t>
-      </w:r>
-      <w:r>
-        <w:t xml:space="preserve">жетона, никогда не возникает независимо: оно существует только как часть</w:t>
-      </w:r>
-      <w:r>
-        <w:t xml:space="preserve"> </w:t>
-      </w:r>
-      <w:r>
-        <w:t xml:space="preserve">перехода</w:t>
+        <w:t xml:space="preserve">и поступает только в момент выхода</w:t>
       </w:r>
       <w:r>
         <w:t xml:space="preserve"> </w:t>
@@ -6705,7 +6762,28 @@
         </m:sSub>
       </m:oMath>
       <w:r>
-        <w:t xml:space="preserve">. Прямая реакция</w:t>
+        <w:t xml:space="preserve"> </w:t>
+      </w:r>
+      <w:r>
+        <w:t xml:space="preserve">из состояния «Выплата джекпота». Отдельное событие необходимо, поскольку</w:t>
+      </w:r>
+      <w:r>
+        <w:t xml:space="preserve"> </w:t>
+      </w:r>
+      <w:r>
+        <w:t xml:space="preserve">событие</w:t>
+      </w:r>
+      <w:r>
+        <w:t xml:space="preserve"> </w:t>
+      </w:r>
+      <w:r>
+        <w:rPr>
+          <w:rStyle w:val="VerbatimChar"/>
+        </w:rPr>
+        <w:t xml:space="preserve">e33</w:t>
+      </w:r>
+      <w:r>
+        <w:t xml:space="preserve">, вызывающее этот выход, адресовано автоматом</w:t>
       </w:r>
       <w:r>
         <w:t xml:space="preserve"> </w:t>
@@ -6719,7 +6797,7 @@
           </m:e>
           <m:sub>
             <m:r>
-              <m:t>4</m:t>
+              <m:t>0</m:t>
             </m:r>
           </m:sub>
         </m:sSub>
@@ -6728,13 +6806,7 @@
         <w:t xml:space="preserve"> </w:t>
       </w:r>
       <w:r>
-        <w:t xml:space="preserve">на это событие сделала бы его</w:t>
-      </w:r>
-      <w:r>
-        <w:t xml:space="preserve"> </w:t>
-      </w:r>
-      <w:r>
-        <w:t xml:space="preserve">ошибочно независимо достижимым и привела бы к переходу</w:t>
+        <w:t xml:space="preserve">автомату</w:t>
       </w:r>
       <w:r>
         <w:t xml:space="preserve"> </w:t>
@@ -6748,7 +6820,7 @@
           </m:e>
           <m:sub>
             <m:r>
-              <m:t>4</m:t>
+              <m:t>3</m:t>
             </m:r>
           </m:sub>
         </m:sSub>
@@ -6757,13 +6829,7 @@
         <w:t xml:space="preserve"> </w:t>
       </w:r>
       <w:r>
-        <w:t xml:space="preserve">без</w:t>
-      </w:r>
-      <w:r>
-        <w:t xml:space="preserve"> </w:t>
-      </w:r>
-      <w:r>
-        <w:t xml:space="preserve">соответствующего перехода</w:t>
+        <w:t xml:space="preserve">и автомату</w:t>
       </w:r>
       <w:r>
         <w:t xml:space="preserve"> </w:t>
@@ -6777,7 +6843,7 @@
           </m:e>
           <m:sub>
             <m:r>
-              <m:t>3</m:t>
+              <m:t>4</m:t>
             </m:r>
           </m:sub>
         </m:sSub>
@@ -6786,24 +6852,7 @@
         <w:t xml:space="preserve"> </w:t>
       </w:r>
       <w:r>
-        <w:t xml:space="preserve">– ошибке, устранённой доработкой 3</w:t>
-      </w:r>
-      <w:r>
-        <w:t xml:space="preserve"> </w:t>
-      </w:r>
-      <w:r>
-        <w:t xml:space="preserve">(раздел </w:t>
-      </w:r>
-      <w:hyperlink w:anchor="sec:fixes">
-        <w:r>
-          <w:rPr>
-            <w:rStyle w:val="Hyperlink"/>
-          </w:rPr>
-          <w:t xml:space="preserve">3</w:t>
-        </w:r>
-      </w:hyperlink>
-      <w:r>
-        <w:t xml:space="preserve">).</w:t>
+        <w:t xml:space="preserve">не поступает.</w:t>
       </w:r>
     </w:p>
     <w:bookmarkEnd w:id="41"/>
@@ -6847,13 +6896,13 @@
         <w:t xml:space="preserve"> </w:t>
       </w:r>
       <w:r>
-        <w:t xml:space="preserve">проверялся по номеру состояния этого автомата в уже построенном составном</w:t>
-      </w:r>
-      <w:r>
-        <w:t xml:space="preserve"> </w:t>
-      </w:r>
-      <w:r>
-        <w:t xml:space="preserve">автомате.</w:t>
+        <w:t xml:space="preserve">проверялся по номеру состояния этого автомата в составном автомате,</w:t>
+      </w:r>
+      <w:r>
+        <w:t xml:space="preserve"> </w:t>
+      </w:r>
+      <w:r>
+        <w:t xml:space="preserve">полученном на предыдущих шагах умножения.</w:t>
       </w:r>
     </w:p>
     <w:p>
@@ -6889,7 +6938,7 @@
         <w:t xml:space="preserve"> </w:t>
       </w:r>
       <w:r>
-        <w:t xml:space="preserve">участвовавший в слиянии, нельзя было корректно проверить. Из-за этого в</w:t>
+        <w:t xml:space="preserve">участвовавший в объединении, нельзя было корректно проверить. Из-за этого в</w:t>
       </w:r>
       <w:r>
         <w:t xml:space="preserve"> </w:t>
@@ -6907,13 +6956,13 @@
         <w:t xml:space="preserve"> </w:t>
       </w:r>
       <w:r>
-        <w:t xml:space="preserve">непроверяемыми. По той же причине один автомат нельзя было вложить более</w:t>
-      </w:r>
-      <w:r>
-        <w:t xml:space="preserve"> </w:t>
-      </w:r>
-      <w:r>
-        <w:t xml:space="preserve">чем в одно состояние родителя (ограничение 2).</w:t>
+        <w:t xml:space="preserve">непроверяемыми. По той же причине автомат нельзя было вложить более чем в</w:t>
+      </w:r>
+      <w:r>
+        <w:t xml:space="preserve"> </w:t>
+      </w:r>
+      <w:r>
+        <w:t xml:space="preserve">одно состояние (ограничение 2).</w:t>
       </w:r>
     </w:p>
     <w:p>
@@ -6943,37 +6992,31 @@
         <w:t xml:space="preserve"> </w:t>
       </w:r>
       <w:r>
-        <w:t xml:space="preserve">автомату его собственное состояние. При объединении состояний такие</w:t>
-      </w:r>
-      <w:r>
-        <w:t xml:space="preserve"> </w:t>
-      </w:r>
-      <w:r>
-        <w:t xml:space="preserve">отображения объединяются, поэтому информация не теряется при умножении</w:t>
-      </w:r>
-      <w:r>
-        <w:t xml:space="preserve"> </w:t>
-      </w:r>
-      <w:r>
-        <w:t xml:space="preserve">цепочки автоматов. Гвард теперь проверяется по этому отображению, а не по</w:t>
-      </w:r>
-      <w:r>
-        <w:t xml:space="preserve"> </w:t>
-      </w:r>
-      <w:r>
-        <w:t xml:space="preserve">номеру состояния произведения, и не зависит ни от числа автоматов,</w:t>
-      </w:r>
-      <w:r>
-        <w:t xml:space="preserve"> </w:t>
-      </w:r>
-      <w:r>
-        <w:t xml:space="preserve">вложенных в одно состояние (случай 2), ни от числа состояний, в которые</w:t>
-      </w:r>
-      <w:r>
-        <w:t xml:space="preserve"> </w:t>
-      </w:r>
-      <w:r>
-        <w:t xml:space="preserve">вложен один автомат (случай 3).</w:t>
+        <w:t xml:space="preserve">автомату его собственное состояние. При объединении состояний эти</w:t>
+      </w:r>
+      <w:r>
+        <w:t xml:space="preserve"> </w:t>
+      </w:r>
+      <w:r>
+        <w:t xml:space="preserve">отображения объединяются, поэтому информация сохраняется при умножении</w:t>
+      </w:r>
+      <w:r>
+        <w:t xml:space="preserve"> </w:t>
+      </w:r>
+      <w:r>
+        <w:t xml:space="preserve">цепочки автоматов. Гвард проверяется по этому отображению и не зависит ни</w:t>
+      </w:r>
+      <w:r>
+        <w:t xml:space="preserve"> </w:t>
+      </w:r>
+      <w:r>
+        <w:t xml:space="preserve">от числа автоматов, вложенных в одно состояние (случай 2), ни от числа</w:t>
+      </w:r>
+      <w:r>
+        <w:t xml:space="preserve"> </w:t>
+      </w:r>
+      <w:r>
+        <w:t xml:space="preserve">состояний, в которые вложен один автомат (случай 3).</w:t>
       </w:r>
     </w:p>
     <w:bookmarkEnd w:id="43"/>
@@ -7013,7 +7056,7 @@
         <w:t xml:space="preserve"> </w:t>
       </w:r>
       <w:r>
-        <w:t xml:space="preserve">операндов, без дополнительных условий.</w:t>
+        <w:t xml:space="preserve">операндов без дополнительных условий.</w:t>
       </w:r>
     </w:p>
     <w:p>
@@ -7037,19 +7080,13 @@
         <w:t xml:space="preserve"> </w:t>
       </w:r>
       <w:r>
-        <w:t xml:space="preserve">одного из двух операндов (ограничение 3), схема работала корректно. Но при</w:t>
-      </w:r>
-      <w:r>
-        <w:t xml:space="preserve"> </w:t>
-      </w:r>
-      <w:r>
-        <w:t xml:space="preserve">перемножении автоматов, вложенных друг в друга на двух уровнях одновременно</w:t>
-      </w:r>
-      <w:r>
-        <w:t xml:space="preserve"> </w:t>
-      </w:r>
-      <w:r>
-        <w:t xml:space="preserve">(случай 4:</w:t>
+        <w:t xml:space="preserve">одного из операндов (ограничение 3), объединение было корректным. При</w:t>
+      </w:r>
+      <w:r>
+        <w:t xml:space="preserve"> </w:t>
+      </w:r>
+      <w:r>
+        <w:t xml:space="preserve">вложенности на двух уровнях (случай 4:</w:t>
       </w:r>
       <w:r>
         <w:t xml:space="preserve"> </w:t>
@@ -7095,7 +7132,13 @@
         <w:t xml:space="preserve"> </w:t>
       </w:r>
       <w:r>
-        <w:t xml:space="preserve">и сам вложен в</w:t>
+        <w:t xml:space="preserve">и сам вложен</w:t>
+      </w:r>
+      <w:r>
+        <w:t xml:space="preserve"> </w:t>
+      </w:r>
+      <w:r>
+        <w:t xml:space="preserve">в</w:t>
       </w:r>
       <w:r>
         <w:t xml:space="preserve"> </w:t>
@@ -7115,37 +7158,31 @@
         </m:sSub>
       </m:oMath>
       <w:r>
-        <w:t xml:space="preserve">), оба операнда</w:t>
-      </w:r>
-      <w:r>
-        <w:t xml:space="preserve"> </w:t>
-      </w:r>
-      <w:r>
-        <w:t xml:space="preserve">одновременно имеют непустые множества вложенных автоматов. Второй операнд</w:t>
-      </w:r>
-      <w:r>
-        <w:t xml:space="preserve"> </w:t>
-      </w:r>
-      <w:r>
-        <w:t xml:space="preserve">вносит своё множество в объединение безусловно, даже если не находится в</w:t>
-      </w:r>
-      <w:r>
-        <w:t xml:space="preserve"> </w:t>
-      </w:r>
-      <w:r>
-        <w:t xml:space="preserve">состоянии, которое объявляет эту вложенность. Из-за этого автомат, вложенный</w:t>
-      </w:r>
-      <w:r>
-        <w:t xml:space="preserve"> </w:t>
-      </w:r>
-      <w:r>
-        <w:t xml:space="preserve">во вложенный автомат, становился достижимым из любого состояния внешнего</w:t>
-      </w:r>
-      <w:r>
-        <w:t xml:space="preserve"> </w:t>
-      </w:r>
-      <w:r>
-        <w:t xml:space="preserve">родителя, а не только из тех состояний, где он действительно вложен.</w:t>
+        <w:t xml:space="preserve">) непустые множества имеют оба операнда. Тогда второй операнд</w:t>
+      </w:r>
+      <w:r>
+        <w:t xml:space="preserve"> </w:t>
+      </w:r>
+      <w:r>
+        <w:t xml:space="preserve">вносит своё множество в объединение даже в тех состояниях произведения,</w:t>
+      </w:r>
+      <w:r>
+        <w:t xml:space="preserve"> </w:t>
+      </w:r>
+      <w:r>
+        <w:t xml:space="preserve">где его родительский автомат находится не в том состоянии, в которое он</w:t>
+      </w:r>
+      <w:r>
+        <w:t xml:space="preserve"> </w:t>
+      </w:r>
+      <w:r>
+        <w:t xml:space="preserve">вложен. В результате автомат, вложенный во вложенный автомат, реагировал</w:t>
+      </w:r>
+      <w:r>
+        <w:t xml:space="preserve"> </w:t>
+      </w:r>
+      <w:r>
+        <w:t xml:space="preserve">на события во всех состояниях внешнего родительского автомата.</w:t>
       </w:r>
     </w:p>
     <w:p>
@@ -7163,43 +7200,31 @@
         <w:t xml:space="preserve"> </w:t>
       </w:r>
       <w:r>
-        <w:t xml:space="preserve">Множество вложенных автоматов одного операнда</w:t>
-      </w:r>
-      <w:r>
-        <w:t xml:space="preserve"> </w:t>
-      </w:r>
-      <w:r>
-        <w:t xml:space="preserve">учитывается в объединении, только если этот операнд сам объявлен вложенным</w:t>
-      </w:r>
-      <w:r>
-        <w:t xml:space="preserve"> </w:t>
-      </w:r>
-      <w:r>
-        <w:t xml:space="preserve">автоматом второго операнда хотя бы в одном состоянии, и в этом случае –</w:t>
-      </w:r>
-      <w:r>
-        <w:t xml:space="preserve"> </w:t>
-      </w:r>
-      <w:r>
-        <w:t xml:space="preserve">только пока второй операнд находится именно в этом состоянии. Для</w:t>
-      </w:r>
-      <w:r>
-        <w:t xml:space="preserve"> </w:t>
-      </w:r>
-      <w:r>
-        <w:t xml:space="preserve">автоматов, не связанных отношением вложенности, проверка результат не</w:t>
-      </w:r>
-      <w:r>
-        <w:t xml:space="preserve"> </w:t>
-      </w:r>
-      <w:r>
-        <w:t xml:space="preserve">меняет: множество вложенных автоматов учитывается безусловно, как и</w:t>
-      </w:r>
-      <w:r>
-        <w:t xml:space="preserve"> </w:t>
-      </w:r>
-      <w:r>
-        <w:t xml:space="preserve">прежде.</w:t>
+        <w:t xml:space="preserve">Если операнд вложен во второй операнд, его</w:t>
+      </w:r>
+      <w:r>
+        <w:t xml:space="preserve"> </w:t>
+      </w:r>
+      <w:r>
+        <w:t xml:space="preserve">множество вложенных автоматов учитывается только в тех состояниях</w:t>
+      </w:r>
+      <w:r>
+        <w:t xml:space="preserve"> </w:t>
+      </w:r>
+      <w:r>
+        <w:t xml:space="preserve">произведения, где второй операнд находится в состоянии, в которое этот</w:t>
+      </w:r>
+      <w:r>
+        <w:t xml:space="preserve"> </w:t>
+      </w:r>
+      <w:r>
+        <w:t xml:space="preserve">операнд вложен. Для автоматов, не связанных отношением вложенности,</w:t>
+      </w:r>
+      <w:r>
+        <w:t xml:space="preserve"> </w:t>
+      </w:r>
+      <w:r>
+        <w:t xml:space="preserve">множество учитывается, как и прежде, без условий.</w:t>
       </w:r>
     </w:p>
     <w:bookmarkEnd w:id="44"/>
@@ -7227,25 +7252,19 @@
         <w:t xml:space="preserve"> </w:t>
       </w:r>
       <w:r>
-        <w:t xml:space="preserve">Если автомат был вложен в текущее состояние (с учётом</w:t>
-      </w:r>
-      <w:r>
-        <w:t xml:space="preserve"> </w:t>
-      </w:r>
-      <w:r>
-        <w:t xml:space="preserve">доработок 1 и 2), строитель произведения допускал к независимому</w:t>
-      </w:r>
-      <w:r>
-        <w:t xml:space="preserve"> </w:t>
-      </w:r>
-      <w:r>
-        <w:t xml:space="preserve">исследованию любое его событие, адресованное ему другим автоматом, –</w:t>
-      </w:r>
-      <w:r>
-        <w:t xml:space="preserve"> </w:t>
-      </w:r>
-      <w:r>
-        <w:t xml:space="preserve">наравне с событием среды, действительно общим для обоих автоматов.</w:t>
+        <w:t xml:space="preserve">Если автомат вложен в текущее состояние, на этапе 3 любое</w:t>
+      </w:r>
+      <w:r>
+        <w:t xml:space="preserve"> </w:t>
+      </w:r>
+      <w:r>
+        <w:t xml:space="preserve">адресованное ему событие рассматривалось как событие, способное само по</w:t>
+      </w:r>
+      <w:r>
+        <w:t xml:space="preserve"> </w:t>
+      </w:r>
+      <w:r>
+        <w:t xml:space="preserve">себе вызвать переход произведения, – так же, как событие среды.</w:t>
       </w:r>
     </w:p>
     <w:p>
@@ -7263,401 +7282,25 @@
         <w:t xml:space="preserve"> </w:t>
       </w:r>
       <w:r>
-        <w:t xml:space="preserve">Это было корректно, пока вложенный автомат</w:t>
-      </w:r>
-      <w:r>
-        <w:t xml:space="preserve"> </w:t>
-      </w:r>
-      <w:r>
-        <w:t xml:space="preserve">реагировал только на настоящие события среды (как</w:t>
-      </w:r>
-      <w:r>
-        <w:t xml:space="preserve"> </w:t>
-      </w:r>
-      <m:oMath>
-        <m:sSub>
-          <m:e>
-            <m:r>
-              <m:t>A</m:t>
-            </m:r>
-          </m:e>
-          <m:sub>
-            <m:r>
-              <m:t>2</m:t>
-            </m:r>
-          </m:sub>
-        </m:sSub>
-      </m:oMath>
-      <w:r>
-        <w:t xml:space="preserve"> </w:t>
-      </w:r>
-      <w:r>
-        <w:t xml:space="preserve">и</w:t>
-      </w:r>
-      <w:r>
-        <w:t xml:space="preserve"> </w:t>
-      </w:r>
-      <m:oMath>
-        <m:sSub>
-          <m:e>
-            <m:r>
-              <m:t>A</m:t>
-            </m:r>
-          </m:e>
-          <m:sub>
-            <m:r>
-              <m:t>3</m:t>
-            </m:r>
-          </m:sub>
-        </m:sSub>
-      </m:oMath>
-      <w:r>
-        <w:t xml:space="preserve"> </w:t>
-      </w:r>
-      <w:r>
-        <w:t xml:space="preserve">реагируют</w:t>
-      </w:r>
-      <w:r>
-        <w:t xml:space="preserve"> </w:t>
-      </w:r>
-      <w:r>
-        <w:t xml:space="preserve">на остановку третьего барабана). Но если вложенный автомат также реагирует</w:t>
-      </w:r>
-      <w:r>
-        <w:t xml:space="preserve"> </w:t>
-      </w:r>
-      <w:r>
-        <w:t xml:space="preserve">на событие, которое нигде не объявлено событием среды, а существует только</w:t>
-      </w:r>
-      <w:r>
-        <w:t xml:space="preserve"> </w:t>
-      </w:r>
-      <w:r>
-        <w:t xml:space="preserve">как часть перехода другого автомата, факт вложенности делал такое событие</w:t>
-      </w:r>
-      <w:r>
-        <w:t xml:space="preserve"> </w:t>
-      </w:r>
-      <w:r>
-        <w:t xml:space="preserve">ошибочно независимо достижимым. Это обнаружилось на случае 4:</w:t>
-      </w:r>
-      <w:r>
-        <w:t xml:space="preserve"> </w:t>
-      </w:r>
-      <m:oMath>
-        <m:sSub>
-          <m:e>
-            <m:r>
-              <m:t>A</m:t>
-            </m:r>
-          </m:e>
-          <m:sub>
-            <m:r>
-              <m:t>4</m:t>
-            </m:r>
-          </m:sub>
-        </m:sSub>
-      </m:oMath>
-      <w:r>
-        <w:t xml:space="preserve"> </w:t>
-      </w:r>
-      <w:r>
-        <w:t xml:space="preserve">вложен</w:t>
-      </w:r>
-      <w:r>
-        <w:t xml:space="preserve"> </w:t>
-      </w:r>
-      <w:r>
-        <w:t xml:space="preserve">в</w:t>
-      </w:r>
-      <w:r>
-        <w:t xml:space="preserve"> </w:t>
-      </w:r>
-      <m:oMath>
-        <m:sSub>
-          <m:e>
-            <m:r>
-              <m:t>A</m:t>
-            </m:r>
-          </m:e>
-          <m:sub>
-            <m:r>
-              <m:t>3</m:t>
-            </m:r>
-          </m:sub>
-        </m:sSub>
-      </m:oMath>
-      <w:r>
-        <w:t xml:space="preserve">, которому обязан событием завершения выплаты джекпота. Независимое</w:t>
-      </w:r>
-      <w:r>
-        <w:t xml:space="preserve"> </w:t>
-      </w:r>
-      <w:r>
-        <w:t xml:space="preserve">исследование этого события порождало переход, в котором реагирует только</w:t>
-      </w:r>
-      <w:r>
-        <w:t xml:space="preserve"> </w:t>
-      </w:r>
-      <m:oMath>
-        <m:sSub>
-          <m:e>
-            <m:r>
-              <m:t>A</m:t>
-            </m:r>
-          </m:e>
-          <m:sub>
-            <m:r>
-              <m:t>4</m:t>
-            </m:r>
-          </m:sub>
-        </m:sSub>
-      </m:oMath>
-      <w:r>
-        <w:t xml:space="preserve">, а переход</w:t>
-      </w:r>
-      <w:r>
-        <w:t xml:space="preserve"> </w:t>
-      </w:r>
-      <m:oMath>
-        <m:sSub>
-          <m:e>
-            <m:r>
-              <m:t>A</m:t>
-            </m:r>
-          </m:e>
-          <m:sub>
-            <m:r>
-              <m:t>3</m:t>
-            </m:r>
-          </m:sub>
-        </m:sSub>
-      </m:oMath>
-      <w:r>
-        <w:t xml:space="preserve">, которому событие обязано существованием, не</w:t>
-      </w:r>
-      <w:r>
-        <w:t xml:space="preserve"> </w:t>
-      </w:r>
-      <w:r>
-        <w:t xml:space="preserve">происходит.</w:t>
-      </w:r>
-    </w:p>
-    <w:p>
-      <w:pPr>
-        <w:pStyle w:val="BodyText"/>
-      </w:pPr>
-      <w:r>
-        <w:rPr>
-          <w:bCs/>
-          <w:b/>
-        </w:rPr>
-        <w:t xml:space="preserve">Как исправили.</w:t>
-      </w:r>
-      <w:r>
-        <w:t xml:space="preserve"> </w:t>
-      </w:r>
-      <w:r>
-        <w:t xml:space="preserve">К проверке вложенности добавлено условие: событие</w:t>
-      </w:r>
-      <w:r>
-        <w:t xml:space="preserve"> </w:t>
-      </w:r>
-      <w:r>
-        <w:t xml:space="preserve">допускается к независимому исследованию, только если оно объявлено</w:t>
-      </w:r>
-      <w:r>
-        <w:t xml:space="preserve"> </w:t>
-      </w:r>
-      <w:r>
-        <w:t xml:space="preserve">событием среды где-либо в уже построенной части произведения, а не</w:t>
-      </w:r>
-      <w:r>
-        <w:t xml:space="preserve"> </w:t>
-      </w:r>
-      <w:r>
-        <w:t xml:space="preserve">исключительно событием, адресованным одним автоматом другому. Если</w:t>
-      </w:r>
-      <w:r>
-        <w:t xml:space="preserve"> </w:t>
-      </w:r>
-      <w:r>
-        <w:t xml:space="preserve">источник события ещё не включён в произведение, событие просто не</w:t>
-      </w:r>
-      <w:r>
-        <w:t xml:space="preserve"> </w:t>
-      </w:r>
-      <w:r>
-        <w:t xml:space="preserve">признаётся независимо достижимым – по тому же принципу, что и в разделе</w:t>
-      </w:r>
-      <w:r>
-        <w:t xml:space="preserve"> </w:t>
-      </w:r>
-      <w:r>
-        <w:t xml:space="preserve">«Замечание о порядке умножения». После этой доработки событие,</w:t>
-      </w:r>
-      <w:r>
-        <w:t xml:space="preserve"> </w:t>
-      </w:r>
-      <w:r>
-        <w:t xml:space="preserve">адресованное одним автоматом другому, достигает вложенного адресата</w:t>
-      </w:r>
-      <w:r>
-        <w:t xml:space="preserve"> </w:t>
-      </w:r>
-      <w:r>
-        <w:t xml:space="preserve">только явным образом – будучи перечисленным среди результатов</w:t>
-      </w:r>
-      <w:r>
-        <w:t xml:space="preserve"> </w:t>
-      </w:r>
-      <w:r>
-        <w:t xml:space="preserve">конкретного перехода.</w:t>
-      </w:r>
-    </w:p>
-    <w:bookmarkEnd w:id="45"/>
-    <w:bookmarkStart w:id="46" w:name="замечание-о-порядке-умножения"/>
-    <w:p>
-      <w:pPr>
-        <w:pStyle w:val="Heading2"/>
-      </w:pPr>
-      <w:r>
-        <w:t xml:space="preserve">Замечание о порядке умножения</w:t>
-      </w:r>
-    </w:p>
-    <w:p>
-      <w:pPr>
-        <w:pStyle w:val="FirstParagraph"/>
-      </w:pPr>
-      <w:r>
-        <w:t xml:space="preserve">Доработки 1 и 2 предполагают порядок умножения, согласованный с</w:t>
-      </w:r>
-      <w:r>
-        <w:t xml:space="preserve"> </w:t>
-      </w:r>
-      <w:r>
-        <w:t xml:space="preserve">зависимостями между автоматами: если автомат</w:t>
-      </w:r>
-      <w:r>
-        <w:t xml:space="preserve"> </w:t>
-      </w:r>
-      <m:oMath>
-        <m:r>
-          <m:t>Y</m:t>
-        </m:r>
-      </m:oMath>
-      <w:r>
-        <w:t xml:space="preserve"> </w:t>
-      </w:r>
-      <w:r>
-        <w:t xml:space="preserve">содержит гвард,</w:t>
-      </w:r>
-      <w:r>
-        <w:t xml:space="preserve"> </w:t>
-      </w:r>
-      <w:r>
-        <w:t xml:space="preserve">ссылающийся на состояние автомата</w:t>
-      </w:r>
-      <w:r>
-        <w:t xml:space="preserve"> </w:t>
-      </w:r>
-      <m:oMath>
-        <m:r>
-          <m:t>X</m:t>
-        </m:r>
-      </m:oMath>
-      <w:r>
-        <w:t xml:space="preserve">, то</w:t>
-      </w:r>
-      <w:r>
-        <w:t xml:space="preserve"> </w:t>
-      </w:r>
-      <m:oMath>
-        <m:r>
-          <m:t>X</m:t>
-        </m:r>
-      </m:oMath>
-      <w:r>
-        <w:t xml:space="preserve"> </w:t>
-      </w:r>
-      <w:r>
-        <w:t xml:space="preserve">должен быть включён в</w:t>
-      </w:r>
-      <w:r>
-        <w:t xml:space="preserve"> </w:t>
-      </w:r>
-      <w:r>
-        <w:t xml:space="preserve">произведение не позднее</w:t>
-      </w:r>
-      <w:r>
-        <w:t xml:space="preserve"> </w:t>
-      </w:r>
-      <m:oMath>
-        <m:r>
-          <m:t>Y</m:t>
-        </m:r>
-      </m:oMath>
-      <w:r>
-        <w:t xml:space="preserve"> </w:t>
-      </w:r>
-      <w:r>
-        <w:t xml:space="preserve">– иначе эта ссылка не может быть корректно</w:t>
-      </w:r>
-      <w:r>
-        <w:t xml:space="preserve"> </w:t>
-      </w:r>
-      <w:r>
-        <w:t xml:space="preserve">разрешена.</w:t>
-      </w:r>
-    </w:p>
-    <w:p>
-      <w:pPr>
-        <w:pStyle w:val="BodyText"/>
-      </w:pPr>
-      <w:r>
-        <w:t xml:space="preserve">До настоящей работы такое же требование действовало и для реакций на</w:t>
-      </w:r>
-      <w:r>
-        <w:t xml:space="preserve"> </w:t>
-      </w:r>
-      <w:r>
-        <w:t xml:space="preserve">события, адресованные конкретным автоматом: если адресат события ещё не</w:t>
-      </w:r>
-      <w:r>
-        <w:t xml:space="preserve"> </w:t>
-      </w:r>
-      <w:r>
-        <w:t xml:space="preserve">был включён в произведение, событие ошибочно считалось независимо</w:t>
-      </w:r>
-      <w:r>
-        <w:t xml:space="preserve"> </w:t>
-      </w:r>
-      <w:r>
-        <w:t xml:space="preserve">достижимым, что порождало лишние состояния произведения. Теперь</w:t>
-      </w:r>
-      <w:r>
-        <w:t xml:space="preserve"> </w:t>
-      </w:r>
-      <w:r>
-        <w:t xml:space="preserve">адресованное событие, пока адресат не включён в произведение, просто не</w:t>
-      </w:r>
-      <w:r>
-        <w:t xml:space="preserve"> </w:t>
-      </w:r>
-      <w:r>
-        <w:t xml:space="preserve">порождает перехода. Это сняло требование на порядок умножения для</w:t>
-      </w:r>
-      <w:r>
-        <w:t xml:space="preserve"> </w:t>
-      </w:r>
-      <w:r>
-        <w:t xml:space="preserve">автоматов, связанных только через такие события – проверено повторным</w:t>
-      </w:r>
-      <w:r>
-        <w:t xml:space="preserve"> </w:t>
-      </w:r>
-      <w:r>
-        <w:t xml:space="preserve">построением произведения системы из раздела </w:t>
+        <w:t xml:space="preserve">Адресованное событие возникает только в момент</w:t>
+      </w:r>
+      <w:r>
+        <w:t xml:space="preserve"> </w:t>
+      </w:r>
+      <w:r>
+        <w:t xml:space="preserve">перехода автомата-отправителя. Рассматривая его отдельно от этого перехода,</w:t>
+      </w:r>
+      <w:r>
+        <w:t xml:space="preserve"> </w:t>
+      </w:r>
+      <w:r>
+        <w:t xml:space="preserve">алгоритм строил переходы, невозможные в исходной системе. В системе из</w:t>
+      </w:r>
+      <w:r>
+        <w:t xml:space="preserve"> </w:t>
+      </w:r>
+      <w:r>
+        <w:t xml:space="preserve">раздела </w:t>
       </w:r>
       <w:hyperlink w:anchor="sec:system">
         <w:r>
@@ -7671,7 +7314,7 @@
         <w:t xml:space="preserve"> </w:t>
       </w:r>
       <w:r>
-        <w:t xml:space="preserve">с</w:t>
+        <w:t xml:space="preserve">это проявилось при вложении</w:t>
       </w:r>
       <w:r>
         <w:t xml:space="preserve"> </w:t>
@@ -7691,13 +7334,10 @@
         </m:sSub>
       </m:oMath>
       <w:r>
-        <w:t xml:space="preserve">,</w:t>
-      </w:r>
-      <w:r>
-        <w:t xml:space="preserve"> </w:t>
-      </w:r>
-      <w:r>
-        <w:t xml:space="preserve">включённым раньше</w:t>
+        <w:t xml:space="preserve"> </w:t>
+      </w:r>
+      <w:r>
+        <w:t xml:space="preserve">в</w:t>
       </w:r>
       <w:r>
         <w:t xml:space="preserve"> </w:t>
@@ -7717,7 +7357,62 @@
         </m:sSub>
       </m:oMath>
       <w:r>
-        <w:t xml:space="preserve">.</w:t>
+        <w:t xml:space="preserve"> </w:t>
+      </w:r>
+      <w:r>
+        <w:t xml:space="preserve">(случай 4): в произведении возникал переход, в котором</w:t>
+      </w:r>
+      <w:r>
+        <w:t xml:space="preserve"> </w:t>
+      </w:r>
+      <m:oMath>
+        <m:sSub>
+          <m:e>
+            <m:r>
+              <m:t>A</m:t>
+            </m:r>
+          </m:e>
+          <m:sub>
+            <m:r>
+              <m:t>4</m:t>
+            </m:r>
+          </m:sub>
+        </m:sSub>
+      </m:oMath>
+      <w:r>
+        <w:t xml:space="preserve"> </w:t>
+      </w:r>
+      <w:r>
+        <w:t xml:space="preserve">проигрывал туш</w:t>
+      </w:r>
+      <w:r>
+        <w:t xml:space="preserve"> </w:t>
+      </w:r>
+      <w:r>
+        <w:t xml:space="preserve">джекпота, а</w:t>
+      </w:r>
+      <w:r>
+        <w:t xml:space="preserve"> </w:t>
+      </w:r>
+      <m:oMath>
+        <m:sSub>
+          <m:e>
+            <m:r>
+              <m:t>A</m:t>
+            </m:r>
+          </m:e>
+          <m:sub>
+            <m:r>
+              <m:t>3</m:t>
+            </m:r>
+          </m:sub>
+        </m:sSub>
+      </m:oMath>
+      <w:r>
+        <w:t xml:space="preserve"> </w:t>
+      </w:r>
+      <w:r>
+        <w:t xml:space="preserve">не выходил из состояния «Выплата джекпота».</w:t>
       </w:r>
     </w:p>
     <w:p>
@@ -7725,19 +7420,127 @@
         <w:pStyle w:val="BodyText"/>
       </w:pPr>
       <w:r>
-        <w:t xml:space="preserve">Для гвардов это требование сохраняется: эксперимент показывает, что при</w:t>
-      </w:r>
-      <w:r>
-        <w:t xml:space="preserve"> </w:t>
-      </w:r>
-      <w:r>
-        <w:t xml:space="preserve">его нарушении результат умножения может не совпадать с поведением исходной</w:t>
-      </w:r>
-      <w:r>
-        <w:t xml:space="preserve"> </w:t>
-      </w:r>
-      <w:r>
-        <w:t xml:space="preserve">системы автоматов – например, при умножении в порядке</w:t>
+        <w:rPr>
+          <w:bCs/>
+          <w:b/>
+        </w:rPr>
+        <w:t xml:space="preserve">Как исправили.</w:t>
+      </w:r>
+      <w:r>
+        <w:t xml:space="preserve"> </w:t>
+      </w:r>
+      <w:r>
+        <w:t xml:space="preserve">Вложенный автомат реагирует на событие</w:t>
+      </w:r>
+      <w:r>
+        <w:t xml:space="preserve"> </w:t>
+      </w:r>
+      <w:r>
+        <w:t xml:space="preserve">самостоятельно, только если это событие объявлено событием среды хотя бы в</w:t>
+      </w:r>
+      <w:r>
+        <w:t xml:space="preserve"> </w:t>
+      </w:r>
+      <w:r>
+        <w:t xml:space="preserve">одном из автоматов, уже включённых в произведение. Адресованное событие</w:t>
+      </w:r>
+      <w:r>
+        <w:t xml:space="preserve"> </w:t>
+      </w:r>
+      <w:r>
+        <w:t xml:space="preserve">поступает вложенному автомату только в момент перехода</w:t>
+      </w:r>
+      <w:r>
+        <w:t xml:space="preserve"> </w:t>
+      </w:r>
+      <w:r>
+        <w:t xml:space="preserve">автомата-отправителя.</w:t>
+      </w:r>
+    </w:p>
+    <w:bookmarkEnd w:id="45"/>
+    <w:bookmarkStart w:id="46" w:name="замечание-о-порядке-умножения"/>
+    <w:p>
+      <w:pPr>
+        <w:pStyle w:val="Heading2"/>
+      </w:pPr>
+      <w:r>
+        <w:t xml:space="preserve">Замечание о порядке умножения</w:t>
+      </w:r>
+    </w:p>
+    <w:p>
+      <w:pPr>
+        <w:pStyle w:val="FirstParagraph"/>
+      </w:pPr>
+      <w:r>
+        <w:t xml:space="preserve">Если гвард автомата</w:t>
+      </w:r>
+      <w:r>
+        <w:t xml:space="preserve"> </w:t>
+      </w:r>
+      <m:oMath>
+        <m:r>
+          <m:t>Y</m:t>
+        </m:r>
+      </m:oMath>
+      <w:r>
+        <w:t xml:space="preserve"> </w:t>
+      </w:r>
+      <w:r>
+        <w:t xml:space="preserve">ссылается на состояние автомата</w:t>
+      </w:r>
+      <w:r>
+        <w:t xml:space="preserve"> </w:t>
+      </w:r>
+      <m:oMath>
+        <m:r>
+          <m:t>X</m:t>
+        </m:r>
+      </m:oMath>
+      <w:r>
+        <w:t xml:space="preserve">, то</w:t>
+      </w:r>
+      <w:r>
+        <w:t xml:space="preserve"> </w:t>
+      </w:r>
+      <m:oMath>
+        <m:r>
+          <m:t>X</m:t>
+        </m:r>
+      </m:oMath>
+      <w:r>
+        <w:t xml:space="preserve"> </w:t>
+      </w:r>
+      <w:r>
+        <w:t xml:space="preserve">должен</w:t>
+      </w:r>
+      <w:r>
+        <w:t xml:space="preserve"> </w:t>
+      </w:r>
+      <w:r>
+        <w:t xml:space="preserve">быть включён в произведение не позднее</w:t>
+      </w:r>
+      <w:r>
+        <w:t xml:space="preserve"> </w:t>
+      </w:r>
+      <m:oMath>
+        <m:r>
+          <m:t>Y</m:t>
+        </m:r>
+      </m:oMath>
+      <w:r>
+        <w:t xml:space="preserve">. При нарушении этого требования</w:t>
+      </w:r>
+      <w:r>
+        <w:t xml:space="preserve"> </w:t>
+      </w:r>
+      <w:r>
+        <w:t xml:space="preserve">результат умножения может не совпадать с поведением исходной системы: так</w:t>
+      </w:r>
+      <w:r>
+        <w:t xml:space="preserve"> </w:t>
+      </w:r>
+      <w:r>
+        <w:t xml:space="preserve">происходит, например, при умножении в порядке</w:t>
       </w:r>
       <w:r>
         <w:t xml:space="preserve"> </w:t>
@@ -7797,7 +7600,13 @@
         </m:sSub>
       </m:oMath>
       <w:r>
-        <w:t xml:space="preserve">, где</w:t>
+        <w:t xml:space="preserve">,</w:t>
+      </w:r>
+      <w:r>
+        <w:t xml:space="preserve"> </w:t>
+      </w:r>
+      <w:r>
+        <w:t xml:space="preserve">поскольку</w:t>
       </w:r>
       <w:r>
         <w:t xml:space="preserve"> </w:t>
@@ -7840,19 +7649,179 @@
         </m:sSub>
       </m:oMath>
       <w:r>
-        <w:t xml:space="preserve">. Снятие этого требования</w:t>
-      </w:r>
-      <w:r>
-        <w:t xml:space="preserve"> </w:t>
-      </w:r>
-      <w:r>
-        <w:t xml:space="preserve">в общем случае и точная характеризация допустимых порядков умножения</w:t>
-      </w:r>
-      <w:r>
-        <w:t xml:space="preserve"> </w:t>
-      </w:r>
-      <w:r>
-        <w:t xml:space="preserve">остаются предметом дальнейшей работы.</w:t>
+        <w:t xml:space="preserve">.</w:t>
+      </w:r>
+    </w:p>
+    <w:p>
+      <w:pPr>
+        <w:pStyle w:val="BodyText"/>
+      </w:pPr>
+      <w:r>
+        <w:t xml:space="preserve">Для адресованных событий аналогичное требование снято. Ранее, если</w:t>
+      </w:r>
+      <w:r>
+        <w:t xml:space="preserve"> </w:t>
+      </w:r>
+      <w:r>
+        <w:t xml:space="preserve">отправитель адресованного события ещё не был включён в произведение,</w:t>
+      </w:r>
+      <w:r>
+        <w:t xml:space="preserve"> </w:t>
+      </w:r>
+      <w:r>
+        <w:t xml:space="preserve">получатель реагировал на это событие так, будто оно может возникнуть в</w:t>
+      </w:r>
+      <w:r>
+        <w:t xml:space="preserve"> </w:t>
+      </w:r>
+      <w:r>
+        <w:t xml:space="preserve">любой момент, что порождало лишние состояния. Теперь получатель не</w:t>
+      </w:r>
+      <w:r>
+        <w:t xml:space="preserve"> </w:t>
+      </w:r>
+      <w:r>
+        <w:t xml:space="preserve">реагирует на такое событие, пока отправитель не включён в произведение.</w:t>
+      </w:r>
+      <w:r>
+        <w:t xml:space="preserve"> </w:t>
+      </w:r>
+      <w:r>
+        <w:t xml:space="preserve">Это проверено построением произведения системы из</w:t>
+      </w:r>
+      <w:r>
+        <w:t xml:space="preserve"> </w:t>
+      </w:r>
+      <w:r>
+        <w:t xml:space="preserve">раздела </w:t>
+      </w:r>
+      <w:hyperlink w:anchor="sec:system">
+        <w:r>
+          <w:rPr>
+            <w:rStyle w:val="Hyperlink"/>
+          </w:rPr>
+          <w:t xml:space="preserve">2</w:t>
+        </w:r>
+      </w:hyperlink>
+      <w:r>
+        <w:t xml:space="preserve"> </w:t>
+      </w:r>
+      <w:r>
+        <w:t xml:space="preserve">в порядке</w:t>
+      </w:r>
+      <w:r>
+        <w:t xml:space="preserve"> </w:t>
+      </w:r>
+      <m:oMath>
+        <m:sSub>
+          <m:e>
+            <m:r>
+              <m:t>A</m:t>
+            </m:r>
+          </m:e>
+          <m:sub>
+            <m:r>
+              <m:t>0</m:t>
+            </m:r>
+          </m:sub>
+        </m:sSub>
+      </m:oMath>
+      <w:r>
+        <w:t xml:space="preserve">,</w:t>
+      </w:r>
+      <w:r>
+        <w:t xml:space="preserve"> </w:t>
+      </w:r>
+      <m:oMath>
+        <m:sSub>
+          <m:e>
+            <m:r>
+              <m:t>A</m:t>
+            </m:r>
+          </m:e>
+          <m:sub>
+            <m:r>
+              <m:t>1</m:t>
+            </m:r>
+          </m:sub>
+        </m:sSub>
+      </m:oMath>
+      <w:r>
+        <w:t xml:space="preserve">,</w:t>
+      </w:r>
+      <w:r>
+        <w:t xml:space="preserve"> </w:t>
+      </w:r>
+      <m:oMath>
+        <m:sSub>
+          <m:e>
+            <m:r>
+              <m:t>A</m:t>
+            </m:r>
+          </m:e>
+          <m:sub>
+            <m:r>
+              <m:t>2</m:t>
+            </m:r>
+          </m:sub>
+        </m:sSub>
+      </m:oMath>
+      <w:r>
+        <w:t xml:space="preserve">,</w:t>
+      </w:r>
+      <w:r>
+        <w:t xml:space="preserve"> </w:t>
+      </w:r>
+      <m:oMath>
+        <m:sSub>
+          <m:e>
+            <m:r>
+              <m:t>A</m:t>
+            </m:r>
+          </m:e>
+          <m:sub>
+            <m:r>
+              <m:t>4</m:t>
+            </m:r>
+          </m:sub>
+        </m:sSub>
+      </m:oMath>
+      <w:r>
+        <w:t xml:space="preserve">,</w:t>
+      </w:r>
+      <w:r>
+        <w:t xml:space="preserve"> </w:t>
+      </w:r>
+      <m:oMath>
+        <m:sSub>
+          <m:e>
+            <m:r>
+              <m:t>A</m:t>
+            </m:r>
+          </m:e>
+          <m:sub>
+            <m:r>
+              <m:t>3</m:t>
+            </m:r>
+          </m:sub>
+        </m:sSub>
+      </m:oMath>
+      <w:r>
+        <w:t xml:space="preserve">.</w:t>
+      </w:r>
+    </w:p>
+    <w:p>
+      <w:pPr>
+        <w:pStyle w:val="BodyText"/>
+      </w:pPr>
+      <w:r>
+        <w:t xml:space="preserve">Снятие требования для гвардов и описание всех допустимых порядков</w:t>
+      </w:r>
+      <w:r>
+        <w:t xml:space="preserve"> </w:t>
+      </w:r>
+      <w:r>
+        <w:t xml:space="preserve">умножения остаются предметом дальнейшей работы.</w:t>
       </w:r>
     </w:p>
     <w:bookmarkEnd w:id="46"/>
@@ -7870,7 +7839,31 @@
         <w:pStyle w:val="FirstParagraph"/>
       </w:pPr>
       <w:r>
-        <w:t xml:space="preserve">Автомат</w:t>
+        <w:t xml:space="preserve">Вложенность проверяется по состоянию родительского автомата до перехода.</w:t>
+      </w:r>
+      <w:r>
+        <w:t xml:space="preserve"> </w:t>
+      </w:r>
+      <w:r>
+        <w:t xml:space="preserve">Поэтому автомат, вложенный в целевое состояние перехода, не реагирует на</w:t>
+      </w:r>
+      <w:r>
+        <w:t xml:space="preserve"> </w:t>
+      </w:r>
+      <w:r>
+        <w:t xml:space="preserve">событие, вызвавшее этот переход, и начинает реагировать лишь на</w:t>
+      </w:r>
+      <w:r>
+        <w:t xml:space="preserve"> </w:t>
+      </w:r>
+      <w:r>
+        <w:t xml:space="preserve">последующие события. Если реакция нужна в момент входа в состояние, её</w:t>
+      </w:r>
+      <w:r>
+        <w:t xml:space="preserve"> </w:t>
+      </w:r>
+      <w:r>
+        <w:t xml:space="preserve">передают адресованным событием: так</w:t>
       </w:r>
       <w:r>
         <w:t xml:space="preserve"> </w:t>
@@ -7884,7 +7877,7 @@
           </m:e>
           <m:sub>
             <m:r>
-              <m:t>4</m:t>
+              <m:t>0</m:t>
             </m:r>
           </m:sub>
         </m:sSub>
@@ -7893,13 +7886,13 @@
         <w:t xml:space="preserve"> </w:t>
       </w:r>
       <w:r>
-        <w:t xml:space="preserve">реагирует на завершение выплаты джекпота, а не на переход,</w:t>
-      </w:r>
-      <w:r>
-        <w:t xml:space="preserve"> </w:t>
-      </w:r>
-      <w:r>
-        <w:t xml:space="preserve">которым</w:t>
+        <w:t xml:space="preserve">при входе в состояние «Игра»</w:t>
+      </w:r>
+      <w:r>
+        <w:t xml:space="preserve"> </w:t>
+      </w:r>
+      <w:r>
+        <w:t xml:space="preserve">адресует автомату</w:t>
       </w:r>
       <w:r>
         <w:t xml:space="preserve"> </w:t>
@@ -7913,7 +7906,7 @@
           </m:e>
           <m:sub>
             <m:r>
-              <m:t>3</m:t>
+              <m:t>2</m:t>
             </m:r>
           </m:sub>
         </m:sSub>
@@ -7922,77 +7915,46 @@
         <w:t xml:space="preserve"> </w:t>
       </w:r>
       <w:r>
-        <w:t xml:space="preserve">входит в состояние «Выплата джекпота» (объявление</w:t>
-      </w:r>
-      <w:r>
-        <w:t xml:space="preserve"> </w:t>
-      </w:r>
-      <w:r>
-        <w:t xml:space="preserve">выигрыша). Причина – в ограничении алгоритма: вложенность автомата в</w:t>
-      </w:r>
-      <w:r>
-        <w:t xml:space="preserve"> </w:t>
-      </w:r>
-      <w:r>
-        <w:t xml:space="preserve">текущее состояние проверяется</w:t>
+        <w:t xml:space="preserve">событие</w:t>
       </w:r>
       <w:r>
         <w:t xml:space="preserve"> </w:t>
       </w:r>
       <w:r>
         <w:rPr>
-          <w:iCs/>
-          <w:i/>
+          <w:rStyle w:val="VerbatimChar"/>
         </w:rPr>
-        <w:t xml:space="preserve">до</w:t>
-      </w:r>
-      <w:r>
-        <w:t xml:space="preserve"> </w:t>
-      </w:r>
-      <w:r>
-        <w:t xml:space="preserve">перехода, поэтому автомат,</w:t>
-      </w:r>
-      <w:r>
-        <w:t xml:space="preserve"> </w:t>
-      </w:r>
-      <w:r>
-        <w:t xml:space="preserve">вложенный только в целевое состояние перехода, не может среагировать на</w:t>
-      </w:r>
-      <w:r>
-        <w:t xml:space="preserve"> </w:t>
-      </w:r>
-      <w:r>
-        <w:t xml:space="preserve">событие перехода – лишь на последующие события, когда родитель уже</w:t>
-      </w:r>
-      <w:r>
-        <w:t xml:space="preserve"> </w:t>
-      </w:r>
-      <w:r>
-        <w:t xml:space="preserve">в этом состоянии. Снятие ограничения потребовало бы определять целевое</w:t>
-      </w:r>
-      <w:r>
-        <w:t xml:space="preserve"> </w:t>
-      </w:r>
-      <w:r>
-        <w:t xml:space="preserve">состояние перехода и опрашивать вложенные в него автоматы ещё до того, как</w:t>
-      </w:r>
-      <w:r>
-        <w:t xml:space="preserve"> </w:t>
-      </w:r>
-      <w:r>
-        <w:t xml:space="preserve">построитель произведения это состояние определит, что требует</w:t>
-      </w:r>
-      <w:r>
-        <w:t xml:space="preserve"> </w:t>
-      </w:r>
-      <w:r>
-        <w:t xml:space="preserve">существенного изменения архитектуры алгоритма. Это остаётся предметом</w:t>
-      </w:r>
-      <w:r>
-        <w:t xml:space="preserve"> </w:t>
-      </w:r>
-      <w:r>
-        <w:t xml:space="preserve">дальнейшей работы.</w:t>
+        <w:t xml:space="preserve">e0</w:t>
+      </w:r>
+      <w:r>
+        <w:t xml:space="preserve"> </w:t>
+      </w:r>
+      <w:r>
+        <w:t xml:space="preserve">(«Начало игры»). Чтобы снять</w:t>
+      </w:r>
+      <w:r>
+        <w:t xml:space="preserve"> </w:t>
+      </w:r>
+      <w:r>
+        <w:t xml:space="preserve">это ограничение, алгоритм должен опрашивать автоматы, вложенные в целевое</w:t>
+      </w:r>
+      <w:r>
+        <w:t xml:space="preserve"> </w:t>
+      </w:r>
+      <w:r>
+        <w:t xml:space="preserve">состояние, ещё до построения этого состояния, что требует существенного</w:t>
+      </w:r>
+      <w:r>
+        <w:t xml:space="preserve"> </w:t>
+      </w:r>
+      <w:r>
+        <w:t xml:space="preserve">изменения архитектуры алгоритма. Эта задача остаётся предметом дальнейшей</w:t>
+      </w:r>
+      <w:r>
+        <w:t xml:space="preserve"> </w:t>
+      </w:r>
+      <w:r>
+        <w:t xml:space="preserve">работы.</w:t>
       </w:r>
     </w:p>
     <w:bookmarkEnd w:id="47"/>
@@ -8153,25 +8115,19 @@
         <w:t xml:space="preserve"> </w:t>
       </w:r>
       <w:r>
-        <w:t xml:space="preserve">(9 состояний). Название</w:t>
-      </w:r>
-      <w:r>
-        <w:t xml:space="preserve"> </w:t>
-      </w:r>
-      <w:r>
-        <w:t xml:space="preserve">каждого составного состояния выбрано авторами так, чтобы диаграмму было</w:t>
-      </w:r>
-      <w:r>
-        <w:t xml:space="preserve"> </w:t>
-      </w:r>
-      <w:r>
-        <w:t xml:space="preserve">легче читать; полное соответствие номера состояния всем пяти исходным</w:t>
-      </w:r>
-      <w:r>
-        <w:t xml:space="preserve"> </w:t>
-      </w:r>
-      <w:r>
-        <w:t xml:space="preserve">состояниям приведено в примечании ниже.</w:t>
+        <w:t xml:space="preserve">(9 состояний). Состояния</w:t>
+      </w:r>
+      <w:r>
+        <w:t xml:space="preserve"> </w:t>
+      </w:r>
+      <w:r>
+        <w:t xml:space="preserve">подписаны сокращёнными названиями; соответствие каждого состояния</w:t>
+      </w:r>
+      <w:r>
+        <w:t xml:space="preserve"> </w:t>
+      </w:r>
+      <w:r>
+        <w:t xml:space="preserve">исходным состояниям пяти автоматов приведено ниже.</w:t>
       </w:r>
     </w:p>
     <w:p>
@@ -10002,85 +9958,49 @@
         <w:pStyle w:val="FirstParagraph"/>
       </w:pPr>
       <w:r>
-        <w:t xml:space="preserve">Предложенная доработка алгоритма умножения снимает все три ограничения</w:t>
-      </w:r>
-      <w:r>
-        <w:t xml:space="preserve"> </w:t>
-      </w:r>
-      <w:r>
-        <w:t xml:space="preserve">предыдущей работы: состояние произведения может содержать произвольное</w:t>
-      </w:r>
-      <w:r>
-        <w:t xml:space="preserve"> </w:t>
-      </w:r>
-      <w:r>
-        <w:t xml:space="preserve">число вложенных автоматов (ограничение 1), один и тот же автомат может</w:t>
-      </w:r>
-      <w:r>
-        <w:t xml:space="preserve"> </w:t>
-      </w:r>
-      <w:r>
-        <w:t xml:space="preserve">быть вложен в произвольное число состояний (ограничение 2), и вложенные</w:t>
-      </w:r>
-      <w:r>
-        <w:t xml:space="preserve"> </w:t>
-      </w:r>
-      <w:r>
-        <w:t xml:space="preserve">автоматы может содержать любой из пары перемножаемых автоматов, а не</w:t>
-      </w:r>
-      <w:r>
-        <w:t xml:space="preserve"> </w:t>
-      </w:r>
-      <w:r>
-        <w:t xml:space="preserve">только один из них (ограничение 3), что в совокупности позволяет строить</w:t>
-      </w:r>
-      <w:r>
-        <w:t xml:space="preserve"> </w:t>
-      </w:r>
-      <w:r>
-        <w:t xml:space="preserve">цепочки вложенности произвольной глубины. Дополнительно устранена</w:t>
-      </w:r>
-      <w:r>
-        <w:t xml:space="preserve"> </w:t>
-      </w:r>
-      <w:r>
-        <w:t xml:space="preserve">обнаруженная при построении случая 4 ошибка, из-за которой вложенность</w:t>
-      </w:r>
-      <w:r>
-        <w:t xml:space="preserve"> </w:t>
-      </w:r>
-      <w:r>
-        <w:t xml:space="preserve">могла сделать ошибочно независимо достижимым событие, не являющееся</w:t>
-      </w:r>
-      <w:r>
-        <w:t xml:space="preserve"> </w:t>
-      </w:r>
-      <w:r>
-        <w:t xml:space="preserve">настоящим событием среды, а существующее только как часть перехода другого</w:t>
-      </w:r>
-      <w:r>
-        <w:t xml:space="preserve"> </w:t>
-      </w:r>
-      <w:r>
-        <w:t xml:space="preserve">автомата (доработка 3). Порядок умножения автоматов в цепочке при этом не</w:t>
-      </w:r>
-      <w:r>
-        <w:t xml:space="preserve"> </w:t>
-      </w:r>
-      <w:r>
-        <w:t xml:space="preserve">произволен: он должен быть согласован с отношением опоры на внутреннее</w:t>
-      </w:r>
-      <w:r>
-        <w:t xml:space="preserve"> </w:t>
-      </w:r>
-      <w:r>
-        <w:t xml:space="preserve">состояние между автоматами, а для реакций на адресованные события такое</w:t>
-      </w:r>
-      <w:r>
-        <w:t xml:space="preserve"> </w:t>
-      </w:r>
-      <w:r>
-        <w:t xml:space="preserve">согласование более не требуется.</w:t>
+        <w:t xml:space="preserve">Предложенные доработки снимают три ограничения предыдущей работы: в</w:t>
+      </w:r>
+      <w:r>
+        <w:t xml:space="preserve"> </w:t>
+      </w:r>
+      <w:r>
+        <w:t xml:space="preserve">состояние может быть вложено несколько автоматов (ограничение 1), автомат</w:t>
+      </w:r>
+      <w:r>
+        <w:t xml:space="preserve"> </w:t>
+      </w:r>
+      <w:r>
+        <w:t xml:space="preserve">может быть вложен в несколько состояний (ограничение 2), и вложенные</w:t>
+      </w:r>
+      <w:r>
+        <w:t xml:space="preserve"> </w:t>
+      </w:r>
+      <w:r>
+        <w:t xml:space="preserve">автоматы могут содержать оба перемножаемых автомата (ограничение 3), что</w:t>
+      </w:r>
+      <w:r>
+        <w:t xml:space="preserve"> </w:t>
+      </w:r>
+      <w:r>
+        <w:t xml:space="preserve">позволяет строить цепочки вложенности произвольной глубины. Кроме того,</w:t>
+      </w:r>
+      <w:r>
+        <w:t xml:space="preserve"> </w:t>
+      </w:r>
+      <w:r>
+        <w:t xml:space="preserve">устранена ошибка, при которой вложенный автомат мог реагировать на</w:t>
+      </w:r>
+      <w:r>
+        <w:t xml:space="preserve"> </w:t>
+      </w:r>
+      <w:r>
+        <w:t xml:space="preserve">адресованное событие отдельно от перехода автомата-отправителя</w:t>
+      </w:r>
+      <w:r>
+        <w:t xml:space="preserve"> </w:t>
+      </w:r>
+      <w:r>
+        <w:t xml:space="preserve">(доработка 3).</w:t>
       </w:r>
     </w:p>
     <w:p>
@@ -10088,13 +10008,39 @@
         <w:pStyle w:val="BodyText"/>
       </w:pPr>
       <w:r>
-        <w:t xml:space="preserve">На модели «игровой автомат» снятие ограничений 2 и 3 не потребовало новых</w:t>
-      </w:r>
-      <w:r>
-        <w:t xml:space="preserve"> </w:t>
-      </w:r>
-      <w:r>
-        <w:t xml:space="preserve">автоматов:</w:t>
+        <w:t xml:space="preserve">Порядок умножения остаётся существенным для гвардов: автомат, на состояние</w:t>
+      </w:r>
+      <w:r>
+        <w:t xml:space="preserve"> </w:t>
+      </w:r>
+      <w:r>
+        <w:t xml:space="preserve">которого ссылается гвард, должен быть включён в произведение не позднее</w:t>
+      </w:r>
+      <w:r>
+        <w:t xml:space="preserve"> </w:t>
+      </w:r>
+      <w:r>
+        <w:t xml:space="preserve">автомата, содержащего этот гвард. Для адресованных событий это требование</w:t>
+      </w:r>
+      <w:r>
+        <w:t xml:space="preserve"> </w:t>
+      </w:r>
+      <w:r>
+        <w:t xml:space="preserve">снято.</w:t>
+      </w:r>
+    </w:p>
+    <w:p>
+      <w:pPr>
+        <w:pStyle w:val="BodyText"/>
+      </w:pPr>
+      <w:r>
+        <w:t xml:space="preserve">Итоговое произведение пяти автоматов содержит 9 состояний – столько же,</w:t>
+      </w:r>
+      <w:r>
+        <w:t xml:space="preserve"> </w:t>
+      </w:r>
+      <w:r>
+        <w:t xml:space="preserve">сколько произведение первых четырёх:</w:t>
       </w:r>
       <w:r>
         <w:t xml:space="preserve"> </w:t>
@@ -10117,19 +10063,13 @@
         <w:t xml:space="preserve"> </w:t>
       </w:r>
       <w:r>
-        <w:t xml:space="preserve">остался автоматом без памяти, поэтому его дополнительные</w:t>
-      </w:r>
-      <w:r>
-        <w:t xml:space="preserve"> </w:t>
-      </w:r>
-      <w:r>
-        <w:t xml:space="preserve">места вложения не увеличили число состояний итогового произведения –</w:t>
-      </w:r>
-      <w:r>
-        <w:t xml:space="preserve"> </w:t>
-      </w:r>
-      <w:r>
-        <w:t xml:space="preserve">оно осталось равным 9.</w:t>
+        <w:t xml:space="preserve">имеет одно состояние, поэтому</w:t>
+      </w:r>
+      <w:r>
+        <w:t xml:space="preserve"> </w:t>
+      </w:r>
+      <w:r>
+        <w:t xml:space="preserve">его вложение в три состояния не увеличивает число состояний произведения.</w:t>
       </w:r>
     </w:p>
     <w:bookmarkEnd w:id="53"/>

</xml_diff>

<commit_message>
Diagrams: list only by-nesting events in nested boxes
Addressed events (shown as A(e) on the parent's transition or state) are
no longer listed inside nested boxes; a box with no by-nesting events
shows a dash. The rule is stated in the generator and in the article's
notation paragraph.

Co-Authored-By: Claude Opus 5.5 <noreply@anthropic.com>
Claude-Session: https://claude.ai/code/session_01Dbk9FbN51LJL1bcmGw4FBj
</commit_message>
<xml_diff>
--- a/articles/multiply_many_nested/article.docx
+++ b/articles/multiply_many_nested/article.docx
@@ -1095,6 +1095,88 @@
       </w:tr>
     </w:tbl>
     <w:bookmarkEnd w:id="21"/>
+    <w:p>
+      <w:pPr>
+        <w:pStyle w:val="BodyText"/>
+      </w:pPr>
+      <w:r>
+        <w:t xml:space="preserve">На диаграммах состояний над чертой на переходе указаны входное событие и</w:t>
+      </w:r>
+      <w:r>
+        <w:t xml:space="preserve"> </w:t>
+      </w:r>
+      <w:r>
+        <w:t xml:space="preserve">гварды, под чертой – выходы; адресованное событие записывается в виде</w:t>
+      </w:r>
+      <w:r>
+        <w:t xml:space="preserve"> </w:t>
+      </w:r>
+      <m:oMath>
+        <m:r>
+          <m:t>A</m:t>
+        </m:r>
+        <m:d>
+          <m:dPr>
+            <m:begChr m:val="("/>
+            <m:endChr m:val=")"/>
+            <m:sepChr m:val=""/>
+            <m:grow/>
+          </m:dPr>
+          <m:e>
+            <m:r>
+              <m:t>e</m:t>
+            </m:r>
+          </m:e>
+        </m:d>
+      </m:oMath>
+      <w:r>
+        <w:t xml:space="preserve">, где</w:t>
+      </w:r>
+      <w:r>
+        <w:t xml:space="preserve"> </w:t>
+      </w:r>
+      <m:oMath>
+        <m:r>
+          <m:t>A</m:t>
+        </m:r>
+      </m:oMath>
+      <w:r>
+        <w:t xml:space="preserve"> </w:t>
+      </w:r>
+      <w:r>
+        <w:t xml:space="preserve">– автомат-получатель. Вложенный автомат изображается</w:t>
+      </w:r>
+      <w:r>
+        <w:t xml:space="preserve"> </w:t>
+      </w:r>
+      <w:r>
+        <w:t xml:space="preserve">блоком внутри состояния родительского автомата. В блоке перечислены только</w:t>
+      </w:r>
+      <w:r>
+        <w:t xml:space="preserve"> </w:t>
+      </w:r>
+      <w:r>
+        <w:t xml:space="preserve">события, на которые вложенный автомат реагирует в силу вложенности, пока</w:t>
+      </w:r>
+      <w:r>
+        <w:t xml:space="preserve"> </w:t>
+      </w:r>
+      <w:r>
+        <w:t xml:space="preserve">родительский автомат находится в этом состоянии. Адресованные события в</w:t>
+      </w:r>
+      <w:r>
+        <w:t xml:space="preserve"> </w:t>
+      </w:r>
+      <w:r>
+        <w:t xml:space="preserve">блок не включаются: они указаны на переходе или в состоянии родительского</w:t>
+      </w:r>
+      <w:r>
+        <w:t xml:space="preserve"> </w:t>
+      </w:r>
+      <w:r>
+        <w:t xml:space="preserve">автомата. Если таких событий нет, в блоке стоит прочерк.</w:t>
+      </w:r>
+    </w:p>
     <w:bookmarkStart w:id="25" w:name="автомат-1.-игровая-машина-a_0"/>
     <w:p>
       <w:pPr>

</xml_diff>

<commit_message>
Deliver addressed events to automata nested in the recipient's state
A4 now hears e33 by being nested in A3's "Выплата джекпота" instead of
A3 calling A4(e40) on its exit transition. An addressed event goes to its
recipient and then to the automata nested in the recipient's state before
the transition, both in the reference model and in the multiplier: if
such a nested automaton is not yet in the product, the product transition
keeps a pending marker that is resolved when it joins. This requires the
nested automaton to be multiplied after its parent (documented as
Доработка 4 and in the order note).

Pins tables no longer list events a sibling receives through nesting as
outputs of the parent; only addressed events and guard-queried states are.

Co-Authored-By: Claude Opus 5.5 <noreply@anthropic.com>
Claude-Session: https://claude.ai/code/session_01Dbk9FbN51LJL1bcmGw4FBj
</commit_message>
<xml_diff>
--- a/articles/multiply_many_nested/article.docx
+++ b/articles/multiply_many_nested/article.docx
@@ -387,6 +387,30 @@
       </w:r>
       <w:r>
         <w:t xml:space="preserve">когда родительский автомат находится в состоянии, в которое он вложен.</w:t>
+      </w:r>
+      <w:r>
+        <w:t xml:space="preserve"> </w:t>
+      </w:r>
+      <w:r>
+        <w:t xml:space="preserve">Через вложенность автомат получает события среды, а также события,</w:t>
+      </w:r>
+      <w:r>
+        <w:t xml:space="preserve"> </w:t>
+      </w:r>
+      <w:r>
+        <w:t xml:space="preserve">адресованные родительскому автомату: такое событие поступает</w:t>
+      </w:r>
+      <w:r>
+        <w:t xml:space="preserve"> </w:t>
+      </w:r>
+      <w:r>
+        <w:t xml:space="preserve">получателю и автоматам, вложенным в состояние, в котором получатель</w:t>
+      </w:r>
+      <w:r>
+        <w:t xml:space="preserve"> </w:t>
+      </w:r>
+      <w:r>
+        <w:t xml:space="preserve">находился до перехода.</w:t>
       </w:r>
     </w:p>
     <w:p>
@@ -1162,19 +1186,25 @@
         <w:t xml:space="preserve"> </w:t>
       </w:r>
       <w:r>
-        <w:t xml:space="preserve">родительский автомат находится в этом состоянии. Адресованные события в</w:t>
-      </w:r>
-      <w:r>
-        <w:t xml:space="preserve"> </w:t>
-      </w:r>
-      <w:r>
-        <w:t xml:space="preserve">блок не включаются: они указаны на переходе или в состоянии родительского</w:t>
-      </w:r>
-      <w:r>
-        <w:t xml:space="preserve"> </w:t>
-      </w:r>
-      <w:r>
-        <w:t xml:space="preserve">автомата. Если таких событий нет, в блоке стоит прочерк.</w:t>
+        <w:t xml:space="preserve">родительский автомат находится в этом состоянии. События, адресованные</w:t>
+      </w:r>
+      <w:r>
+        <w:t xml:space="preserve"> </w:t>
+      </w:r>
+      <w:r>
+        <w:t xml:space="preserve">самому вложенному автомату, в блок не включаются: они указаны на переходе</w:t>
+      </w:r>
+      <w:r>
+        <w:t xml:space="preserve"> </w:t>
+      </w:r>
+      <w:r>
+        <w:t xml:space="preserve">или в состоянии родительского автомата. Если таких событий нет, в блоке</w:t>
+      </w:r>
+      <w:r>
+        <w:t xml:space="preserve"> </w:t>
+      </w:r>
+      <w:r>
+        <w:t xml:space="preserve">стоит прочерк.</w:t>
       </w:r>
     </w:p>
     <w:bookmarkStart w:id="25" w:name="автомат-1.-игровая-машина-a_0"/>
@@ -1559,9 +1589,7 @@
           </w:p>
         </w:tc>
         <w:tc>
-          <w:tcPr>
-            <w:vMerge w:val="restart"/>
-          </w:tcPr>
+          <w:tcPr/>
           <w:p>
             <w:pPr>
               <w:pStyle w:val="Compact"/>
@@ -1621,22 +1649,38 @@
               <w:rPr>
                 <w:rStyle w:val="VerbatimChar"/>
               </w:rPr>
-              <w:t xml:space="preserve">e01</w:t>
-            </w:r>
-          </w:p>
-        </w:tc>
-        <w:tc>
-          <w:tcPr/>
-          <w:p>
-            <w:pPr>
-              <w:pStyle w:val="Compact"/>
-              <w:jc w:val="left"/>
-            </w:pPr>
-            <w:r>
-              <w:t xml:space="preserve">Нажата кнопка &lt;&lt;Игра&gt;&gt;</w:t>
-            </w:r>
-          </w:p>
-        </w:tc>
+              <w:t xml:space="preserve">e02</w:t>
+            </w:r>
+          </w:p>
+        </w:tc>
+        <w:tc>
+          <w:tcPr/>
+          <w:p>
+            <w:pPr>
+              <w:pStyle w:val="Compact"/>
+              <w:jc w:val="left"/>
+            </w:pPr>
+            <w:r>
+              <w:t xml:space="preserve">Нажата кнопка &lt;&lt;Возврат&gt;&gt;</w:t>
+            </w:r>
+          </w:p>
+        </w:tc>
+        <w:tc>
+          <w:tcPr>
+            <w:vMerge w:val="restart"/>
+          </w:tcPr>
+          <w:p>
+            <w:pPr>
+              <w:pStyle w:val="Compact"/>
+              <w:jc w:val="left"/>
+            </w:pPr>
+            <w:r>
+              <w:t xml:space="preserve">A1</w:t>
+            </w:r>
+          </w:p>
+        </w:tc>
+      </w:tr>
+      <w:tr>
         <w:tc>
           <w:tcPr>
             <w:gridSpan w:val="1"/>
@@ -1646,6 +1690,69 @@
             <w:pPr/>
           </w:p>
         </w:tc>
+        <w:tc>
+          <w:tcPr/>
+          <w:p>
+            <w:pPr>
+              <w:pStyle w:val="Compact"/>
+              <w:jc w:val="left"/>
+            </w:pPr>
+            <w:r>
+              <w:t xml:space="preserve">Нажата кнопка &lt;&lt;Возврат&gt;&gt;</w:t>
+            </w:r>
+          </w:p>
+        </w:tc>
+        <w:tc>
+          <w:tcPr/>
+          <w:p>
+            <w:pPr>
+              <w:pStyle w:val="Compact"/>
+              <w:jc w:val="left"/>
+            </w:pPr>
+            <w:r>
+              <w:rPr>
+                <w:rStyle w:val="VerbatimChar"/>
+              </w:rPr>
+              <w:t xml:space="preserve">e02</w:t>
+            </w:r>
+          </w:p>
+        </w:tc>
+        <w:tc>
+          <w:tcPr/>
+          <w:p>
+            <w:pPr>
+              <w:pStyle w:val="Compact"/>
+              <w:jc w:val="left"/>
+            </w:pPr>
+            <w:r>
+              <w:rPr>
+                <w:rStyle w:val="VerbatimChar"/>
+              </w:rPr>
+              <w:t xml:space="preserve">e12</w:t>
+            </w:r>
+          </w:p>
+        </w:tc>
+        <w:tc>
+          <w:tcPr/>
+          <w:p>
+            <w:pPr>
+              <w:pStyle w:val="Compact"/>
+              <w:jc w:val="left"/>
+            </w:pPr>
+            <w:r>
+              <w:t xml:space="preserve">Необходимо перевести жетоны в банк</w:t>
+            </w:r>
+          </w:p>
+        </w:tc>
+        <w:tc>
+          <w:tcPr>
+            <w:gridSpan w:val="1"/>
+            <w:vMerge w:val="continue"/>
+          </w:tcPr>
+          <w:p>
+            <w:pPr/>
+          </w:p>
+        </w:tc>
       </w:tr>
       <w:tr>
         <w:tc>
@@ -1665,49 +1772,49 @@
               <w:jc w:val="left"/>
             </w:pPr>
             <w:r>
-              <w:t xml:space="preserve">Нажата кнопка &lt;&lt;Возврат&gt;&gt;</w:t>
-            </w:r>
-          </w:p>
-        </w:tc>
-        <w:tc>
-          <w:tcPr/>
-          <w:p>
-            <w:pPr>
-              <w:pStyle w:val="Compact"/>
-              <w:jc w:val="left"/>
-            </w:pPr>
-            <w:r>
-              <w:rPr>
-                <w:rStyle w:val="VerbatimChar"/>
-              </w:rPr>
-              <w:t xml:space="preserve">e02</w:t>
-            </w:r>
-          </w:p>
-        </w:tc>
-        <w:tc>
-          <w:tcPr/>
-          <w:p>
-            <w:pPr>
-              <w:pStyle w:val="Compact"/>
-              <w:jc w:val="left"/>
-            </w:pPr>
-            <w:r>
-              <w:rPr>
-                <w:rStyle w:val="VerbatimChar"/>
-              </w:rPr>
-              <w:t xml:space="preserve">e05</w:t>
-            </w:r>
-          </w:p>
-        </w:tc>
-        <w:tc>
-          <w:tcPr/>
-          <w:p>
-            <w:pPr>
-              <w:pStyle w:val="Compact"/>
-              <w:jc w:val="left"/>
-            </w:pPr>
-            <w:r>
-              <w:t xml:space="preserve">Сработал таймер третьего барабана</w:t>
+              <w:t xml:space="preserve">Нажата кнопка &lt;&lt;Игра&gt;&gt;</w:t>
+            </w:r>
+          </w:p>
+        </w:tc>
+        <w:tc>
+          <w:tcPr/>
+          <w:p>
+            <w:pPr>
+              <w:pStyle w:val="Compact"/>
+              <w:jc w:val="left"/>
+            </w:pPr>
+            <w:r>
+              <w:rPr>
+                <w:rStyle w:val="VerbatimChar"/>
+              </w:rPr>
+              <w:t xml:space="preserve">e01</w:t>
+            </w:r>
+          </w:p>
+        </w:tc>
+        <w:tc>
+          <w:tcPr/>
+          <w:p>
+            <w:pPr>
+              <w:pStyle w:val="Compact"/>
+              <w:jc w:val="left"/>
+            </w:pPr>
+            <w:r>
+              <w:rPr>
+                <w:rStyle w:val="VerbatimChar"/>
+              </w:rPr>
+              <w:t xml:space="preserve">e14</w:t>
+            </w:r>
+          </w:p>
+        </w:tc>
+        <w:tc>
+          <w:tcPr/>
+          <w:p>
+            <w:pPr>
+              <w:pStyle w:val="Compact"/>
+              <w:jc w:val="left"/>
+            </w:pPr>
+            <w:r>
+              <w:t xml:space="preserve">Открыть монетоприемник</w:t>
             </w:r>
           </w:p>
         </w:tc>
@@ -1739,63 +1846,61 @@
               <w:jc w:val="left"/>
             </w:pPr>
             <w:r>
-              <w:t xml:space="preserve">Нажата кнопка &lt;&lt;Игра&gt;&gt;</w:t>
-            </w:r>
-          </w:p>
-        </w:tc>
-        <w:tc>
-          <w:tcPr/>
-          <w:p>
-            <w:pPr>
-              <w:pStyle w:val="Compact"/>
-              <w:jc w:val="left"/>
-            </w:pPr>
-            <w:r>
-              <w:rPr>
-                <w:rStyle w:val="VerbatimChar"/>
-              </w:rPr>
-              <w:t xml:space="preserve">e01</w:t>
-            </w:r>
-          </w:p>
-        </w:tc>
-        <w:tc>
-          <w:tcPr/>
-          <w:p>
-            <w:pPr>
-              <w:pStyle w:val="Compact"/>
-              <w:jc w:val="left"/>
-            </w:pPr>
-            <w:r>
-              <w:rPr>
-                <w:rStyle w:val="VerbatimChar"/>
-              </w:rPr>
-              <w:t xml:space="preserve">e01</w:t>
-            </w:r>
-          </w:p>
-        </w:tc>
-        <w:tc>
-          <w:tcPr/>
-          <w:p>
-            <w:pPr>
-              <w:pStyle w:val="Compact"/>
-              <w:jc w:val="left"/>
-            </w:pPr>
-            <w:r>
-              <w:t xml:space="preserve">Нажата кнопка &lt;&lt;Игра&gt;&gt;</w:t>
-            </w:r>
-          </w:p>
-        </w:tc>
-        <w:tc>
-          <w:tcPr>
-            <w:vMerge w:val="restart"/>
-          </w:tcPr>
-          <w:p>
-            <w:pPr>
-              <w:pStyle w:val="Compact"/>
-              <w:jc w:val="left"/>
-            </w:pPr>
-            <w:r>
-              <w:t xml:space="preserve">A4</w:t>
+              <w:t xml:space="preserve">Нажата кнопка &lt;&lt;Тех. сброс&gt;&gt;</w:t>
+            </w:r>
+          </w:p>
+        </w:tc>
+        <w:tc>
+          <w:tcPr/>
+          <w:p>
+            <w:pPr>
+              <w:pStyle w:val="Compact"/>
+              <w:jc w:val="left"/>
+            </w:pPr>
+            <w:r>
+              <w:rPr>
+                <w:rStyle w:val="VerbatimChar"/>
+              </w:rPr>
+              <w:t xml:space="preserve">e03</w:t>
+            </w:r>
+          </w:p>
+        </w:tc>
+        <w:tc>
+          <w:tcPr/>
+          <w:p>
+            <w:pPr>
+              <w:pStyle w:val="Compact"/>
+              <w:jc w:val="left"/>
+            </w:pPr>
+            <w:r>
+              <w:rPr>
+                <w:rStyle w:val="VerbatimChar"/>
+              </w:rPr>
+              <w:t xml:space="preserve">e33</w:t>
+            </w:r>
+          </w:p>
+        </w:tc>
+        <w:tc>
+          <w:tcPr/>
+          <w:p>
+            <w:pPr>
+              <w:pStyle w:val="Compact"/>
+              <w:jc w:val="left"/>
+            </w:pPr>
+            <w:r>
+              <w:t xml:space="preserve">Выплата жетонов завершена</w:t>
+            </w:r>
+          </w:p>
+        </w:tc>
+        <w:tc>
+          <w:tcPr/>
+          <w:p>
+            <w:pPr>
+              <w:pStyle w:val="Compact"/>
+              <w:jc w:val="left"/>
+            </w:pPr>
+            <w:r>
+              <w:t xml:space="preserve">A3</w:t>
             </w:r>
           </w:p>
         </w:tc>
@@ -1818,52 +1923,68 @@
               <w:jc w:val="left"/>
             </w:pPr>
             <w:r>
-              <w:t xml:space="preserve">Нажата кнопка &lt;&lt;Тех. сброс&gt;&gt;</w:t>
-            </w:r>
-          </w:p>
-        </w:tc>
-        <w:tc>
-          <w:tcPr/>
-          <w:p>
-            <w:pPr>
-              <w:pStyle w:val="Compact"/>
-              <w:jc w:val="left"/>
-            </w:pPr>
-            <w:r>
-              <w:rPr>
-                <w:rStyle w:val="VerbatimChar"/>
-              </w:rPr>
-              <w:t xml:space="preserve">e03</w:t>
-            </w:r>
-          </w:p>
-        </w:tc>
-        <w:tc>
-          <w:tcPr/>
-          <w:p>
-            <w:pPr>
-              <w:pStyle w:val="Compact"/>
-              <w:jc w:val="left"/>
-            </w:pPr>
-            <w:r>
-              <w:rPr>
-                <w:rStyle w:val="VerbatimChar"/>
-              </w:rPr>
-              <w:t xml:space="preserve">e06</w:t>
-            </w:r>
-          </w:p>
-        </w:tc>
-        <w:tc>
-          <w:tcPr/>
-          <w:p>
-            <w:pPr>
-              <w:pStyle w:val="Compact"/>
-              <w:jc w:val="left"/>
-            </w:pPr>
-            <w:r>
-              <w:t xml:space="preserve">Выдан жетон из банка</w:t>
-            </w:r>
-          </w:p>
-        </w:tc>
+              <w:t xml:space="preserve">Сработал таймер третьего барабана</w:t>
+            </w:r>
+          </w:p>
+        </w:tc>
+        <w:tc>
+          <w:tcPr/>
+          <w:p>
+            <w:pPr>
+              <w:pStyle w:val="Compact"/>
+              <w:jc w:val="left"/>
+            </w:pPr>
+            <w:r>
+              <w:rPr>
+                <w:rStyle w:val="VerbatimChar"/>
+              </w:rPr>
+              <w:t xml:space="preserve">e05</w:t>
+            </w:r>
+          </w:p>
+        </w:tc>
+        <w:tc>
+          <w:tcPr/>
+          <w:p>
+            <w:pPr>
+              <w:pStyle w:val="Compact"/>
+              <w:jc w:val="left"/>
+            </w:pPr>
+            <w:r>
+              <w:rPr>
+                <w:rStyle w:val="VerbatimChar"/>
+              </w:rPr>
+              <w:t xml:space="preserve">y0=2</w:t>
+            </w:r>
+          </w:p>
+        </w:tc>
+        <w:tc>
+          <w:tcPr/>
+          <w:p>
+            <w:pPr>
+              <w:pStyle w:val="Compact"/>
+              <w:jc w:val="left"/>
+            </w:pPr>
+            <w:r>
+              <w:t xml:space="preserve">Игра</w:t>
+            </w:r>
+          </w:p>
+        </w:tc>
+        <w:tc>
+          <w:tcPr>
+            <w:vMerge w:val="restart"/>
+          </w:tcPr>
+          <w:p>
+            <w:pPr>
+              <w:pStyle w:val="Compact"/>
+              <w:jc w:val="left"/>
+            </w:pPr>
+            <w:r>
+              <w:t xml:space="preserve">A4</w:t>
+            </w:r>
+          </w:p>
+        </w:tc>
+      </w:tr>
+      <w:tr>
         <w:tc>
           <w:tcPr>
             <w:gridSpan w:val="1"/>
@@ -1873,6 +1994,69 @@
             <w:pPr/>
           </w:p>
         </w:tc>
+        <w:tc>
+          <w:tcPr/>
+          <w:p>
+            <w:pPr>
+              <w:pStyle w:val="Compact"/>
+              <w:jc w:val="left"/>
+            </w:pPr>
+            <w:r>
+              <w:t xml:space="preserve">Выдан жетон из банка</w:t>
+            </w:r>
+          </w:p>
+        </w:tc>
+        <w:tc>
+          <w:tcPr/>
+          <w:p>
+            <w:pPr>
+              <w:pStyle w:val="Compact"/>
+              <w:jc w:val="left"/>
+            </w:pPr>
+            <w:r>
+              <w:rPr>
+                <w:rStyle w:val="VerbatimChar"/>
+              </w:rPr>
+              <w:t xml:space="preserve">e06</w:t>
+            </w:r>
+          </w:p>
+        </w:tc>
+        <w:tc>
+          <w:tcPr/>
+          <w:p>
+            <w:pPr>
+              <w:pStyle w:val="Compact"/>
+              <w:jc w:val="left"/>
+            </w:pPr>
+            <w:r>
+              <w:rPr>
+                <w:rStyle w:val="VerbatimChar"/>
+              </w:rPr>
+              <w:t xml:space="preserve">y0=4</w:t>
+            </w:r>
+          </w:p>
+        </w:tc>
+        <w:tc>
+          <w:tcPr/>
+          <w:p>
+            <w:pPr>
+              <w:pStyle w:val="Compact"/>
+              <w:jc w:val="left"/>
+            </w:pPr>
+            <w:r>
+              <w:t xml:space="preserve">Выдача жетона</w:t>
+            </w:r>
+          </w:p>
+        </w:tc>
+        <w:tc>
+          <w:tcPr>
+            <w:gridSpan w:val="1"/>
+            <w:vMerge w:val="continue"/>
+          </w:tcPr>
+          <w:p>
+            <w:pPr/>
+          </w:p>
+        </w:tc>
       </w:tr>
       <w:tr>
         <w:tc>
@@ -1892,52 +2076,68 @@
               <w:jc w:val="left"/>
             </w:pPr>
             <w:r>
-              <w:t xml:space="preserve">Сработал таймер третьего барабана</w:t>
-            </w:r>
-          </w:p>
-        </w:tc>
-        <w:tc>
-          <w:tcPr/>
-          <w:p>
-            <w:pPr>
-              <w:pStyle w:val="Compact"/>
-              <w:jc w:val="left"/>
-            </w:pPr>
-            <w:r>
-              <w:rPr>
-                <w:rStyle w:val="VerbatimChar"/>
-              </w:rPr>
-              <w:t xml:space="preserve">e05</w:t>
-            </w:r>
-          </w:p>
-        </w:tc>
-        <w:tc>
-          <w:tcPr/>
-          <w:p>
-            <w:pPr>
-              <w:pStyle w:val="Compact"/>
-              <w:jc w:val="left"/>
-            </w:pPr>
-            <w:r>
-              <w:rPr>
-                <w:rStyle w:val="VerbatimChar"/>
-              </w:rPr>
-              <w:t xml:space="preserve">y0=2</w:t>
-            </w:r>
-          </w:p>
-        </w:tc>
-        <w:tc>
-          <w:tcPr/>
-          <w:p>
-            <w:pPr>
-              <w:pStyle w:val="Compact"/>
-              <w:jc w:val="left"/>
-            </w:pPr>
-            <w:r>
-              <w:t xml:space="preserve">Игра</w:t>
-            </w:r>
-          </w:p>
-        </w:tc>
+              <w:t xml:space="preserve">Cумма выдачи выигрыша больше нуля</w:t>
+            </w:r>
+          </w:p>
+        </w:tc>
+        <w:tc>
+          <w:tcPr/>
+          <w:p>
+            <w:pPr>
+              <w:pStyle w:val="Compact"/>
+              <w:jc w:val="left"/>
+            </w:pPr>
+            <w:r>
+              <w:rPr>
+                <w:rStyle w:val="VerbatimChar"/>
+              </w:rPr>
+              <w:t xml:space="preserve">x01</w:t>
+            </w:r>
+          </w:p>
+        </w:tc>
+        <w:tc>
+          <w:tcPr/>
+          <w:p>
+            <w:pPr>
+              <w:pStyle w:val="Compact"/>
+              <w:jc w:val="left"/>
+            </w:pPr>
+            <w:r>
+              <w:rPr>
+                <w:rStyle w:val="VerbatimChar"/>
+              </w:rPr>
+              <w:t xml:space="preserve">z02</w:t>
+            </w:r>
+          </w:p>
+        </w:tc>
+        <w:tc>
+          <w:tcPr/>
+          <w:p>
+            <w:pPr>
+              <w:pStyle w:val="Compact"/>
+              <w:jc w:val="left"/>
+            </w:pPr>
+            <w:r>
+              <w:t xml:space="preserve">Закрыть монетоприемник</w:t>
+            </w:r>
+          </w:p>
+        </w:tc>
+        <w:tc>
+          <w:tcPr>
+            <w:vMerge w:val="restart"/>
+          </w:tcPr>
+          <w:p>
+            <w:pPr>
+              <w:pStyle w:val="Compact"/>
+              <w:jc w:val="left"/>
+            </w:pPr>
+            <w:r>
+              <w:t xml:space="preserve">Среда</w:t>
+            </w:r>
+          </w:p>
+        </w:tc>
+      </w:tr>
+      <w:tr>
         <w:tc>
           <w:tcPr>
             <w:gridSpan w:val="1"/>
@@ -1947,10 +2147,141 @@
             <w:pPr/>
           </w:p>
         </w:tc>
+        <w:tc>
+          <w:tcPr/>
+          <w:p>
+            <w:pPr>
+              <w:pStyle w:val="Compact"/>
+              <w:jc w:val="left"/>
+            </w:pPr>
+            <w:r>
+              <w:t xml:space="preserve">В банке есть жетоны</w:t>
+            </w:r>
+          </w:p>
+        </w:tc>
+        <w:tc>
+          <w:tcPr/>
+          <w:p>
+            <w:pPr>
+              <w:pStyle w:val="Compact"/>
+              <w:jc w:val="left"/>
+            </w:pPr>
+            <w:r>
+              <w:rPr>
+                <w:rStyle w:val="VerbatimChar"/>
+              </w:rPr>
+              <w:t xml:space="preserve">x02</w:t>
+            </w:r>
+          </w:p>
+        </w:tc>
+        <w:tc>
+          <w:tcPr/>
+          <w:p>
+            <w:pPr>
+              <w:pStyle w:val="Compact"/>
+              <w:jc w:val="left"/>
+            </w:pPr>
+            <w:r>
+              <w:rPr>
+                <w:rStyle w:val="VerbatimChar"/>
+              </w:rPr>
+              <w:t xml:space="preserve">z03</w:t>
+            </w:r>
+          </w:p>
+        </w:tc>
+        <w:tc>
+          <w:tcPr/>
+          <w:p>
+            <w:pPr>
+              <w:pStyle w:val="Compact"/>
+              <w:jc w:val="left"/>
+            </w:pPr>
+            <w:r>
+              <w:t xml:space="preserve">Открыть монетоприемник</w:t>
+            </w:r>
+          </w:p>
+        </w:tc>
+        <w:tc>
+          <w:tcPr>
+            <w:gridSpan w:val="1"/>
+            <w:vMerge w:val="continue"/>
+          </w:tcPr>
+          <w:p>
+            <w:pPr/>
+          </w:p>
+        </w:tc>
       </w:tr>
       <w:tr>
         <w:tc>
           <w:tcPr>
+            <w:vMerge w:val="restart"/>
+          </w:tcPr>
+          <w:p>
+            <w:pPr>
+              <w:pStyle w:val="Compact"/>
+              <w:jc w:val="left"/>
+            </w:pPr>
+            <w:r>
+              <w:t xml:space="preserve">A1</w:t>
+            </w:r>
+          </w:p>
+        </w:tc>
+        <w:tc>
+          <w:tcPr/>
+          <w:p>
+            <w:pPr>
+              <w:pStyle w:val="Compact"/>
+              <w:jc w:val="left"/>
+            </w:pPr>
+            <w:r>
+              <w:t xml:space="preserve">Опущен жетон</w:t>
+            </w:r>
+          </w:p>
+        </w:tc>
+        <w:tc>
+          <w:tcPr/>
+          <w:p>
+            <w:pPr>
+              <w:pStyle w:val="Compact"/>
+              <w:jc w:val="left"/>
+            </w:pPr>
+            <w:r>
+              <w:rPr>
+                <w:rStyle w:val="VerbatimChar"/>
+              </w:rPr>
+              <w:t xml:space="preserve">e11</w:t>
+            </w:r>
+          </w:p>
+        </w:tc>
+        <w:tc>
+          <w:tcPr/>
+          <w:p>
+            <w:pPr>
+              <w:pStyle w:val="Compact"/>
+              <w:jc w:val="left"/>
+            </w:pPr>
+            <w:r>
+              <w:rPr>
+                <w:rStyle w:val="VerbatimChar"/>
+              </w:rPr>
+              <w:t xml:space="preserve">z04</w:t>
+            </w:r>
+          </w:p>
+        </w:tc>
+        <w:tc>
+          <w:tcPr/>
+          <w:p>
+            <w:pPr>
+              <w:pStyle w:val="Compact"/>
+              <w:jc w:val="left"/>
+            </w:pPr>
+            <w:r>
+              <w:t xml:space="preserve">Выдать жетон из банка</w:t>
+            </w:r>
+          </w:p>
+        </w:tc>
+        <w:tc>
+          <w:tcPr>
             <w:gridSpan w:val="1"/>
             <w:vMerge w:val="continue"/>
           </w:tcPr>
@@ -1958,60 +2289,8 @@
             <w:pPr/>
           </w:p>
         </w:tc>
-        <w:tc>
-          <w:tcPr/>
-          <w:p>
-            <w:pPr>
-              <w:pStyle w:val="Compact"/>
-              <w:jc w:val="left"/>
-            </w:pPr>
-            <w:r>
-              <w:t xml:space="preserve">Выдан жетон из банка</w:t>
-            </w:r>
-          </w:p>
-        </w:tc>
-        <w:tc>
-          <w:tcPr/>
-          <w:p>
-            <w:pPr>
-              <w:pStyle w:val="Compact"/>
-              <w:jc w:val="left"/>
-            </w:pPr>
-            <w:r>
-              <w:rPr>
-                <w:rStyle w:val="VerbatimChar"/>
-              </w:rPr>
-              <w:t xml:space="preserve">e06</w:t>
-            </w:r>
-          </w:p>
-        </w:tc>
-        <w:tc>
-          <w:tcPr/>
-          <w:p>
-            <w:pPr>
-              <w:pStyle w:val="Compact"/>
-              <w:jc w:val="left"/>
-            </w:pPr>
-            <w:r>
-              <w:rPr>
-                <w:rStyle w:val="VerbatimChar"/>
-              </w:rPr>
-              <w:t xml:space="preserve">y0=4</w:t>
-            </w:r>
-          </w:p>
-        </w:tc>
-        <w:tc>
-          <w:tcPr/>
-          <w:p>
-            <w:pPr>
-              <w:pStyle w:val="Compact"/>
-              <w:jc w:val="left"/>
-            </w:pPr>
-            <w:r>
-              <w:t xml:space="preserve">Выдача жетона</w:t>
-            </w:r>
-          </w:p>
-        </w:tc>
+      </w:tr>
+      <w:tr>
         <w:tc>
           <w:tcPr>
             <w:gridSpan w:val="1"/>
@@ -2021,6 +2300,69 @@
             <w:pPr/>
           </w:p>
         </w:tc>
+        <w:tc>
+          <w:tcPr/>
+          <w:p>
+            <w:pPr>
+              <w:pStyle w:val="Compact"/>
+              <w:jc w:val="left"/>
+            </w:pPr>
+            <w:r>
+              <w:t xml:space="preserve">y1!=2</w:t>
+            </w:r>
+          </w:p>
+        </w:tc>
+        <w:tc>
+          <w:tcPr/>
+          <w:p>
+            <w:pPr>
+              <w:pStyle w:val="Compact"/>
+              <w:jc w:val="left"/>
+            </w:pPr>
+            <w:r>
+              <w:rPr>
+                <w:rStyle w:val="VerbatimChar"/>
+              </w:rPr>
+              <w:t xml:space="preserve">y1!=2</w:t>
+            </w:r>
+          </w:p>
+        </w:tc>
+        <w:tc>
+          <w:tcPr/>
+          <w:p>
+            <w:pPr>
+              <w:pStyle w:val="Compact"/>
+              <w:jc w:val="left"/>
+            </w:pPr>
+            <w:r>
+              <w:rPr>
+                <w:rStyle w:val="VerbatimChar"/>
+              </w:rPr>
+              <w:t xml:space="preserve">z05</w:t>
+            </w:r>
+          </w:p>
+        </w:tc>
+        <w:tc>
+          <w:tcPr/>
+          <w:p>
+            <w:pPr>
+              <w:pStyle w:val="Compact"/>
+              <w:jc w:val="left"/>
+            </w:pPr>
+            <w:r>
+              <w:t xml:space="preserve">Сбросить сумму выигрыша</w:t>
+            </w:r>
+          </w:p>
+        </w:tc>
+        <w:tc>
+          <w:tcPr>
+            <w:gridSpan w:val="1"/>
+            <w:vMerge w:val="continue"/>
+          </w:tcPr>
+          <w:p>
+            <w:pPr/>
+          </w:p>
+        </w:tc>
       </w:tr>
       <w:tr>
         <w:tc>
@@ -2040,64 +2382,59 @@
               <w:jc w:val="left"/>
             </w:pPr>
             <w:r>
-              <w:t xml:space="preserve">Cумма выдачи выигрыша больше нуля</w:t>
-            </w:r>
-          </w:p>
-        </w:tc>
-        <w:tc>
-          <w:tcPr/>
-          <w:p>
-            <w:pPr>
-              <w:pStyle w:val="Compact"/>
-              <w:jc w:val="left"/>
-            </w:pPr>
-            <w:r>
-              <w:rPr>
-                <w:rStyle w:val="VerbatimChar"/>
-              </w:rPr>
-              <w:t xml:space="preserve">x01</w:t>
-            </w:r>
-          </w:p>
-        </w:tc>
-        <w:tc>
-          <w:tcPr/>
-          <w:p>
-            <w:pPr>
-              <w:pStyle w:val="Compact"/>
-              <w:jc w:val="left"/>
-            </w:pPr>
-            <w:r>
-              <w:rPr>
-                <w:rStyle w:val="VerbatimChar"/>
-              </w:rPr>
-              <w:t xml:space="preserve">e02</w:t>
-            </w:r>
-          </w:p>
-        </w:tc>
-        <w:tc>
-          <w:tcPr/>
-          <w:p>
-            <w:pPr>
-              <w:pStyle w:val="Compact"/>
-              <w:jc w:val="left"/>
-            </w:pPr>
-            <w:r>
-              <w:t xml:space="preserve">Нажата кнопка &lt;&lt;Возврат&gt;&gt;</w:t>
-            </w:r>
-          </w:p>
-        </w:tc>
-        <w:tc>
-          <w:tcPr>
-            <w:vMerge w:val="restart"/>
-          </w:tcPr>
-          <w:p>
-            <w:pPr>
-              <w:pStyle w:val="Compact"/>
-              <w:jc w:val="left"/>
-            </w:pPr>
-            <w:r>
-              <w:t xml:space="preserve">A1</w:t>
-            </w:r>
+              <w:t xml:space="preserve">Жетон принят</w:t>
+            </w:r>
+          </w:p>
+        </w:tc>
+        <w:tc>
+          <w:tcPr/>
+          <w:p>
+            <w:pPr>
+              <w:pStyle w:val="Compact"/>
+              <w:jc w:val="left"/>
+            </w:pPr>
+            <w:r>
+              <w:rPr>
+                <w:rStyle w:val="VerbatimChar"/>
+              </w:rPr>
+              <w:t xml:space="preserve">y1=1</w:t>
+            </w:r>
+          </w:p>
+        </w:tc>
+        <w:tc>
+          <w:tcPr/>
+          <w:p>
+            <w:pPr>
+              <w:pStyle w:val="Compact"/>
+              <w:jc w:val="left"/>
+            </w:pPr>
+            <w:r>
+              <w:rPr>
+                <w:rStyle w:val="VerbatimChar"/>
+              </w:rPr>
+              <w:t xml:space="preserve">z12</w:t>
+            </w:r>
+          </w:p>
+        </w:tc>
+        <w:tc>
+          <w:tcPr/>
+          <w:p>
+            <w:pPr>
+              <w:pStyle w:val="Compact"/>
+              <w:jc w:val="left"/>
+            </w:pPr>
+            <w:r>
+              <w:t xml:space="preserve">Обновить индикатор &lt;&lt;Ставка&gt;&gt;</w:t>
+            </w:r>
+          </w:p>
+        </w:tc>
+        <w:tc>
+          <w:tcPr>
+            <w:gridSpan w:val="1"/>
+            <w:vMerge w:val="continue"/>
+          </w:tcPr>
+          <w:p>
+            <w:pPr/>
           </w:p>
         </w:tc>
       </w:tr>
@@ -2119,49 +2456,49 @@
               <w:jc w:val="left"/>
             </w:pPr>
             <w:r>
-              <w:t xml:space="preserve">В банке есть жетоны</w:t>
-            </w:r>
-          </w:p>
-        </w:tc>
-        <w:tc>
-          <w:tcPr/>
-          <w:p>
-            <w:pPr>
-              <w:pStyle w:val="Compact"/>
-              <w:jc w:val="left"/>
-            </w:pPr>
-            <w:r>
-              <w:rPr>
-                <w:rStyle w:val="VerbatimChar"/>
-              </w:rPr>
-              <w:t xml:space="preserve">x02</w:t>
-            </w:r>
-          </w:p>
-        </w:tc>
-        <w:tc>
-          <w:tcPr/>
-          <w:p>
-            <w:pPr>
-              <w:pStyle w:val="Compact"/>
-              <w:jc w:val="left"/>
-            </w:pPr>
-            <w:r>
-              <w:rPr>
-                <w:rStyle w:val="VerbatimChar"/>
-              </w:rPr>
-              <w:t xml:space="preserve">e12</w:t>
-            </w:r>
-          </w:p>
-        </w:tc>
-        <w:tc>
-          <w:tcPr/>
-          <w:p>
-            <w:pPr>
-              <w:pStyle w:val="Compact"/>
-              <w:jc w:val="left"/>
-            </w:pPr>
-            <w:r>
-              <w:t xml:space="preserve">Необходимо перевести жетоны в банк</w:t>
+              <w:t xml:space="preserve">Жетон не распознан</w:t>
+            </w:r>
+          </w:p>
+        </w:tc>
+        <w:tc>
+          <w:tcPr/>
+          <w:p>
+            <w:pPr>
+              <w:pStyle w:val="Compact"/>
+              <w:jc w:val="left"/>
+            </w:pPr>
+            <w:r>
+              <w:rPr>
+                <w:rStyle w:val="VerbatimChar"/>
+              </w:rPr>
+              <w:t xml:space="preserve">y1=2</w:t>
+            </w:r>
+          </w:p>
+        </w:tc>
+        <w:tc>
+          <w:tcPr/>
+          <w:p>
+            <w:pPr>
+              <w:pStyle w:val="Compact"/>
+              <w:jc w:val="left"/>
+            </w:pPr>
+            <w:r>
+              <w:rPr>
+                <w:rStyle w:val="VerbatimChar"/>
+              </w:rPr>
+              <w:t xml:space="preserve">z13</w:t>
+            </w:r>
+          </w:p>
+        </w:tc>
+        <w:tc>
+          <w:tcPr/>
+          <w:p>
+            <w:pPr>
+              <w:pStyle w:val="Compact"/>
+              <w:jc w:val="left"/>
+            </w:pPr>
+            <w:r>
+              <w:t xml:space="preserve">Сбросить ставку</w:t>
             </w:r>
           </w:p>
         </w:tc>
@@ -2177,70 +2514,68 @@
       </w:tr>
       <w:tr>
         <w:tc>
-          <w:tcPr>
-            <w:vMerge w:val="restart"/>
-          </w:tcPr>
-          <w:p>
-            <w:pPr>
-              <w:pStyle w:val="Compact"/>
-              <w:jc w:val="left"/>
-            </w:pPr>
-            <w:r>
-              <w:t xml:space="preserve">A1</w:t>
-            </w:r>
-          </w:p>
-        </w:tc>
-        <w:tc>
-          <w:tcPr/>
-          <w:p>
-            <w:pPr>
-              <w:pStyle w:val="Compact"/>
-              <w:jc w:val="left"/>
-            </w:pPr>
-            <w:r>
-              <w:t xml:space="preserve">Опущен жетон</w:t>
-            </w:r>
-          </w:p>
-        </w:tc>
-        <w:tc>
-          <w:tcPr/>
-          <w:p>
-            <w:pPr>
-              <w:pStyle w:val="Compact"/>
-              <w:jc w:val="left"/>
-            </w:pPr>
-            <w:r>
-              <w:rPr>
-                <w:rStyle w:val="VerbatimChar"/>
-              </w:rPr>
-              <w:t xml:space="preserve">e11</w:t>
-            </w:r>
-          </w:p>
-        </w:tc>
-        <w:tc>
-          <w:tcPr/>
-          <w:p>
-            <w:pPr>
-              <w:pStyle w:val="Compact"/>
-              <w:jc w:val="left"/>
-            </w:pPr>
-            <w:r>
-              <w:rPr>
-                <w:rStyle w:val="VerbatimChar"/>
-              </w:rPr>
-              <w:t xml:space="preserve">e14</w:t>
-            </w:r>
-          </w:p>
-        </w:tc>
-        <w:tc>
-          <w:tcPr/>
-          <w:p>
-            <w:pPr>
-              <w:pStyle w:val="Compact"/>
-              <w:jc w:val="left"/>
-            </w:pPr>
-            <w:r>
-              <w:t xml:space="preserve">Открыть монетоприемник</w:t>
+          <w:tcPr/>
+          <w:p>
+            <w:pPr>
+              <w:pStyle w:val="Compact"/>
+              <w:jc w:val="left"/>
+            </w:pPr>
+            <w:r>
+              <w:t xml:space="preserve">A2</w:t>
+            </w:r>
+          </w:p>
+        </w:tc>
+        <w:tc>
+          <w:tcPr/>
+          <w:p>
+            <w:pPr>
+              <w:pStyle w:val="Compact"/>
+              <w:jc w:val="left"/>
+            </w:pPr>
+            <w:r>
+              <w:t xml:space="preserve">Барабаны прокручены</w:t>
+            </w:r>
+          </w:p>
+        </w:tc>
+        <w:tc>
+          <w:tcPr/>
+          <w:p>
+            <w:pPr>
+              <w:pStyle w:val="Compact"/>
+              <w:jc w:val="left"/>
+            </w:pPr>
+            <w:r>
+              <w:rPr>
+                <w:rStyle w:val="VerbatimChar"/>
+              </w:rPr>
+              <w:t xml:space="preserve">y2=0</w:t>
+            </w:r>
+          </w:p>
+        </w:tc>
+        <w:tc>
+          <w:tcPr/>
+          <w:p>
+            <w:pPr>
+              <w:pStyle w:val="Compact"/>
+              <w:jc w:val="left"/>
+            </w:pPr>
+            <w:r>
+              <w:rPr>
+                <w:rStyle w:val="VerbatimChar"/>
+              </w:rPr>
+              <w:t xml:space="preserve">z15</w:t>
+            </w:r>
+          </w:p>
+        </w:tc>
+        <w:tc>
+          <w:tcPr/>
+          <w:p>
+            <w:pPr>
+              <w:pStyle w:val="Compact"/>
+              <w:jc w:val="left"/>
+            </w:pPr>
+            <w:r>
+              <w:t xml:space="preserve">Обновить индикатор &lt;&lt;Банк&gt;&gt;</w:t>
             </w:r>
           </w:p>
         </w:tc>
@@ -2257,6 +2592,74 @@
       <w:tr>
         <w:tc>
           <w:tcPr>
+            <w:vMerge w:val="restart"/>
+          </w:tcPr>
+          <w:p>
+            <w:pPr>
+              <w:pStyle w:val="Compact"/>
+              <w:jc w:val="left"/>
+            </w:pPr>
+            <w:r>
+              <w:t xml:space="preserve">A3</w:t>
+            </w:r>
+          </w:p>
+        </w:tc>
+        <w:tc>
+          <w:tcPr/>
+          <w:p>
+            <w:pPr>
+              <w:pStyle w:val="Compact"/>
+              <w:jc w:val="left"/>
+            </w:pPr>
+            <w:r>
+              <w:t xml:space="preserve">A3 не выплачивает джекпот</w:t>
+            </w:r>
+          </w:p>
+        </w:tc>
+        <w:tc>
+          <w:tcPr/>
+          <w:p>
+            <w:pPr>
+              <w:pStyle w:val="Compact"/>
+              <w:jc w:val="left"/>
+            </w:pPr>
+            <w:r>
+              <w:rPr>
+                <w:rStyle w:val="VerbatimChar"/>
+              </w:rPr>
+              <w:t xml:space="preserve">y3!=1</w:t>
+            </w:r>
+          </w:p>
+        </w:tc>
+        <w:tc>
+          <w:tcPr/>
+          <w:p>
+            <w:pPr>
+              <w:pStyle w:val="Compact"/>
+              <w:jc w:val="left"/>
+            </w:pPr>
+            <w:r>
+              <w:rPr>
+                <w:rStyle w:val="VerbatimChar"/>
+              </w:rPr>
+              <w:t xml:space="preserve">z28</w:t>
+            </w:r>
+          </w:p>
+        </w:tc>
+        <w:tc>
+          <w:tcPr/>
+          <w:p>
+            <w:pPr>
+              <w:pStyle w:val="Compact"/>
+              <w:jc w:val="left"/>
+            </w:pPr>
+            <w:r>
+              <w:t xml:space="preserve">Обновить индикатор &lt;&lt;Выигрыш&gt;&gt;</w:t>
+            </w:r>
+          </w:p>
+        </w:tc>
+        <w:tc>
+          <w:tcPr>
             <w:gridSpan w:val="1"/>
             <w:vMerge w:val="continue"/>
           </w:tcPr>
@@ -2264,74 +2667,6 @@
             <w:pPr/>
           </w:p>
         </w:tc>
-        <w:tc>
-          <w:tcPr/>
-          <w:p>
-            <w:pPr>
-              <w:pStyle w:val="Compact"/>
-              <w:jc w:val="left"/>
-            </w:pPr>
-            <w:r>
-              <w:t xml:space="preserve">y1!=2</w:t>
-            </w:r>
-          </w:p>
-        </w:tc>
-        <w:tc>
-          <w:tcPr/>
-          <w:p>
-            <w:pPr>
-              <w:pStyle w:val="Compact"/>
-              <w:jc w:val="left"/>
-            </w:pPr>
-            <w:r>
-              <w:rPr>
-                <w:rStyle w:val="VerbatimChar"/>
-              </w:rPr>
-              <w:t xml:space="preserve">y1!=2</w:t>
-            </w:r>
-          </w:p>
-        </w:tc>
-        <w:tc>
-          <w:tcPr/>
-          <w:p>
-            <w:pPr>
-              <w:pStyle w:val="Compact"/>
-              <w:jc w:val="left"/>
-            </w:pPr>
-            <w:r>
-              <w:rPr>
-                <w:rStyle w:val="VerbatimChar"/>
-              </w:rPr>
-              <w:t xml:space="preserve">e05</w:t>
-            </w:r>
-          </w:p>
-        </w:tc>
-        <w:tc>
-          <w:tcPr/>
-          <w:p>
-            <w:pPr>
-              <w:pStyle w:val="Compact"/>
-              <w:jc w:val="left"/>
-            </w:pPr>
-            <w:r>
-              <w:t xml:space="preserve">Сработал таймер третьего барабана</w:t>
-            </w:r>
-          </w:p>
-        </w:tc>
-        <w:tc>
-          <w:tcPr>
-            <w:vMerge w:val="restart"/>
-          </w:tcPr>
-          <w:p>
-            <w:pPr>
-              <w:pStyle w:val="Compact"/>
-              <w:jc w:val="left"/>
-            </w:pPr>
-            <w:r>
-              <w:t xml:space="preserve">A3</w:t>
-            </w:r>
-          </w:p>
-        </w:tc>
       </w:tr>
       <w:tr>
         <w:tc>
@@ -2351,315 +2686,6 @@
               <w:jc w:val="left"/>
             </w:pPr>
             <w:r>
-              <w:t xml:space="preserve">Жетон принят</w:t>
-            </w:r>
-          </w:p>
-        </w:tc>
-        <w:tc>
-          <w:tcPr/>
-          <w:p>
-            <w:pPr>
-              <w:pStyle w:val="Compact"/>
-              <w:jc w:val="left"/>
-            </w:pPr>
-            <w:r>
-              <w:rPr>
-                <w:rStyle w:val="VerbatimChar"/>
-              </w:rPr>
-              <w:t xml:space="preserve">y1=1</w:t>
-            </w:r>
-          </w:p>
-        </w:tc>
-        <w:tc>
-          <w:tcPr/>
-          <w:p>
-            <w:pPr>
-              <w:pStyle w:val="Compact"/>
-              <w:jc w:val="left"/>
-            </w:pPr>
-            <w:r>
-              <w:rPr>
-                <w:rStyle w:val="VerbatimChar"/>
-              </w:rPr>
-              <w:t xml:space="preserve">e33</w:t>
-            </w:r>
-          </w:p>
-        </w:tc>
-        <w:tc>
-          <w:tcPr/>
-          <w:p>
-            <w:pPr>
-              <w:pStyle w:val="Compact"/>
-              <w:jc w:val="left"/>
-            </w:pPr>
-            <w:r>
-              <w:t xml:space="preserve">Выплата жетонов завершена</w:t>
-            </w:r>
-          </w:p>
-        </w:tc>
-        <w:tc>
-          <w:tcPr>
-            <w:gridSpan w:val="1"/>
-            <w:vMerge w:val="continue"/>
-          </w:tcPr>
-          <w:p>
-            <w:pPr/>
-          </w:p>
-        </w:tc>
-      </w:tr>
-      <w:tr>
-        <w:tc>
-          <w:tcPr>
-            <w:gridSpan w:val="1"/>
-            <w:vMerge w:val="continue"/>
-          </w:tcPr>
-          <w:p>
-            <w:pPr/>
-          </w:p>
-        </w:tc>
-        <w:tc>
-          <w:tcPr/>
-          <w:p>
-            <w:pPr>
-              <w:pStyle w:val="Compact"/>
-              <w:jc w:val="left"/>
-            </w:pPr>
-            <w:r>
-              <w:t xml:space="preserve">Жетон не распознан</w:t>
-            </w:r>
-          </w:p>
-        </w:tc>
-        <w:tc>
-          <w:tcPr/>
-          <w:p>
-            <w:pPr>
-              <w:pStyle w:val="Compact"/>
-              <w:jc w:val="left"/>
-            </w:pPr>
-            <w:r>
-              <w:rPr>
-                <w:rStyle w:val="VerbatimChar"/>
-              </w:rPr>
-              <w:t xml:space="preserve">y1=2</w:t>
-            </w:r>
-          </w:p>
-        </w:tc>
-        <w:tc>
-          <w:tcPr/>
-          <w:p>
-            <w:pPr>
-              <w:pStyle w:val="Compact"/>
-              <w:jc w:val="left"/>
-            </w:pPr>
-            <w:r>
-              <w:rPr>
-                <w:rStyle w:val="VerbatimChar"/>
-              </w:rPr>
-              <w:t xml:space="preserve">z02</w:t>
-            </w:r>
-          </w:p>
-        </w:tc>
-        <w:tc>
-          <w:tcPr/>
-          <w:p>
-            <w:pPr>
-              <w:pStyle w:val="Compact"/>
-              <w:jc w:val="left"/>
-            </w:pPr>
-            <w:r>
-              <w:t xml:space="preserve">Закрыть монетоприемник</w:t>
-            </w:r>
-          </w:p>
-        </w:tc>
-        <w:tc>
-          <w:tcPr>
-            <w:vMerge w:val="restart"/>
-          </w:tcPr>
-          <w:p>
-            <w:pPr>
-              <w:pStyle w:val="Compact"/>
-              <w:jc w:val="left"/>
-            </w:pPr>
-            <w:r>
-              <w:t xml:space="preserve">Среда</w:t>
-            </w:r>
-          </w:p>
-        </w:tc>
-      </w:tr>
-      <w:tr>
-        <w:tc>
-          <w:tcPr/>
-          <w:p>
-            <w:pPr>
-              <w:pStyle w:val="Compact"/>
-              <w:jc w:val="left"/>
-            </w:pPr>
-            <w:r>
-              <w:t xml:space="preserve">A2</w:t>
-            </w:r>
-          </w:p>
-        </w:tc>
-        <w:tc>
-          <w:tcPr/>
-          <w:p>
-            <w:pPr>
-              <w:pStyle w:val="Compact"/>
-              <w:jc w:val="left"/>
-            </w:pPr>
-            <w:r>
-              <w:t xml:space="preserve">Барабаны прокручены</w:t>
-            </w:r>
-          </w:p>
-        </w:tc>
-        <w:tc>
-          <w:tcPr/>
-          <w:p>
-            <w:pPr>
-              <w:pStyle w:val="Compact"/>
-              <w:jc w:val="left"/>
-            </w:pPr>
-            <w:r>
-              <w:rPr>
-                <w:rStyle w:val="VerbatimChar"/>
-              </w:rPr>
-              <w:t xml:space="preserve">y2=0</w:t>
-            </w:r>
-          </w:p>
-        </w:tc>
-        <w:tc>
-          <w:tcPr/>
-          <w:p>
-            <w:pPr>
-              <w:pStyle w:val="Compact"/>
-              <w:jc w:val="left"/>
-            </w:pPr>
-            <w:r>
-              <w:rPr>
-                <w:rStyle w:val="VerbatimChar"/>
-              </w:rPr>
-              <w:t xml:space="preserve">z03</w:t>
-            </w:r>
-          </w:p>
-        </w:tc>
-        <w:tc>
-          <w:tcPr/>
-          <w:p>
-            <w:pPr>
-              <w:pStyle w:val="Compact"/>
-              <w:jc w:val="left"/>
-            </w:pPr>
-            <w:r>
-              <w:t xml:space="preserve">Открыть монетоприемник</w:t>
-            </w:r>
-          </w:p>
-        </w:tc>
-        <w:tc>
-          <w:tcPr>
-            <w:gridSpan w:val="1"/>
-            <w:vMerge w:val="continue"/>
-          </w:tcPr>
-          <w:p>
-            <w:pPr/>
-          </w:p>
-        </w:tc>
-      </w:tr>
-      <w:tr>
-        <w:tc>
-          <w:tcPr>
-            <w:vMerge w:val="restart"/>
-          </w:tcPr>
-          <w:p>
-            <w:pPr>
-              <w:pStyle w:val="Compact"/>
-              <w:jc w:val="left"/>
-            </w:pPr>
-            <w:r>
-              <w:t xml:space="preserve">A3</w:t>
-            </w:r>
-          </w:p>
-        </w:tc>
-        <w:tc>
-          <w:tcPr/>
-          <w:p>
-            <w:pPr>
-              <w:pStyle w:val="Compact"/>
-              <w:jc w:val="left"/>
-            </w:pPr>
-            <w:r>
-              <w:t xml:space="preserve">A3 не выплачивает джекпот</w:t>
-            </w:r>
-          </w:p>
-        </w:tc>
-        <w:tc>
-          <w:tcPr/>
-          <w:p>
-            <w:pPr>
-              <w:pStyle w:val="Compact"/>
-              <w:jc w:val="left"/>
-            </w:pPr>
-            <w:r>
-              <w:rPr>
-                <w:rStyle w:val="VerbatimChar"/>
-              </w:rPr>
-              <w:t xml:space="preserve">y3!=1</w:t>
-            </w:r>
-          </w:p>
-        </w:tc>
-        <w:tc>
-          <w:tcPr/>
-          <w:p>
-            <w:pPr>
-              <w:pStyle w:val="Compact"/>
-              <w:jc w:val="left"/>
-            </w:pPr>
-            <w:r>
-              <w:rPr>
-                <w:rStyle w:val="VerbatimChar"/>
-              </w:rPr>
-              <w:t xml:space="preserve">z04</w:t>
-            </w:r>
-          </w:p>
-        </w:tc>
-        <w:tc>
-          <w:tcPr/>
-          <w:p>
-            <w:pPr>
-              <w:pStyle w:val="Compact"/>
-              <w:jc w:val="left"/>
-            </w:pPr>
-            <w:r>
-              <w:t xml:space="preserve">Выдать жетон из банка</w:t>
-            </w:r>
-          </w:p>
-        </w:tc>
-        <w:tc>
-          <w:tcPr>
-            <w:gridSpan w:val="1"/>
-            <w:vMerge w:val="continue"/>
-          </w:tcPr>
-          <w:p>
-            <w:pPr/>
-          </w:p>
-        </w:tc>
-      </w:tr>
-      <w:tr>
-        <w:tc>
-          <w:tcPr>
-            <w:gridSpan w:val="1"/>
-            <w:vMerge w:val="continue"/>
-          </w:tcPr>
-          <w:p>
-            <w:pPr/>
-          </w:p>
-        </w:tc>
-        <w:tc>
-          <w:tcPr/>
-          <w:p>
-            <w:pPr>
-              <w:pStyle w:val="Compact"/>
-              <w:jc w:val="left"/>
-            </w:pPr>
-            <w:r>
               <w:t xml:space="preserve">A3 выплачивает джекпот</w:t>
             </w:r>
           </w:p>
@@ -2684,283 +2710,23 @@
           <w:p>
             <w:pPr>
               <w:pStyle w:val="Compact"/>
-              <w:jc w:val="left"/>
-            </w:pPr>
-            <w:r>
-              <w:rPr>
-                <w:rStyle w:val="VerbatimChar"/>
-              </w:rPr>
-              <w:t xml:space="preserve">z05</w:t>
-            </w:r>
-          </w:p>
-        </w:tc>
-        <w:tc>
-          <w:tcPr/>
-          <w:p>
-            <w:pPr>
-              <w:pStyle w:val="Compact"/>
-              <w:jc w:val="left"/>
-            </w:pPr>
-            <w:r>
-              <w:t xml:space="preserve">Сбросить сумму выигрыша</w:t>
-            </w:r>
-          </w:p>
-        </w:tc>
-        <w:tc>
-          <w:tcPr>
-            <w:gridSpan w:val="1"/>
-            <w:vMerge w:val="continue"/>
-          </w:tcPr>
-          <w:p>
-            <w:pPr/>
-          </w:p>
-        </w:tc>
-      </w:tr>
-      <w:tr>
-        <w:tc>
-          <w:tcPr/>
-          <w:p>
-            <w:pPr>
-              <w:pStyle w:val="Compact"/>
-            </w:pPr>
-          </w:p>
-        </w:tc>
-        <w:tc>
-          <w:tcPr/>
-          <w:p>
-            <w:pPr>
-              <w:pStyle w:val="Compact"/>
-            </w:pPr>
-          </w:p>
-        </w:tc>
-        <w:tc>
-          <w:tcPr/>
-          <w:p>
-            <w:pPr>
-              <w:pStyle w:val="Compact"/>
-            </w:pPr>
-          </w:p>
-        </w:tc>
-        <w:tc>
-          <w:tcPr/>
-          <w:p>
-            <w:pPr>
-              <w:pStyle w:val="Compact"/>
-              <w:jc w:val="left"/>
-            </w:pPr>
-            <w:r>
-              <w:rPr>
-                <w:rStyle w:val="VerbatimChar"/>
-              </w:rPr>
-              <w:t xml:space="preserve">z12</w:t>
-            </w:r>
-          </w:p>
-        </w:tc>
-        <w:tc>
-          <w:tcPr/>
-          <w:p>
-            <w:pPr>
-              <w:pStyle w:val="Compact"/>
-              <w:jc w:val="left"/>
-            </w:pPr>
-            <w:r>
-              <w:t xml:space="preserve">Обновить индикатор &lt;&lt;Ставка&gt;&gt;</w:t>
-            </w:r>
-          </w:p>
-        </w:tc>
-        <w:tc>
-          <w:tcPr>
-            <w:gridSpan w:val="1"/>
-            <w:vMerge w:val="continue"/>
-          </w:tcPr>
-          <w:p>
-            <w:pPr/>
-          </w:p>
-        </w:tc>
-      </w:tr>
-      <w:tr>
-        <w:tc>
-          <w:tcPr/>
-          <w:p>
-            <w:pPr>
-              <w:pStyle w:val="Compact"/>
-            </w:pPr>
-          </w:p>
-        </w:tc>
-        <w:tc>
-          <w:tcPr/>
-          <w:p>
-            <w:pPr>
-              <w:pStyle w:val="Compact"/>
-            </w:pPr>
-          </w:p>
-        </w:tc>
-        <w:tc>
-          <w:tcPr/>
-          <w:p>
-            <w:pPr>
-              <w:pStyle w:val="Compact"/>
-            </w:pPr>
-          </w:p>
-        </w:tc>
-        <w:tc>
-          <w:tcPr/>
-          <w:p>
-            <w:pPr>
-              <w:pStyle w:val="Compact"/>
-              <w:jc w:val="left"/>
-            </w:pPr>
-            <w:r>
-              <w:rPr>
-                <w:rStyle w:val="VerbatimChar"/>
-              </w:rPr>
-              <w:t xml:space="preserve">z13</w:t>
-            </w:r>
-          </w:p>
-        </w:tc>
-        <w:tc>
-          <w:tcPr/>
-          <w:p>
-            <w:pPr>
-              <w:pStyle w:val="Compact"/>
-              <w:jc w:val="left"/>
-            </w:pPr>
-            <w:r>
-              <w:t xml:space="preserve">Сбросить ставку</w:t>
-            </w:r>
-          </w:p>
-        </w:tc>
-        <w:tc>
-          <w:tcPr>
-            <w:gridSpan w:val="1"/>
-            <w:vMerge w:val="continue"/>
-          </w:tcPr>
-          <w:p>
-            <w:pPr/>
-          </w:p>
-        </w:tc>
-      </w:tr>
-      <w:tr>
-        <w:tc>
-          <w:tcPr/>
-          <w:p>
-            <w:pPr>
-              <w:pStyle w:val="Compact"/>
-            </w:pPr>
-          </w:p>
-        </w:tc>
-        <w:tc>
-          <w:tcPr/>
-          <w:p>
-            <w:pPr>
-              <w:pStyle w:val="Compact"/>
-            </w:pPr>
-          </w:p>
-        </w:tc>
-        <w:tc>
-          <w:tcPr/>
-          <w:p>
-            <w:pPr>
-              <w:pStyle w:val="Compact"/>
-            </w:pPr>
-          </w:p>
-        </w:tc>
-        <w:tc>
-          <w:tcPr/>
-          <w:p>
-            <w:pPr>
-              <w:pStyle w:val="Compact"/>
-              <w:jc w:val="left"/>
-            </w:pPr>
-            <w:r>
-              <w:rPr>
-                <w:rStyle w:val="VerbatimChar"/>
-              </w:rPr>
-              <w:t xml:space="preserve">z15</w:t>
-            </w:r>
-          </w:p>
-        </w:tc>
-        <w:tc>
-          <w:tcPr/>
-          <w:p>
-            <w:pPr>
-              <w:pStyle w:val="Compact"/>
-              <w:jc w:val="left"/>
-            </w:pPr>
-            <w:r>
-              <w:t xml:space="preserve">Обновить индикатор &lt;&lt;Банк&gt;&gt;</w:t>
-            </w:r>
-          </w:p>
-        </w:tc>
-        <w:tc>
-          <w:tcPr>
-            <w:gridSpan w:val="1"/>
-            <w:vMerge w:val="continue"/>
-          </w:tcPr>
-          <w:p>
-            <w:pPr/>
-          </w:p>
-        </w:tc>
-      </w:tr>
-      <w:tr>
-        <w:tc>
-          <w:tcPr/>
-          <w:p>
-            <w:pPr>
-              <w:pStyle w:val="Compact"/>
-            </w:pPr>
-          </w:p>
-        </w:tc>
-        <w:tc>
-          <w:tcPr/>
-          <w:p>
-            <w:pPr>
-              <w:pStyle w:val="Compact"/>
-            </w:pPr>
-          </w:p>
-        </w:tc>
-        <w:tc>
-          <w:tcPr/>
-          <w:p>
-            <w:pPr>
-              <w:pStyle w:val="Compact"/>
-            </w:pPr>
-          </w:p>
-        </w:tc>
-        <w:tc>
-          <w:tcPr/>
-          <w:p>
-            <w:pPr>
-              <w:pStyle w:val="Compact"/>
-              <w:jc w:val="left"/>
-            </w:pPr>
-            <w:r>
-              <w:rPr>
-                <w:rStyle w:val="VerbatimChar"/>
-              </w:rPr>
-              <w:t xml:space="preserve">z28</w:t>
-            </w:r>
-          </w:p>
-        </w:tc>
-        <w:tc>
-          <w:tcPr/>
-          <w:p>
-            <w:pPr>
-              <w:pStyle w:val="Compact"/>
-              <w:jc w:val="left"/>
-            </w:pPr>
-            <w:r>
-              <w:t xml:space="preserve">Обновить индикатор &lt;&lt;Выигрыш&gt;&gt;</w:t>
-            </w:r>
-          </w:p>
-        </w:tc>
-        <w:tc>
-          <w:tcPr>
-            <w:gridSpan w:val="1"/>
-            <w:vMerge w:val="continue"/>
-          </w:tcPr>
-          <w:p>
-            <w:pPr/>
+            </w:pPr>
+          </w:p>
+        </w:tc>
+        <w:tc>
+          <w:tcPr/>
+          <w:p>
+            <w:pPr>
+              <w:pStyle w:val="Compact"/>
+            </w:pPr>
+          </w:p>
+        </w:tc>
+        <w:tc>
+          <w:tcPr/>
+          <w:p>
+            <w:pPr>
+              <w:pStyle w:val="Compact"/>
+            </w:pPr>
           </w:p>
         </w:tc>
       </w:tr>
@@ -5145,31 +4911,33 @@
               <w:rPr>
                 <w:rStyle w:val="VerbatimChar"/>
               </w:rPr>
-              <w:t xml:space="preserve">e40</w:t>
-            </w:r>
-          </w:p>
-        </w:tc>
-        <w:tc>
-          <w:tcPr/>
-          <w:p>
-            <w:pPr>
-              <w:pStyle w:val="Compact"/>
-              <w:jc w:val="left"/>
-            </w:pPr>
-            <w:r>
-              <w:t xml:space="preserve">Выплата джекпота завершена</w:t>
-            </w:r>
-          </w:p>
-        </w:tc>
-        <w:tc>
-          <w:tcPr/>
-          <w:p>
-            <w:pPr>
-              <w:pStyle w:val="Compact"/>
-              <w:jc w:val="left"/>
-            </w:pPr>
-            <w:r>
-              <w:t xml:space="preserve">A4</w:t>
+              <w:t xml:space="preserve">y3!=1</w:t>
+            </w:r>
+          </w:p>
+        </w:tc>
+        <w:tc>
+          <w:tcPr/>
+          <w:p>
+            <w:pPr>
+              <w:pStyle w:val="Compact"/>
+              <w:jc w:val="left"/>
+            </w:pPr>
+            <w:r>
+              <w:t xml:space="preserve">A3 не выплачивает джекпот</w:t>
+            </w:r>
+          </w:p>
+        </w:tc>
+        <w:tc>
+          <w:tcPr>
+            <w:vMerge w:val="restart"/>
+          </w:tcPr>
+          <w:p>
+            <w:pPr>
+              <w:pStyle w:val="Compact"/>
+              <w:jc w:val="left"/>
+            </w:pPr>
+            <w:r>
+              <w:t xml:space="preserve">A0</w:t>
             </w:r>
           </w:p>
         </w:tc>
@@ -5222,34 +4990,29 @@
               <w:rPr>
                 <w:rStyle w:val="VerbatimChar"/>
               </w:rPr>
-              <w:t xml:space="preserve">y3!=1</w:t>
-            </w:r>
-          </w:p>
-        </w:tc>
-        <w:tc>
-          <w:tcPr/>
-          <w:p>
-            <w:pPr>
-              <w:pStyle w:val="Compact"/>
-              <w:jc w:val="left"/>
-            </w:pPr>
-            <w:r>
-              <w:t xml:space="preserve">A3 не выплачивает джекпот</w:t>
-            </w:r>
-          </w:p>
-        </w:tc>
-        <w:tc>
-          <w:tcPr>
-            <w:vMerge w:val="restart"/>
-          </w:tcPr>
-          <w:p>
-            <w:pPr>
-              <w:pStyle w:val="Compact"/>
-              <w:jc w:val="left"/>
-            </w:pPr>
-            <w:r>
-              <w:t xml:space="preserve">A0</w:t>
-            </w:r>
+              <w:t xml:space="preserve">y3=1</w:t>
+            </w:r>
+          </w:p>
+        </w:tc>
+        <w:tc>
+          <w:tcPr/>
+          <w:p>
+            <w:pPr>
+              <w:pStyle w:val="Compact"/>
+              <w:jc w:val="left"/>
+            </w:pPr>
+            <w:r>
+              <w:t xml:space="preserve">A3 выплачивает джекпот</w:t>
+            </w:r>
+          </w:p>
+        </w:tc>
+        <w:tc>
+          <w:tcPr>
+            <w:gridSpan w:val="1"/>
+            <w:vMerge w:val="continue"/>
+          </w:tcPr>
+          <w:p>
+            <w:pPr/>
           </w:p>
         </w:tc>
       </w:tr>
@@ -5306,22 +5069,36 @@
               <w:rPr>
                 <w:rStyle w:val="VerbatimChar"/>
               </w:rPr>
-              <w:t xml:space="preserve">y3=1</w:t>
-            </w:r>
-          </w:p>
-        </w:tc>
-        <w:tc>
-          <w:tcPr/>
-          <w:p>
-            <w:pPr>
-              <w:pStyle w:val="Compact"/>
-              <w:jc w:val="left"/>
-            </w:pPr>
-            <w:r>
-              <w:t xml:space="preserve">A3 выплачивает джекпот</w:t>
-            </w:r>
-          </w:p>
-        </w:tc>
+              <w:t xml:space="preserve">y3!=1</w:t>
+            </w:r>
+          </w:p>
+        </w:tc>
+        <w:tc>
+          <w:tcPr/>
+          <w:p>
+            <w:pPr>
+              <w:pStyle w:val="Compact"/>
+              <w:jc w:val="left"/>
+            </w:pPr>
+            <w:r>
+              <w:t xml:space="preserve">A3 не в состоянии Выплата джекпота</w:t>
+            </w:r>
+          </w:p>
+        </w:tc>
+        <w:tc>
+          <w:tcPr/>
+          <w:p>
+            <w:pPr>
+              <w:pStyle w:val="Compact"/>
+              <w:jc w:val="left"/>
+            </w:pPr>
+            <w:r>
+              <w:t xml:space="preserve">A1</w:t>
+            </w:r>
+          </w:p>
+        </w:tc>
+      </w:tr>
+      <w:tr>
         <w:tc>
           <w:tcPr>
             <w:gridSpan w:val="1"/>
@@ -5331,86 +5108,77 @@
             <w:pPr/>
           </w:p>
         </w:tc>
+        <w:tc>
+          <w:tcPr/>
+          <w:p>
+            <w:pPr>
+              <w:pStyle w:val="Compact"/>
+              <w:jc w:val="left"/>
+            </w:pPr>
+            <w:r>
+              <w:t xml:space="preserve">Выплата жетонов завершена</w:t>
+            </w:r>
+          </w:p>
+        </w:tc>
+        <w:tc>
+          <w:tcPr/>
+          <w:p>
+            <w:pPr>
+              <w:pStyle w:val="Compact"/>
+              <w:jc w:val="left"/>
+            </w:pPr>
+            <w:r>
+              <w:rPr>
+                <w:rStyle w:val="VerbatimChar"/>
+              </w:rPr>
+              <w:t xml:space="preserve">e33</w:t>
+            </w:r>
+          </w:p>
+        </w:tc>
+        <w:tc>
+          <w:tcPr/>
+          <w:p>
+            <w:pPr>
+              <w:pStyle w:val="Compact"/>
+              <w:jc w:val="left"/>
+            </w:pPr>
+            <w:r>
+              <w:rPr>
+                <w:rStyle w:val="VerbatimChar"/>
+              </w:rPr>
+              <w:t xml:space="preserve">z31</w:t>
+            </w:r>
+          </w:p>
+        </w:tc>
+        <w:tc>
+          <w:tcPr/>
+          <w:p>
+            <w:pPr>
+              <w:pStyle w:val="Compact"/>
+              <w:jc w:val="left"/>
+            </w:pPr>
+            <w:r>
+              <w:t xml:space="preserve">Обновить индикатор &lt;&lt;Джекпот&gt;&gt;</w:t>
+            </w:r>
+          </w:p>
+        </w:tc>
+        <w:tc>
+          <w:tcPr>
+            <w:vMerge w:val="restart"/>
+          </w:tcPr>
+          <w:p>
+            <w:pPr>
+              <w:pStyle w:val="Compact"/>
+              <w:jc w:val="left"/>
+            </w:pPr>
+            <w:r>
+              <w:t xml:space="preserve">Среда</w:t>
+            </w:r>
+          </w:p>
+        </w:tc>
       </w:tr>
       <w:tr>
         <w:tc>
-          <w:tcPr>
-            <w:gridSpan w:val="1"/>
-            <w:vMerge w:val="continue"/>
-          </w:tcPr>
-          <w:p>
-            <w:pPr/>
-          </w:p>
-        </w:tc>
-        <w:tc>
-          <w:tcPr/>
-          <w:p>
-            <w:pPr>
-              <w:pStyle w:val="Compact"/>
-              <w:jc w:val="left"/>
-            </w:pPr>
-            <w:r>
-              <w:t xml:space="preserve">Выплата жетонов завершена</w:t>
-            </w:r>
-          </w:p>
-        </w:tc>
-        <w:tc>
-          <w:tcPr/>
-          <w:p>
-            <w:pPr>
-              <w:pStyle w:val="Compact"/>
-              <w:jc w:val="left"/>
-            </w:pPr>
-            <w:r>
-              <w:rPr>
-                <w:rStyle w:val="VerbatimChar"/>
-              </w:rPr>
-              <w:t xml:space="preserve">e33</w:t>
-            </w:r>
-          </w:p>
-        </w:tc>
-        <w:tc>
-          <w:tcPr/>
-          <w:p>
-            <w:pPr>
-              <w:pStyle w:val="Compact"/>
-              <w:jc w:val="left"/>
-            </w:pPr>
-            <w:r>
-              <w:rPr>
-                <w:rStyle w:val="VerbatimChar"/>
-              </w:rPr>
-              <w:t xml:space="preserve">y3!=1</w:t>
-            </w:r>
-          </w:p>
-        </w:tc>
-        <w:tc>
-          <w:tcPr/>
-          <w:p>
-            <w:pPr>
-              <w:pStyle w:val="Compact"/>
-              <w:jc w:val="left"/>
-            </w:pPr>
-            <w:r>
-              <w:t xml:space="preserve">A3 не в состоянии Выплата джекпота</w:t>
-            </w:r>
-          </w:p>
-        </w:tc>
-        <w:tc>
-          <w:tcPr/>
-          <w:p>
-            <w:pPr>
-              <w:pStyle w:val="Compact"/>
-              <w:jc w:val="left"/>
-            </w:pPr>
-            <w:r>
-              <w:t xml:space="preserve">A1</w:t>
-            </w:r>
-          </w:p>
-        </w:tc>
-      </w:tr>
-      <w:tr>
-        <w:tc>
           <w:tcPr/>
           <w:p>
             <w:pPr>
@@ -5447,73 +5215,6 @@
               </w:rPr>
               <w:t xml:space="preserve">y2=3</w:t>
             </w:r>
-          </w:p>
-        </w:tc>
-        <w:tc>
-          <w:tcPr/>
-          <w:p>
-            <w:pPr>
-              <w:pStyle w:val="Compact"/>
-              <w:jc w:val="left"/>
-            </w:pPr>
-            <w:r>
-              <w:rPr>
-                <w:rStyle w:val="VerbatimChar"/>
-              </w:rPr>
-              <w:t xml:space="preserve">z31</w:t>
-            </w:r>
-          </w:p>
-        </w:tc>
-        <w:tc>
-          <w:tcPr/>
-          <w:p>
-            <w:pPr>
-              <w:pStyle w:val="Compact"/>
-              <w:jc w:val="left"/>
-            </w:pPr>
-            <w:r>
-              <w:t xml:space="preserve">Обновить индикатор &lt;&lt;Джекпот&gt;&gt;</w:t>
-            </w:r>
-          </w:p>
-        </w:tc>
-        <w:tc>
-          <w:tcPr>
-            <w:vMerge w:val="restart"/>
-          </w:tcPr>
-          <w:p>
-            <w:pPr>
-              <w:pStyle w:val="Compact"/>
-              <w:jc w:val="left"/>
-            </w:pPr>
-            <w:r>
-              <w:t xml:space="preserve">Среда</w:t>
-            </w:r>
-          </w:p>
-        </w:tc>
-      </w:tr>
-      <w:tr>
-        <w:tc>
-          <w:tcPr/>
-          <w:p>
-            <w:pPr>
-              <w:pStyle w:val="Compact"/>
-            </w:pPr>
-          </w:p>
-        </w:tc>
-        <w:tc>
-          <w:tcPr/>
-          <w:p>
-            <w:pPr>
-              <w:pStyle w:val="Compact"/>
-            </w:pPr>
-          </w:p>
-        </w:tc>
-        <w:tc>
-          <w:tcPr/>
-          <w:p>
-            <w:pPr>
-              <w:pStyle w:val="Compact"/>
-            </w:pPr>
           </w:p>
         </w:tc>
         <w:tc>
@@ -5775,7 +5476,28 @@
         <w:t xml:space="preserve"> </w:t>
       </w:r>
       <w:r>
-        <w:t xml:space="preserve">по окончании выдачи жетонов. На этом переходе</w:t>
+        <w:t xml:space="preserve">по окончании выдачи жетонов, и при этом обнуляет джекпот. Через</w:t>
+      </w:r>
+      <w:r>
+        <w:t xml:space="preserve"> </w:t>
+      </w:r>
+      <w:r>
+        <w:t xml:space="preserve">вложенность то же событие</w:t>
+      </w:r>
+      <w:r>
+        <w:t xml:space="preserve"> </w:t>
+      </w:r>
+      <w:r>
+        <w:rPr>
+          <w:rStyle w:val="VerbatimChar"/>
+        </w:rPr>
+        <w:t xml:space="preserve">e33</w:t>
+      </w:r>
+      <w:r>
+        <w:t xml:space="preserve"> </w:t>
+      </w:r>
+      <w:r>
+        <w:t xml:space="preserve">поступает автомату</w:t>
       </w:r>
       <w:r>
         <w:t xml:space="preserve"> </w:t>
@@ -5789,66 +5511,13 @@
           </m:e>
           <m:sub>
             <m:r>
-              <m:t>3</m:t>
+              <m:t>4</m:t>
             </m:r>
           </m:sub>
         </m:sSub>
       </m:oMath>
       <w:r>
-        <w:t xml:space="preserve"> </w:t>
-      </w:r>
-      <w:r>
-        <w:t xml:space="preserve">обнуляет джекпот и</w:t>
-      </w:r>
-      <w:r>
-        <w:t xml:space="preserve"> </w:t>
-      </w:r>
-      <w:r>
-        <w:t xml:space="preserve">адресует автомату</w:t>
-      </w:r>
-      <w:r>
-        <w:t xml:space="preserve"> </w:t>
-      </w:r>
-      <m:oMath>
-        <m:sSub>
-          <m:e>
-            <m:r>
-              <m:t>A</m:t>
-            </m:r>
-          </m:e>
-          <m:sub>
-            <m:r>
-              <m:t>4</m:t>
-            </m:r>
-          </m:sub>
-        </m:sSub>
-      </m:oMath>
-      <w:r>
-        <w:t xml:space="preserve"> </w:t>
-      </w:r>
-      <w:r>
-        <w:t xml:space="preserve">событие</w:t>
-      </w:r>
-      <w:r>
-        <w:t xml:space="preserve"> </w:t>
-      </w:r>
-      <w:r>
-        <w:rPr>
-          <w:rStyle w:val="VerbatimChar"/>
-        </w:rPr>
-        <w:t xml:space="preserve">e40</w:t>
-      </w:r>
-      <w:r>
-        <w:t xml:space="preserve"> </w:t>
-      </w:r>
-      <w:r>
-        <w:t xml:space="preserve">(«Выплата джекпота</w:t>
-      </w:r>
-      <w:r>
-        <w:t xml:space="preserve"> </w:t>
-      </w:r>
-      <w:r>
-        <w:t xml:space="preserve">завершена»).</w:t>
+        <w:t xml:space="preserve">.</w:t>
       </w:r>
     </w:p>
     <w:bookmarkEnd w:id="37"/>
@@ -6402,22 +6071,22 @@
               <w:jc w:val="left"/>
             </w:pPr>
             <w:r>
-              <w:t xml:space="preserve">Выплата джекпота завершена</w:t>
-            </w:r>
-          </w:p>
-        </w:tc>
-        <w:tc>
-          <w:tcPr/>
-          <w:p>
-            <w:pPr>
-              <w:pStyle w:val="Compact"/>
-              <w:jc w:val="left"/>
-            </w:pPr>
-            <w:r>
-              <w:rPr>
-                <w:rStyle w:val="VerbatimChar"/>
-              </w:rPr>
-              <w:t xml:space="preserve">e40</w:t>
+              <w:t xml:space="preserve">Выплата жетонов завершена</w:t>
+            </w:r>
+          </w:p>
+        </w:tc>
+        <w:tc>
+          <w:tcPr/>
+          <w:p>
+            <w:pPr>
+              <w:pStyle w:val="Compact"/>
+              <w:jc w:val="left"/>
+            </w:pPr>
+            <w:r>
+              <w:rPr>
+                <w:rStyle w:val="VerbatimChar"/>
+              </w:rPr>
+              <w:t xml:space="preserve">e33</w:t>
             </w:r>
           </w:p>
         </w:tc>
@@ -6766,19 +6435,19 @@
         <w:rPr>
           <w:rStyle w:val="VerbatimChar"/>
         </w:rPr>
-        <w:t xml:space="preserve">e40</w:t>
-      </w:r>
-      <w:r>
-        <w:t xml:space="preserve"> </w:t>
-      </w:r>
-      <w:r>
-        <w:t xml:space="preserve">гварда не требует: это событие</w:t>
-      </w:r>
-      <w:r>
-        <w:t xml:space="preserve"> </w:t>
-      </w:r>
-      <w:r>
-        <w:t xml:space="preserve">адресовано</w:t>
+        <w:t xml:space="preserve">e33</w:t>
+      </w:r>
+      <w:r>
+        <w:t xml:space="preserve"> </w:t>
+      </w:r>
+      <w:r>
+        <w:t xml:space="preserve">гварда не требует. Это событие</w:t>
+      </w:r>
+      <w:r>
+        <w:t xml:space="preserve"> </w:t>
+      </w:r>
+      <w:r>
+        <w:t xml:space="preserve">адресовано автоматом</w:t>
       </w:r>
       <w:r>
         <w:t xml:space="preserve"> </w:t>
@@ -6792,7 +6461,7 @@
           </m:e>
           <m:sub>
             <m:r>
-              <m:t>4</m:t>
+              <m:t>0</m:t>
             </m:r>
           </m:sub>
         </m:sSub>
@@ -6801,7 +6470,7 @@
         <w:t xml:space="preserve"> </w:t>
       </w:r>
       <w:r>
-        <w:t xml:space="preserve">автоматом</w:t>
+        <w:t xml:space="preserve">автомату</w:t>
       </w:r>
       <w:r>
         <w:t xml:space="preserve"> </w:t>
@@ -6824,7 +6493,7 @@
         <w:t xml:space="preserve"> </w:t>
       </w:r>
       <w:r>
-        <w:t xml:space="preserve">и поступает только в момент выхода</w:t>
+        <w:t xml:space="preserve">и поступает</w:t>
       </w:r>
       <w:r>
         <w:t xml:space="preserve"> </w:t>
@@ -6838,7 +6507,7 @@
           </m:e>
           <m:sub>
             <m:r>
-              <m:t>3</m:t>
+              <m:t>4</m:t>
             </m:r>
           </m:sub>
         </m:sSub>
@@ -6847,25 +6516,13 @@
         <w:t xml:space="preserve"> </w:t>
       </w:r>
       <w:r>
-        <w:t xml:space="preserve">из состояния «Выплата джекпота». Отдельное событие необходимо, поскольку</w:t>
-      </w:r>
-      <w:r>
-        <w:t xml:space="preserve"> </w:t>
-      </w:r>
-      <w:r>
-        <w:t xml:space="preserve">событие</w:t>
-      </w:r>
-      <w:r>
-        <w:t xml:space="preserve"> </w:t>
-      </w:r>
-      <w:r>
-        <w:rPr>
-          <w:rStyle w:val="VerbatimChar"/>
-        </w:rPr>
-        <w:t xml:space="preserve">e33</w:t>
-      </w:r>
-      <w:r>
-        <w:t xml:space="preserve">, вызывающее этот выход, адресовано автоматом</w:t>
+        <w:t xml:space="preserve">через</w:t>
+      </w:r>
+      <w:r>
+        <w:t xml:space="preserve"> </w:t>
+      </w:r>
+      <w:r>
+        <w:t xml:space="preserve">вложенность только тогда, когда</w:t>
       </w:r>
       <w:r>
         <w:t xml:space="preserve"> </w:t>
@@ -6879,7 +6536,7 @@
           </m:e>
           <m:sub>
             <m:r>
-              <m:t>0</m:t>
+              <m:t>3</m:t>
             </m:r>
           </m:sub>
         </m:sSub>
@@ -6888,7 +6545,13 @@
         <w:t xml:space="preserve"> </w:t>
       </w:r>
       <w:r>
-        <w:t xml:space="preserve">автомату</w:t>
+        <w:t xml:space="preserve">находится в состоянии «Выплата</w:t>
+      </w:r>
+      <w:r>
+        <w:t xml:space="preserve"> </w:t>
+      </w:r>
+      <w:r>
+        <w:t xml:space="preserve">джекпота», – в том же переходе произведения, в котором</w:t>
       </w:r>
       <w:r>
         <w:t xml:space="preserve"> </w:t>
@@ -6911,35 +6574,18 @@
         <w:t xml:space="preserve"> </w:t>
       </w:r>
       <w:r>
-        <w:t xml:space="preserve">и автомату</w:t>
-      </w:r>
-      <w:r>
-        <w:t xml:space="preserve"> </w:t>
-      </w:r>
-      <m:oMath>
-        <m:sSub>
-          <m:e>
-            <m:r>
-              <m:t>A</m:t>
-            </m:r>
-          </m:e>
-          <m:sub>
-            <m:r>
-              <m:t>4</m:t>
-            </m:r>
-          </m:sub>
-        </m:sSub>
-      </m:oMath>
-      <w:r>
-        <w:t xml:space="preserve"> </w:t>
-      </w:r>
-      <w:r>
-        <w:t xml:space="preserve">не поступает.</w:t>
+        <w:t xml:space="preserve">выходит из</w:t>
+      </w:r>
+      <w:r>
+        <w:t xml:space="preserve"> </w:t>
+      </w:r>
+      <w:r>
+        <w:t xml:space="preserve">этого состояния (доработка 4).</w:t>
       </w:r>
     </w:p>
     <w:bookmarkEnd w:id="41"/>
     <w:bookmarkEnd w:id="42"/>
-    <w:bookmarkStart w:id="48" w:name="sec:fixes"/>
+    <w:bookmarkStart w:id="49" w:name="sec:fixes"/>
     <w:p>
       <w:pPr>
         <w:pStyle w:val="Heading1"/>
@@ -7530,23 +7176,23 @@
         <w:t xml:space="preserve"> </w:t>
       </w:r>
       <w:r>
-        <w:t xml:space="preserve">поступает вложенному автомату только в момент перехода</w:t>
-      </w:r>
-      <w:r>
-        <w:t xml:space="preserve"> </w:t>
-      </w:r>
-      <w:r>
-        <w:t xml:space="preserve">автомата-отправителя.</w:t>
+        <w:t xml:space="preserve">поступает вложенному автомату только вместе с переходом, в котором его</w:t>
+      </w:r>
+      <w:r>
+        <w:t xml:space="preserve"> </w:t>
+      </w:r>
+      <w:r>
+        <w:t xml:space="preserve">получает родительский автомат (доработка 4).</w:t>
       </w:r>
     </w:p>
     <w:bookmarkEnd w:id="45"/>
-    <w:bookmarkStart w:id="46" w:name="замечание-о-порядке-умножения"/>
+    <w:bookmarkStart w:id="46" w:name="доработка-4"/>
     <w:p>
       <w:pPr>
         <w:pStyle w:val="Heading2"/>
       </w:pPr>
       <w:r>
-        <w:t xml:space="preserve">Замечание о порядке умножения</w:t>
+        <w:t xml:space="preserve">Доработка 4</w:t>
       </w:r>
     </w:p>
     <w:p>
@@ -7554,184 +7200,17 @@
         <w:pStyle w:val="FirstParagraph"/>
       </w:pPr>
       <w:r>
-        <w:t xml:space="preserve">Если гвард автомата</w:t>
-      </w:r>
-      <w:r>
-        <w:t xml:space="preserve"> </w:t>
-      </w:r>
-      <m:oMath>
-        <m:r>
-          <m:t>Y</m:t>
-        </m:r>
-      </m:oMath>
-      <w:r>
-        <w:t xml:space="preserve"> </w:t>
-      </w:r>
-      <w:r>
-        <w:t xml:space="preserve">ссылается на состояние автомата</w:t>
-      </w:r>
-      <w:r>
-        <w:t xml:space="preserve"> </w:t>
-      </w:r>
-      <m:oMath>
-        <m:r>
-          <m:t>X</m:t>
-        </m:r>
-      </m:oMath>
-      <w:r>
-        <w:t xml:space="preserve">, то</w:t>
-      </w:r>
-      <w:r>
-        <w:t xml:space="preserve"> </w:t>
-      </w:r>
-      <m:oMath>
-        <m:r>
-          <m:t>X</m:t>
-        </m:r>
-      </m:oMath>
-      <w:r>
-        <w:t xml:space="preserve"> </w:t>
-      </w:r>
-      <w:r>
-        <w:t xml:space="preserve">должен</w:t>
-      </w:r>
-      <w:r>
-        <w:t xml:space="preserve"> </w:t>
-      </w:r>
-      <w:r>
-        <w:t xml:space="preserve">быть включён в произведение не позднее</w:t>
-      </w:r>
-      <w:r>
-        <w:t xml:space="preserve"> </w:t>
-      </w:r>
-      <m:oMath>
-        <m:r>
-          <m:t>Y</m:t>
-        </m:r>
-      </m:oMath>
-      <w:r>
-        <w:t xml:space="preserve">. При нарушении этого требования</w:t>
-      </w:r>
-      <w:r>
-        <w:t xml:space="preserve"> </w:t>
-      </w:r>
-      <w:r>
-        <w:t xml:space="preserve">результат умножения может не совпадать с поведением исходной системы: так</w:t>
-      </w:r>
-      <w:r>
-        <w:t xml:space="preserve"> </w:t>
-      </w:r>
-      <w:r>
-        <w:t xml:space="preserve">происходит, например, при умножении в порядке</w:t>
-      </w:r>
-      <w:r>
-        <w:t xml:space="preserve"> </w:t>
-      </w:r>
-      <m:oMath>
-        <m:sSub>
-          <m:e>
-            <m:r>
-              <m:t>A</m:t>
-            </m:r>
-          </m:e>
-          <m:sub>
-            <m:r>
-              <m:t>0</m:t>
-            </m:r>
-          </m:sub>
-        </m:sSub>
-      </m:oMath>
-      <w:r>
-        <w:t xml:space="preserve">,</w:t>
-      </w:r>
-      <w:r>
-        <w:t xml:space="preserve"> </w:t>
-      </w:r>
-      <m:oMath>
-        <m:sSub>
-          <m:e>
-            <m:r>
-              <m:t>A</m:t>
-            </m:r>
-          </m:e>
-          <m:sub>
-            <m:r>
-              <m:t>2</m:t>
-            </m:r>
-          </m:sub>
-        </m:sSub>
-      </m:oMath>
-      <w:r>
-        <w:t xml:space="preserve">,</w:t>
-      </w:r>
-      <w:r>
-        <w:t xml:space="preserve"> </w:t>
-      </w:r>
-      <m:oMath>
-        <m:sSub>
-          <m:e>
-            <m:r>
-              <m:t>A</m:t>
-            </m:r>
-          </m:e>
-          <m:sub>
-            <m:r>
-              <m:t>1</m:t>
-            </m:r>
-          </m:sub>
-        </m:sSub>
-      </m:oMath>
-      <w:r>
-        <w:t xml:space="preserve">,</w:t>
-      </w:r>
-      <w:r>
-        <w:t xml:space="preserve"> </w:t>
-      </w:r>
-      <w:r>
-        <w:t xml:space="preserve">поскольку</w:t>
-      </w:r>
-      <w:r>
-        <w:t xml:space="preserve"> </w:t>
-      </w:r>
-      <m:oMath>
-        <m:sSub>
-          <m:e>
-            <m:r>
-              <m:t>A</m:t>
-            </m:r>
-          </m:e>
-          <m:sub>
-            <m:r>
-              <m:t>0</m:t>
-            </m:r>
-          </m:sub>
-        </m:sSub>
-      </m:oMath>
-      <w:r>
-        <w:t xml:space="preserve"> </w:t>
-      </w:r>
-      <w:r>
-        <w:t xml:space="preserve">содержит гвард на состояние</w:t>
-      </w:r>
-      <w:r>
-        <w:t xml:space="preserve"> </w:t>
-      </w:r>
-      <m:oMath>
-        <m:sSub>
-          <m:e>
-            <m:r>
-              <m:t>A</m:t>
-            </m:r>
-          </m:e>
-          <m:sub>
-            <m:r>
-              <m:t>1</m:t>
-            </m:r>
-          </m:sub>
-        </m:sSub>
-      </m:oMath>
-      <w:r>
-        <w:t xml:space="preserve">.</w:t>
+        <w:rPr>
+          <w:bCs/>
+          <w:b/>
+        </w:rPr>
+        <w:t xml:space="preserve">Было.</w:t>
+      </w:r>
+      <w:r>
+        <w:t xml:space="preserve"> </w:t>
+      </w:r>
+      <w:r>
+        <w:t xml:space="preserve">Адресованное событие поступало только автомату-получателю.</w:t>
       </w:r>
     </w:p>
     <w:p>
@@ -7739,37 +7218,23 @@
         <w:pStyle w:val="BodyText"/>
       </w:pPr>
       <w:r>
-        <w:t xml:space="preserve">Для адресованных событий аналогичное требование снято. Ранее, если</w:t>
-      </w:r>
-      <w:r>
-        <w:t xml:space="preserve"> </w:t>
-      </w:r>
-      <w:r>
-        <w:t xml:space="preserve">отправитель адресованного события ещё не был включён в произведение,</w:t>
-      </w:r>
-      <w:r>
-        <w:t xml:space="preserve"> </w:t>
-      </w:r>
-      <w:r>
-        <w:t xml:space="preserve">получатель реагировал на это событие так, будто оно может возникнуть в</w:t>
-      </w:r>
-      <w:r>
-        <w:t xml:space="preserve"> </w:t>
-      </w:r>
-      <w:r>
-        <w:t xml:space="preserve">любой момент, что порождало лишние состояния. Теперь получатель не</w:t>
-      </w:r>
-      <w:r>
-        <w:t xml:space="preserve"> </w:t>
-      </w:r>
-      <w:r>
-        <w:t xml:space="preserve">реагирует на такое событие, пока отправитель не включён в произведение.</w:t>
-      </w:r>
-      <w:r>
-        <w:t xml:space="preserve"> </w:t>
-      </w:r>
-      <w:r>
-        <w:t xml:space="preserve">Это проверено построением произведения системы из</w:t>
+        <w:rPr>
+          <w:bCs/>
+          <w:b/>
+        </w:rPr>
+        <w:t xml:space="preserve">Что ограничивало.</w:t>
+      </w:r>
+      <w:r>
+        <w:t xml:space="preserve"> </w:t>
+      </w:r>
+      <w:r>
+        <w:t xml:space="preserve">Автомат, вложенный в состояние получателя, не</w:t>
+      </w:r>
+      <w:r>
+        <w:t xml:space="preserve"> </w:t>
+      </w:r>
+      <w:r>
+        <w:t xml:space="preserve">мог отреагировать на такое событие через вложенность. В системе из</w:t>
       </w:r>
       <w:r>
         <w:t xml:space="preserve"> </w:t>
@@ -7789,7 +7254,7 @@
         <w:t xml:space="preserve"> </w:t>
       </w:r>
       <w:r>
-        <w:t xml:space="preserve">в порядке</w:t>
+        <w:t xml:space="preserve">автомат</w:t>
       </w:r>
       <w:r>
         <w:t xml:space="preserve"> </w:t>
@@ -7803,13 +7268,19 @@
           </m:e>
           <m:sub>
             <m:r>
-              <m:t>0</m:t>
+              <m:t>4</m:t>
             </m:r>
           </m:sub>
         </m:sSub>
       </m:oMath>
       <w:r>
-        <w:t xml:space="preserve">,</w:t>
+        <w:t xml:space="preserve">, вложенный в состояние «Выплата</w:t>
+      </w:r>
+      <w:r>
+        <w:t xml:space="preserve"> </w:t>
+      </w:r>
+      <w:r>
+        <w:t xml:space="preserve">джекпота» автомата</w:t>
       </w:r>
       <w:r>
         <w:t xml:space="preserve"> </w:t>
@@ -7823,13 +7294,31 @@
           </m:e>
           <m:sub>
             <m:r>
-              <m:t>1</m:t>
+              <m:t>3</m:t>
             </m:r>
           </m:sub>
         </m:sSub>
       </m:oMath>
       <w:r>
+        <w:t xml:space="preserve">, не мог отреагировать на событие</w:t>
+      </w:r>
+      <w:r>
+        <w:t xml:space="preserve"> </w:t>
+      </w:r>
+      <w:r>
+        <w:rPr>
+          <w:rStyle w:val="VerbatimChar"/>
+        </w:rPr>
+        <w:t xml:space="preserve">e33</w:t>
+      </w:r>
+      <w:r>
         <w:t xml:space="preserve">,</w:t>
+      </w:r>
+      <w:r>
+        <w:t xml:space="preserve"> </w:t>
+      </w:r>
+      <w:r>
+        <w:t xml:space="preserve">по которому</w:t>
       </w:r>
       <w:r>
         <w:t xml:space="preserve"> </w:t>
@@ -7843,13 +7332,162 @@
           </m:e>
           <m:sub>
             <m:r>
-              <m:t>2</m:t>
+              <m:t>3</m:t>
             </m:r>
           </m:sub>
         </m:sSub>
       </m:oMath>
       <w:r>
-        <w:t xml:space="preserve">,</w:t>
+        <w:t xml:space="preserve"> </w:t>
+      </w:r>
+      <w:r>
+        <w:t xml:space="preserve">выходит из этого состояния.</w:t>
+      </w:r>
+    </w:p>
+    <w:p>
+      <w:pPr>
+        <w:pStyle w:val="BodyText"/>
+      </w:pPr>
+      <w:r>
+        <w:rPr>
+          <w:bCs/>
+          <w:b/>
+        </w:rPr>
+        <w:t xml:space="preserve">Как исправили.</w:t>
+      </w:r>
+      <w:r>
+        <w:t xml:space="preserve"> </w:t>
+      </w:r>
+      <w:r>
+        <w:t xml:space="preserve">Адресованное событие поступает получателю и</w:t>
+      </w:r>
+      <w:r>
+        <w:t xml:space="preserve"> </w:t>
+      </w:r>
+      <w:r>
+        <w:t xml:space="preserve">автоматам, вложенным в состояние, в котором получатель находился до</w:t>
+      </w:r>
+      <w:r>
+        <w:t xml:space="preserve"> </w:t>
+      </w:r>
+      <w:r>
+        <w:t xml:space="preserve">перехода; их реакции входят в тот же переход произведения. Если такой</w:t>
+      </w:r>
+      <w:r>
+        <w:t xml:space="preserve"> </w:t>
+      </w:r>
+      <w:r>
+        <w:t xml:space="preserve">вложенный автомат ещё не включён в произведение, переход произведения</w:t>
+      </w:r>
+      <w:r>
+        <w:t xml:space="preserve"> </w:t>
+      </w:r>
+      <w:r>
+        <w:t xml:space="preserve">сохраняет отметку о недоставленном событии. Когда автомат включается в</w:t>
+      </w:r>
+      <w:r>
+        <w:t xml:space="preserve"> </w:t>
+      </w:r>
+      <w:r>
+        <w:t xml:space="preserve">произведение, отметка обрабатывается как адресованное ему событие. Тот же</w:t>
+      </w:r>
+      <w:r>
+        <w:t xml:space="preserve"> </w:t>
+      </w:r>
+      <w:r>
+        <w:t xml:space="preserve">порядок доставки используется в эталонной модели системы, с которой</w:t>
+      </w:r>
+      <w:r>
+        <w:t xml:space="preserve"> </w:t>
+      </w:r>
+      <w:r>
+        <w:t xml:space="preserve">сравнивается произведение на этапе валидации.</w:t>
+      </w:r>
+    </w:p>
+    <w:bookmarkEnd w:id="46"/>
+    <w:bookmarkStart w:id="47" w:name="замечание-о-порядке-умножения"/>
+    <w:p>
+      <w:pPr>
+        <w:pStyle w:val="Heading2"/>
+      </w:pPr>
+      <w:r>
+        <w:t xml:space="preserve">Замечание о порядке умножения</w:t>
+      </w:r>
+    </w:p>
+    <w:p>
+      <w:pPr>
+        <w:pStyle w:val="FirstParagraph"/>
+      </w:pPr>
+      <w:r>
+        <w:t xml:space="preserve">Если гвард автомата</w:t>
+      </w:r>
+      <w:r>
+        <w:t xml:space="preserve"> </w:t>
+      </w:r>
+      <m:oMath>
+        <m:r>
+          <m:t>Y</m:t>
+        </m:r>
+      </m:oMath>
+      <w:r>
+        <w:t xml:space="preserve"> </w:t>
+      </w:r>
+      <w:r>
+        <w:t xml:space="preserve">ссылается на состояние автомата</w:t>
+      </w:r>
+      <w:r>
+        <w:t xml:space="preserve"> </w:t>
+      </w:r>
+      <m:oMath>
+        <m:r>
+          <m:t>X</m:t>
+        </m:r>
+      </m:oMath>
+      <w:r>
+        <w:t xml:space="preserve">, то</w:t>
+      </w:r>
+      <w:r>
+        <w:t xml:space="preserve"> </w:t>
+      </w:r>
+      <m:oMath>
+        <m:r>
+          <m:t>X</m:t>
+        </m:r>
+      </m:oMath>
+      <w:r>
+        <w:t xml:space="preserve"> </w:t>
+      </w:r>
+      <w:r>
+        <w:t xml:space="preserve">должен</w:t>
+      </w:r>
+      <w:r>
+        <w:t xml:space="preserve"> </w:t>
+      </w:r>
+      <w:r>
+        <w:t xml:space="preserve">быть включён в произведение не позднее</w:t>
+      </w:r>
+      <w:r>
+        <w:t xml:space="preserve"> </w:t>
+      </w:r>
+      <m:oMath>
+        <m:r>
+          <m:t>Y</m:t>
+        </m:r>
+      </m:oMath>
+      <w:r>
+        <w:t xml:space="preserve">. При нарушении этого требования</w:t>
+      </w:r>
+      <w:r>
+        <w:t xml:space="preserve"> </w:t>
+      </w:r>
+      <w:r>
+        <w:t xml:space="preserve">результат умножения может не совпадать с поведением исходной системы: так</w:t>
+      </w:r>
+      <w:r>
+        <w:t xml:space="preserve"> </w:t>
+      </w:r>
+      <w:r>
+        <w:t xml:space="preserve">происходит, например, при умножении в порядке</w:t>
       </w:r>
       <w:r>
         <w:t xml:space="preserve"> </w:t>
@@ -7863,7 +7501,7 @@
           </m:e>
           <m:sub>
             <m:r>
-              <m:t>4</m:t>
+              <m:t>0</m:t>
             </m:r>
           </m:sub>
         </m:sSub>
@@ -7883,12 +7521,81 @@
           </m:e>
           <m:sub>
             <m:r>
-              <m:t>3</m:t>
+              <m:t>2</m:t>
             </m:r>
           </m:sub>
         </m:sSub>
       </m:oMath>
       <w:r>
+        <w:t xml:space="preserve">,</w:t>
+      </w:r>
+      <w:r>
+        <w:t xml:space="preserve"> </w:t>
+      </w:r>
+      <m:oMath>
+        <m:sSub>
+          <m:e>
+            <m:r>
+              <m:t>A</m:t>
+            </m:r>
+          </m:e>
+          <m:sub>
+            <m:r>
+              <m:t>1</m:t>
+            </m:r>
+          </m:sub>
+        </m:sSub>
+      </m:oMath>
+      <w:r>
+        <w:t xml:space="preserve">,</w:t>
+      </w:r>
+      <w:r>
+        <w:t xml:space="preserve"> </w:t>
+      </w:r>
+      <w:r>
+        <w:t xml:space="preserve">поскольку</w:t>
+      </w:r>
+      <w:r>
+        <w:t xml:space="preserve"> </w:t>
+      </w:r>
+      <m:oMath>
+        <m:sSub>
+          <m:e>
+            <m:r>
+              <m:t>A</m:t>
+            </m:r>
+          </m:e>
+          <m:sub>
+            <m:r>
+              <m:t>0</m:t>
+            </m:r>
+          </m:sub>
+        </m:sSub>
+      </m:oMath>
+      <w:r>
+        <w:t xml:space="preserve"> </w:t>
+      </w:r>
+      <w:r>
+        <w:t xml:space="preserve">содержит гвард на состояние</w:t>
+      </w:r>
+      <w:r>
+        <w:t xml:space="preserve"> </w:t>
+      </w:r>
+      <m:oMath>
+        <m:sSub>
+          <m:e>
+            <m:r>
+              <m:t>A</m:t>
+            </m:r>
+          </m:e>
+          <m:sub>
+            <m:r>
+              <m:t>1</m:t>
+            </m:r>
+          </m:sub>
+        </m:sSub>
+      </m:oMath>
+      <w:r>
         <w:t xml:space="preserve">.</w:t>
       </w:r>
     </w:p>
@@ -7897,17 +7604,150 @@
         <w:pStyle w:val="BodyText"/>
       </w:pPr>
       <w:r>
-        <w:t xml:space="preserve">Снятие требования для гвардов и описание всех допустимых порядков</w:t>
-      </w:r>
-      <w:r>
-        <w:t xml:space="preserve"> </w:t>
-      </w:r>
-      <w:r>
-        <w:t xml:space="preserve">умножения остаются предметом дальнейшей работы.</w:t>
+        <w:t xml:space="preserve">Для адресованных событий, поступающих получателю напрямую, аналогичное</w:t>
+      </w:r>
+      <w:r>
+        <w:t xml:space="preserve"> </w:t>
+      </w:r>
+      <w:r>
+        <w:t xml:space="preserve">требование снято. Ранее, если отправитель адресованного события ещё не был</w:t>
+      </w:r>
+      <w:r>
+        <w:t xml:space="preserve"> </w:t>
+      </w:r>
+      <w:r>
+        <w:t xml:space="preserve">включён в произведение, получатель реагировал на это событие так, будто</w:t>
+      </w:r>
+      <w:r>
+        <w:t xml:space="preserve"> </w:t>
+      </w:r>
+      <w:r>
+        <w:t xml:space="preserve">оно может возникнуть в любой момент, что порождало лишние состояния.</w:t>
+      </w:r>
+      <w:r>
+        <w:t xml:space="preserve"> </w:t>
+      </w:r>
+      <w:r>
+        <w:t xml:space="preserve">Теперь получатель не реагирует на такое событие, пока отправитель не</w:t>
+      </w:r>
+      <w:r>
+        <w:t xml:space="preserve"> </w:t>
+      </w:r>
+      <w:r>
+        <w:t xml:space="preserve">включён в произведение.</w:t>
       </w:r>
     </w:p>
-    <w:bookmarkEnd w:id="46"/>
-    <w:bookmarkStart w:id="47" w:name="X67dd4598854beb9333d290fef858c89026be88c"/>
+    <w:p>
+      <w:pPr>
+        <w:pStyle w:val="BodyText"/>
+      </w:pPr>
+      <w:r>
+        <w:t xml:space="preserve">Для адресованных событий, поступающих через вложенность (доработка 4),</w:t>
+      </w:r>
+      <w:r>
+        <w:t xml:space="preserve"> </w:t>
+      </w:r>
+      <w:r>
+        <w:t xml:space="preserve">вложенный автомат должен быть включён в произведение после родительского:</w:t>
+      </w:r>
+      <w:r>
+        <w:t xml:space="preserve"> </w:t>
+      </w:r>
+      <w:r>
+        <w:t xml:space="preserve">иначе на момент доставки события родительскому автомату вложенный уже</w:t>
+      </w:r>
+      <w:r>
+        <w:t xml:space="preserve"> </w:t>
+      </w:r>
+      <w:r>
+        <w:t xml:space="preserve">входит в произведение, отметка о недоставленном событии не создаётся, и</w:t>
+      </w:r>
+      <w:r>
+        <w:t xml:space="preserve"> </w:t>
+      </w:r>
+      <w:r>
+        <w:t xml:space="preserve">его реакция теряется. В системе из раздела </w:t>
+      </w:r>
+      <w:hyperlink w:anchor="sec:system">
+        <w:r>
+          <w:rPr>
+            <w:rStyle w:val="Hyperlink"/>
+          </w:rPr>
+          <w:t xml:space="preserve">2</w:t>
+        </w:r>
+      </w:hyperlink>
+      <w:r>
+        <w:t xml:space="preserve"> </w:t>
+      </w:r>
+      <w:r>
+        <w:t xml:space="preserve">поэтому</w:t>
+      </w:r>
+      <w:r>
+        <w:t xml:space="preserve"> </w:t>
+      </w:r>
+      <m:oMath>
+        <m:sSub>
+          <m:e>
+            <m:r>
+              <m:t>A</m:t>
+            </m:r>
+          </m:e>
+          <m:sub>
+            <m:r>
+              <m:t>4</m:t>
+            </m:r>
+          </m:sub>
+        </m:sSub>
+      </m:oMath>
+      <w:r>
+        <w:t xml:space="preserve"> </w:t>
+      </w:r>
+      <w:r>
+        <w:t xml:space="preserve">умножается после</w:t>
+      </w:r>
+      <w:r>
+        <w:t xml:space="preserve"> </w:t>
+      </w:r>
+      <m:oMath>
+        <m:sSub>
+          <m:e>
+            <m:r>
+              <m:t>A</m:t>
+            </m:r>
+          </m:e>
+          <m:sub>
+            <m:r>
+              <m:t>3</m:t>
+            </m:r>
+          </m:sub>
+        </m:sSub>
+      </m:oMath>
+      <w:r>
+        <w:t xml:space="preserve">.</w:t>
+      </w:r>
+    </w:p>
+    <w:p>
+      <w:pPr>
+        <w:pStyle w:val="BodyText"/>
+      </w:pPr>
+      <w:r>
+        <w:t xml:space="preserve">Снятие требований для гвардов и для событий, поступающих через</w:t>
+      </w:r>
+      <w:r>
+        <w:t xml:space="preserve"> </w:t>
+      </w:r>
+      <w:r>
+        <w:t xml:space="preserve">вложенность, а также описание всех допустимых порядков умножения остаются</w:t>
+      </w:r>
+      <w:r>
+        <w:t xml:space="preserve"> </w:t>
+      </w:r>
+      <w:r>
+        <w:t xml:space="preserve">предметом дальнейшей работы.</w:t>
+      </w:r>
+    </w:p>
+    <w:bookmarkEnd w:id="47"/>
+    <w:bookmarkStart w:id="48" w:name="X67dd4598854beb9333d290fef858c89026be88c"/>
     <w:p>
       <w:pPr>
         <w:pStyle w:val="Heading2"/>
@@ -8039,9 +7879,9 @@
         <w:t xml:space="preserve">работы.</w:t>
       </w:r>
     </w:p>
-    <w:bookmarkEnd w:id="47"/>
     <w:bookmarkEnd w:id="48"/>
-    <w:bookmarkStart w:id="52" w:name="итоговый-перемноженный-автомат"/>
+    <w:bookmarkEnd w:id="49"/>
+    <w:bookmarkStart w:id="53" w:name="итоговый-перемноженный-автомат"/>
     <w:p>
       <w:pPr>
         <w:pStyle w:val="Heading1"/>
@@ -8059,18 +7899,18 @@
           <wp:inline>
             <wp:extent cx="5334000" cy="4433225"/>
             <wp:effectExtent b="0" l="0" r="0" t="0"/>
-            <wp:docPr descr="" title="" id="50" name="Picture"/>
+            <wp:docPr descr="" title="" id="51" name="Picture"/>
             <a:graphic>
               <a:graphicData uri="http://schemas.openxmlformats.org/drawingml/2006/picture">
                 <pic:pic>
                   <pic:nvPicPr>
-                    <pic:cNvPr descr="puml/final.png" id="51" name="Picture"/>
+                    <pic:cNvPr descr="puml/final.png" id="52" name="Picture"/>
                     <pic:cNvPicPr>
                       <a:picLocks noChangeArrowheads="1" noChangeAspect="1"/>
                     </pic:cNvPicPr>
                   </pic:nvPicPr>
                   <pic:blipFill>
-                    <a:blip r:embed="rId49"/>
+                    <a:blip r:embed="rId50"/>
                     <a:stretch>
                       <a:fillRect/>
                     </a:stretch>
@@ -10025,8 +9865,8 @@
         </w:tc>
       </w:tr>
     </w:tbl>
-    <w:bookmarkEnd w:id="52"/>
-    <w:bookmarkStart w:id="53" w:name="вывод"/>
+    <w:bookmarkEnd w:id="53"/>
+    <w:bookmarkStart w:id="54" w:name="вывод"/>
     <w:p>
       <w:pPr>
         <w:pStyle w:val="Heading1"/>
@@ -10082,7 +9922,13 @@
         <w:t xml:space="preserve"> </w:t>
       </w:r>
       <w:r>
-        <w:t xml:space="preserve">(доработка 3).</w:t>
+        <w:t xml:space="preserve">(доработка 3), и адресованное событие теперь поступает также автоматам,</w:t>
+      </w:r>
+      <w:r>
+        <w:t xml:space="preserve"> </w:t>
+      </w:r>
+      <w:r>
+        <w:t xml:space="preserve">вложенным в состояние получателя (доработка 4).</w:t>
       </w:r>
     </w:p>
     <w:p>
@@ -10090,25 +9936,31 @@
         <w:pStyle w:val="BodyText"/>
       </w:pPr>
       <w:r>
-        <w:t xml:space="preserve">Порядок умножения остаётся существенным для гвардов: автомат, на состояние</w:t>
-      </w:r>
-      <w:r>
-        <w:t xml:space="preserve"> </w:t>
-      </w:r>
-      <w:r>
-        <w:t xml:space="preserve">которого ссылается гвард, должен быть включён в произведение не позднее</w:t>
-      </w:r>
-      <w:r>
-        <w:t xml:space="preserve"> </w:t>
-      </w:r>
-      <w:r>
-        <w:t xml:space="preserve">автомата, содержащего этот гвард. Для адресованных событий это требование</w:t>
-      </w:r>
-      <w:r>
-        <w:t xml:space="preserve"> </w:t>
-      </w:r>
-      <w:r>
-        <w:t xml:space="preserve">снято.</w:t>
+        <w:t xml:space="preserve">Порядок умножения остаётся существенным в двух случаях: автомат, на</w:t>
+      </w:r>
+      <w:r>
+        <w:t xml:space="preserve"> </w:t>
+      </w:r>
+      <w:r>
+        <w:t xml:space="preserve">состояние которого ссылается гвард, должен быть включён в произведение не</w:t>
+      </w:r>
+      <w:r>
+        <w:t xml:space="preserve"> </w:t>
+      </w:r>
+      <w:r>
+        <w:t xml:space="preserve">позднее автомата, содержащего этот гвард, а автомат, получающий</w:t>
+      </w:r>
+      <w:r>
+        <w:t xml:space="preserve"> </w:t>
+      </w:r>
+      <w:r>
+        <w:t xml:space="preserve">адресованные события через вложенность, – после родительского. Для</w:t>
+      </w:r>
+      <w:r>
+        <w:t xml:space="preserve"> </w:t>
+      </w:r>
+      <w:r>
+        <w:t xml:space="preserve">адресованных событий, поступающих напрямую, требование на порядок снято.</w:t>
       </w:r>
     </w:p>
     <w:p>
@@ -10154,7 +10006,7 @@
         <w:t xml:space="preserve">его вложение в три состояния не увеличивает число состояний произведения.</w:t>
       </w:r>
     </w:p>
-    <w:bookmarkEnd w:id="53"/>
+    <w:bookmarkEnd w:id="54"/>
     <w:sectPr/>
   </w:body>
 </w:document>

</xml_diff>

<commit_message>
Model: winnings with an empty bank after the drums stop lead to "Ошибка"
With x01 & !x02 on e05 in "Игра", A0 had no transition and stayed in
"Игра" with the drums stopped - a state with no way out. It now goes to
"Ошибка" with z28, z15, A3(e33), the same as leaving "Выдача жетона" on
e06 & x01 & !x02. The final product is back to 9 states and passes full
validation.

Co-Authored-By: Claude Opus 5.5 <noreply@anthropic.com>
Claude-Session: https://claude.ai/code/session_01Dbk9FbN51LJL1bcmGw4FBj
</commit_message>
<xml_diff>
--- a/articles/multiply_many_nested/article.docx
+++ b/articles/multiply_many_nested/article.docx
@@ -1240,7 +1240,7 @@
       <w:r>
         <w:drawing>
           <wp:inline>
-            <wp:extent cx="5334000" cy="4771647"/>
+            <wp:extent cx="5334000" cy="4425206"/>
             <wp:effectExtent b="0" l="0" r="0" t="0"/>
             <wp:docPr descr="" title="" id="23" name="Picture"/>
             <a:graphic>
@@ -1261,7 +1261,7 @@
                   <pic:spPr bwMode="auto">
                     <a:xfrm>
                       <a:off x="0" y="0"/>
-                      <a:ext cx="5334000" cy="4771647"/>
+                      <a:ext cx="5334000" cy="4425206"/>
                     </a:xfrm>
                     <a:prstGeom prst="rect">
                       <a:avLst/>
@@ -7897,7 +7897,7 @@
       <w:r>
         <w:drawing>
           <wp:inline>
-            <wp:extent cx="5334000" cy="3178116"/>
+            <wp:extent cx="5334000" cy="3675590"/>
             <wp:effectExtent b="0" l="0" r="0" t="0"/>
             <wp:docPr descr="" title="" id="51" name="Picture"/>
             <a:graphic>
@@ -7918,7 +7918,7 @@
                   <pic:spPr bwMode="auto">
                     <a:xfrm>
                       <a:off x="0" y="0"/>
-                      <a:ext cx="5334000" cy="3178116"/>
+                      <a:ext cx="5334000" cy="3675590"/>
                     </a:xfrm>
                     <a:prstGeom prst="rect">
                       <a:avLst/>
@@ -8037,7 +8037,7 @@
         <w:t xml:space="preserve"> </w:t>
       </w:r>
       <w:r>
-        <w:t xml:space="preserve">(11 состояний). Состояния</w:t>
+        <w:t xml:space="preserve">(9 состояний). Состояния</w:t>
       </w:r>
       <w:r>
         <w:t xml:space="preserve"> </w:t>
@@ -8209,7 +8209,7 @@
         <w:t xml:space="preserve"> </w:t>
       </w:r>
       <w:r>
-        <w:t xml:space="preserve">– A0: Игра, A1: Монетоприемник закрыт, A2: Барабаны остановлены, A3: Выплата джекпота, A4: Ожидание</w:t>
+        <w:t xml:space="preserve">– A0: Ошибка, A1: Монетоприемник закрыт, A2: Барабаны остановлены, A3: Накопление, A4: Ожидание</w:t>
       </w:r>
     </w:p>
     <w:p>
@@ -8230,46 +8230,6 @@
       </w:r>
       <w:r>
         <w:t xml:space="preserve">– A0: Выдача жетона, A1: Монетоприемник закрыт, A2: Барабаны остановлены, A3: Накопление, A4: Ожидание</w:t>
-      </w:r>
-    </w:p>
-    <w:p>
-      <w:pPr>
-        <w:numPr>
-          <w:ilvl w:val="0"/>
-          <w:numId w:val="1003"/>
-        </w:numPr>
-      </w:pPr>
-      <w:r>
-        <w:rPr>
-          <w:rStyle w:val="VerbatimChar"/>
-        </w:rPr>
-        <w:t xml:space="preserve">S10</w:t>
-      </w:r>
-      <w:r>
-        <w:t xml:space="preserve"> </w:t>
-      </w:r>
-      <w:r>
-        <w:t xml:space="preserve">– A0: Игра, A1: Монетоприемник закрыт, A2: Барабаны остановлены, A3: Накопление, A4: Ожидание</w:t>
-      </w:r>
-    </w:p>
-    <w:p>
-      <w:pPr>
-        <w:numPr>
-          <w:ilvl w:val="0"/>
-          <w:numId w:val="1003"/>
-        </w:numPr>
-      </w:pPr>
-      <w:r>
-        <w:rPr>
-          <w:rStyle w:val="VerbatimChar"/>
-        </w:rPr>
-        <w:t xml:space="preserve">S11</w:t>
-      </w:r>
-      <w:r>
-        <w:t xml:space="preserve"> </w:t>
-      </w:r>
-      <w:r>
-        <w:t xml:space="preserve">– A0: Ошибка, A1: Монетоприемник закрыт, A2: Барабаны остановлены, A3: Накопление, A4: Ожидание</w:t>
       </w:r>
     </w:p>
     <w:p>
@@ -10008,7 +9968,7 @@
         <w:pStyle w:val="BodyText"/>
       </w:pPr>
       <w:r>
-        <w:t xml:space="preserve">Итоговое произведение пяти автоматов содержит 11 состояний – столько же,</w:t>
+        <w:t xml:space="preserve">Итоговое произведение пяти автоматов содержит 9 состояний – столько же,</w:t>
       </w:r>
       <w:r>
         <w:t xml:space="preserve"> </w:t>

</xml_diff>